<commit_message>
[FIX] Validacion RED v1.1
</commit_message>
<xml_diff>
--- a/fuentes/631101_CF5_DU.docx
+++ b/fuentes/631101_CF5_DU.docx
@@ -251,15 +251,15 @@
         <mc:AlternateContent>
           <mc:Choice Requires="wps">
             <w:drawing>
-              <wp:anchor distT="45720" distB="45720" distL="114300" distR="114300" simplePos="0" relativeHeight="251663360" behindDoc="0" locked="0" layoutInCell="1" allowOverlap="1" wp14:anchorId="2E2DABF6" wp14:editId="1D528264">
+              <wp:anchor distT="45720" distB="45720" distL="114300" distR="114300" simplePos="0" relativeHeight="251663360" behindDoc="0" locked="0" layoutInCell="1" allowOverlap="1" wp14:anchorId="2E2DABF6" wp14:editId="3B3E4EC9">
                 <wp:simplePos x="0" y="0"/>
                 <wp:positionH relativeFrom="margin">
-                  <wp:align>left</wp:align>
+                  <wp:posOffset>41910</wp:posOffset>
                 </wp:positionH>
                 <wp:positionV relativeFrom="paragraph">
-                  <wp:posOffset>40005</wp:posOffset>
+                  <wp:posOffset>5080</wp:posOffset>
                 </wp:positionV>
-                <wp:extent cx="6638925" cy="1307465"/>
+                <wp:extent cx="6610350" cy="1307465"/>
                 <wp:effectExtent l="0" t="0" r="0" b="6985"/>
                 <wp:wrapNone/>
                 <wp:docPr id="217" name="Cuadro de texto 2">
@@ -281,7 +281,7 @@
                       <wps:spPr bwMode="auto">
                         <a:xfrm>
                           <a:off x="0" y="0"/>
-                          <a:ext cx="6638925" cy="1307465"/>
+                          <a:ext cx="6610350" cy="1307465"/>
                         </a:xfrm>
                         <a:prstGeom prst="rect">
                           <a:avLst/>
@@ -344,7 +344,7 @@
                 <v:stroke joinstyle="miter"/>
                 <v:path gradientshapeok="t" o:connecttype="rect"/>
               </v:shapetype>
-              <v:shape id="Cuadro de texto 2" o:spid="_x0000_s1026" type="#_x0000_t202" alt="&quot;&quot;" style="position:absolute;left:0;text-align:left;margin-left:0;margin-top:3.15pt;width:522.75pt;height:102.95pt;z-index:251663360;visibility:visible;mso-wrap-style:square;mso-width-percent:0;mso-height-percent:0;mso-wrap-distance-left:9pt;mso-wrap-distance-top:3.6pt;mso-wrap-distance-right:9pt;mso-wrap-distance-bottom:3.6pt;mso-position-horizontal:left;mso-position-horizontal-relative:margin;mso-position-vertical:absolute;mso-position-vertical-relative:text;mso-width-percent:0;mso-height-percent:0;mso-width-relative:margin;mso-height-relative:margin;v-text-anchor:top" o:gfxdata="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" filled="f" stroked="f">
+              <v:shape id="Cuadro de texto 2" o:spid="_x0000_s1026" type="#_x0000_t202" alt="&quot;&quot;" style="position:absolute;left:0;text-align:left;margin-left:3.3pt;margin-top:.4pt;width:520.5pt;height:102.95pt;z-index:251663360;visibility:visible;mso-wrap-style:square;mso-width-percent:0;mso-height-percent:0;mso-wrap-distance-left:9pt;mso-wrap-distance-top:3.6pt;mso-wrap-distance-right:9pt;mso-wrap-distance-bottom:3.6pt;mso-position-horizontal:absolute;mso-position-horizontal-relative:margin;mso-position-vertical:absolute;mso-position-vertical-relative:text;mso-width-percent:0;mso-height-percent:0;mso-width-relative:margin;mso-height-relative:margin;v-text-anchor:top" o:gfxdata="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" filled="f" stroked="f">
                 <v:textbox>
                   <w:txbxContent>
                     <w:p>
@@ -518,6 +518,7 @@
     <w:p>
       <w:pPr>
         <w:spacing w:before="0" w:after="0"/>
+        <w:ind w:firstLine="0"/>
         <w:jc w:val="center"/>
         <w:rPr>
           <w:rFonts w:cstheme="minorHAnsi"/>
@@ -604,7 +605,7 @@
             </w:rPr>
             <w:fldChar w:fldCharType="separate"/>
           </w:r>
-          <w:hyperlink w:anchor="_Toc237935948" w:history="1">
+          <w:hyperlink w:anchor="_Toc238023224" w:history="1">
             <w:r>
               <w:rPr>
                 <w:rStyle w:val="Hipervnculo"/>
@@ -631,7 +632,7 @@
                 <w:noProof/>
                 <w:webHidden/>
               </w:rPr>
-              <w:instrText xml:space="preserve"> PAGEREF _Toc237935948 \h </w:instrText>
+              <w:instrText xml:space="preserve"> PAGEREF _Toc238023224 \h </w:instrText>
             </w:r>
             <w:r>
               <w:rPr>
@@ -678,7 +679,7 @@
               <w:lang w:eastAsia="es-CO"/>
             </w:rPr>
           </w:pPr>
-          <w:hyperlink w:anchor="_Toc237935949" w:history="1">
+          <w:hyperlink w:anchor="_Toc238023225" w:history="1">
             <w:r>
               <w:rPr>
                 <w:rStyle w:val="Hipervnculo"/>
@@ -722,7 +723,7 @@
                 <w:noProof/>
                 <w:webHidden/>
               </w:rPr>
-              <w:instrText xml:space="preserve"> PAGEREF _Toc237935949 \h </w:instrText>
+              <w:instrText xml:space="preserve"> PAGEREF _Toc238023225 \h </w:instrText>
             </w:r>
             <w:r>
               <w:rPr>
@@ -768,7 +769,7 @@
               <w:lang w:eastAsia="es-CO"/>
             </w:rPr>
           </w:pPr>
-          <w:hyperlink w:anchor="_Toc237935950" w:history="1">
+          <w:hyperlink w:anchor="_Toc238023226" w:history="1">
             <w:r>
               <w:rPr>
                 <w:rStyle w:val="Hipervnculo"/>
@@ -795,7 +796,7 @@
                 <w:noProof/>
                 <w:webHidden/>
               </w:rPr>
-              <w:instrText xml:space="preserve"> PAGEREF _Toc237935950 \h </w:instrText>
+              <w:instrText xml:space="preserve"> PAGEREF _Toc238023226 \h </w:instrText>
             </w:r>
             <w:r>
               <w:rPr>
@@ -841,7 +842,7 @@
               <w:lang w:eastAsia="es-CO"/>
             </w:rPr>
           </w:pPr>
-          <w:hyperlink w:anchor="_Toc237935951" w:history="1">
+          <w:hyperlink w:anchor="_Toc238023227" w:history="1">
             <w:r>
               <w:rPr>
                 <w:rStyle w:val="Hipervnculo"/>
@@ -868,7 +869,7 @@
                 <w:noProof/>
                 <w:webHidden/>
               </w:rPr>
-              <w:instrText xml:space="preserve"> PAGEREF _Toc237935951 \h </w:instrText>
+              <w:instrText xml:space="preserve"> PAGEREF _Toc238023227 \h </w:instrText>
             </w:r>
             <w:r>
               <w:rPr>
@@ -914,7 +915,7 @@
               <w:lang w:eastAsia="es-CO"/>
             </w:rPr>
           </w:pPr>
-          <w:hyperlink w:anchor="_Toc237935952" w:history="1">
+          <w:hyperlink w:anchor="_Toc238023228" w:history="1">
             <w:r>
               <w:rPr>
                 <w:rStyle w:val="Hipervnculo"/>
@@ -941,7 +942,7 @@
                 <w:noProof/>
                 <w:webHidden/>
               </w:rPr>
-              <w:instrText xml:space="preserve"> PAGEREF _Toc237935952 \h </w:instrText>
+              <w:instrText xml:space="preserve"> PAGEREF _Toc238023228 \h </w:instrText>
             </w:r>
             <w:r>
               <w:rPr>
@@ -988,7 +989,7 @@
               <w:lang w:eastAsia="es-CO"/>
             </w:rPr>
           </w:pPr>
-          <w:hyperlink w:anchor="_Toc237935953" w:history="1">
+          <w:hyperlink w:anchor="_Toc238023229" w:history="1">
             <w:r>
               <w:rPr>
                 <w:rStyle w:val="Hipervnculo"/>
@@ -1032,7 +1033,7 @@
                 <w:noProof/>
                 <w:webHidden/>
               </w:rPr>
-              <w:instrText xml:space="preserve"> PAGEREF _Toc237935953 \h </w:instrText>
+              <w:instrText xml:space="preserve"> PAGEREF _Toc238023229 \h </w:instrText>
             </w:r>
             <w:r>
               <w:rPr>
@@ -1078,7 +1079,7 @@
               <w:lang w:eastAsia="es-CO"/>
             </w:rPr>
           </w:pPr>
-          <w:hyperlink w:anchor="_Toc237935954" w:history="1">
+          <w:hyperlink w:anchor="_Toc238023230" w:history="1">
             <w:r>
               <w:rPr>
                 <w:rStyle w:val="Hipervnculo"/>
@@ -1105,7 +1106,7 @@
                 <w:noProof/>
                 <w:webHidden/>
               </w:rPr>
-              <w:instrText xml:space="preserve"> PAGEREF _Toc237935954 \h </w:instrText>
+              <w:instrText xml:space="preserve"> PAGEREF _Toc238023230 \h </w:instrText>
             </w:r>
             <w:r>
               <w:rPr>
@@ -1152,7 +1153,7 @@
               <w:lang w:eastAsia="es-CO"/>
             </w:rPr>
           </w:pPr>
-          <w:hyperlink w:anchor="_Toc237935955" w:history="1">
+          <w:hyperlink w:anchor="_Toc238023231" w:history="1">
             <w:r>
               <w:rPr>
                 <w:rStyle w:val="Hipervnculo"/>
@@ -1196,7 +1197,7 @@
                 <w:noProof/>
                 <w:webHidden/>
               </w:rPr>
-              <w:instrText xml:space="preserve"> PAGEREF _Toc237935955 \h </w:instrText>
+              <w:instrText xml:space="preserve"> PAGEREF _Toc238023231 \h </w:instrText>
             </w:r>
             <w:r>
               <w:rPr>
@@ -1242,7 +1243,7 @@
               <w:lang w:eastAsia="es-CO"/>
             </w:rPr>
           </w:pPr>
-          <w:hyperlink w:anchor="_Toc237935956" w:history="1">
+          <w:hyperlink w:anchor="_Toc238023232" w:history="1">
             <w:r>
               <w:rPr>
                 <w:rStyle w:val="Hipervnculo"/>
@@ -1269,7 +1270,7 @@
                 <w:noProof/>
                 <w:webHidden/>
               </w:rPr>
-              <w:instrText xml:space="preserve"> PAGEREF _Toc237935956 \h </w:instrText>
+              <w:instrText xml:space="preserve"> PAGEREF _Toc238023232 \h </w:instrText>
             </w:r>
             <w:r>
               <w:rPr>
@@ -1316,7 +1317,7 @@
               <w:lang w:eastAsia="es-CO"/>
             </w:rPr>
           </w:pPr>
-          <w:hyperlink w:anchor="_Toc237935957" w:history="1">
+          <w:hyperlink w:anchor="_Toc238023233" w:history="1">
             <w:r>
               <w:rPr>
                 <w:rStyle w:val="Hipervnculo"/>
@@ -1364,7 +1365,7 @@
                 <w:noProof/>
                 <w:webHidden/>
               </w:rPr>
-              <w:instrText xml:space="preserve"> PAGEREF _Toc237935957 \h </w:instrText>
+              <w:instrText xml:space="preserve"> PAGEREF _Toc238023233 \h </w:instrText>
             </w:r>
             <w:r>
               <w:rPr>
@@ -1411,7 +1412,7 @@
               <w:lang w:eastAsia="es-CO"/>
             </w:rPr>
           </w:pPr>
-          <w:hyperlink w:anchor="_Toc237935958" w:history="1">
+          <w:hyperlink w:anchor="_Toc238023234" w:history="1">
             <w:r>
               <w:rPr>
                 <w:rStyle w:val="Hipervnculo"/>
@@ -1455,7 +1456,7 @@
                 <w:noProof/>
                 <w:webHidden/>
               </w:rPr>
-              <w:instrText xml:space="preserve"> PAGEREF _Toc237935958 \h </w:instrText>
+              <w:instrText xml:space="preserve"> PAGEREF _Toc238023234 \h </w:instrText>
             </w:r>
             <w:r>
               <w:rPr>
@@ -1502,7 +1503,7 @@
               <w:lang w:eastAsia="es-CO"/>
             </w:rPr>
           </w:pPr>
-          <w:hyperlink w:anchor="_Toc237935959" w:history="1">
+          <w:hyperlink w:anchor="_Toc238023235" w:history="1">
             <w:r>
               <w:rPr>
                 <w:rStyle w:val="Hipervnculo"/>
@@ -1546,7 +1547,7 @@
                 <w:noProof/>
                 <w:webHidden/>
               </w:rPr>
-              <w:instrText xml:space="preserve"> PAGEREF _Toc237935959 \h </w:instrText>
+              <w:instrText xml:space="preserve"> PAGEREF _Toc238023235 \h </w:instrText>
             </w:r>
             <w:r>
               <w:rPr>
@@ -1592,7 +1593,7 @@
               <w:lang w:eastAsia="es-CO"/>
             </w:rPr>
           </w:pPr>
-          <w:hyperlink w:anchor="_Toc237935960" w:history="1">
+          <w:hyperlink w:anchor="_Toc238023236" w:history="1">
             <w:r>
               <w:rPr>
                 <w:rStyle w:val="Hipervnculo"/>
@@ -1619,7 +1620,7 @@
                 <w:noProof/>
                 <w:webHidden/>
               </w:rPr>
-              <w:instrText xml:space="preserve"> PAGEREF _Toc237935960 \h </w:instrText>
+              <w:instrText xml:space="preserve"> PAGEREF _Toc238023236 \h </w:instrText>
             </w:r>
             <w:r>
               <w:rPr>
@@ -1665,7 +1666,7 @@
               <w:lang w:eastAsia="es-CO"/>
             </w:rPr>
           </w:pPr>
-          <w:hyperlink w:anchor="_Toc237935961" w:history="1">
+          <w:hyperlink w:anchor="_Toc238023237" w:history="1">
             <w:r>
               <w:rPr>
                 <w:rStyle w:val="Hipervnculo"/>
@@ -1692,7 +1693,7 @@
                 <w:noProof/>
                 <w:webHidden/>
               </w:rPr>
-              <w:instrText xml:space="preserve"> PAGEREF _Toc237935961 \h </w:instrText>
+              <w:instrText xml:space="preserve"> PAGEREF _Toc238023237 \h </w:instrText>
             </w:r>
             <w:r>
               <w:rPr>
@@ -1738,7 +1739,7 @@
               <w:lang w:eastAsia="es-CO"/>
             </w:rPr>
           </w:pPr>
-          <w:hyperlink w:anchor="_Toc237935962" w:history="1">
+          <w:hyperlink w:anchor="_Toc238023238" w:history="1">
             <w:r>
               <w:rPr>
                 <w:rStyle w:val="Hipervnculo"/>
@@ -1765,7 +1766,7 @@
                 <w:noProof/>
                 <w:webHidden/>
               </w:rPr>
-              <w:instrText xml:space="preserve"> PAGEREF _Toc237935962 \h </w:instrText>
+              <w:instrText xml:space="preserve"> PAGEREF _Toc238023238 \h </w:instrText>
             </w:r>
             <w:r>
               <w:rPr>
@@ -1811,7 +1812,7 @@
               <w:lang w:eastAsia="es-CO"/>
             </w:rPr>
           </w:pPr>
-          <w:hyperlink w:anchor="_Toc237935963" w:history="1">
+          <w:hyperlink w:anchor="_Toc238023239" w:history="1">
             <w:r>
               <w:rPr>
                 <w:rStyle w:val="Hipervnculo"/>
@@ -1838,7 +1839,7 @@
                 <w:noProof/>
                 <w:webHidden/>
               </w:rPr>
-              <w:instrText xml:space="preserve"> PAGEREF _Toc237935963 \h </w:instrText>
+              <w:instrText xml:space="preserve"> PAGEREF _Toc238023239 \h </w:instrText>
             </w:r>
             <w:r>
               <w:rPr>
@@ -1884,7 +1885,7 @@
               <w:lang w:eastAsia="es-CO"/>
             </w:rPr>
           </w:pPr>
-          <w:hyperlink w:anchor="_Toc237935964" w:history="1">
+          <w:hyperlink w:anchor="_Toc238023240" w:history="1">
             <w:r>
               <w:rPr>
                 <w:rStyle w:val="Hipervnculo"/>
@@ -1911,7 +1912,7 @@
                 <w:noProof/>
                 <w:webHidden/>
               </w:rPr>
-              <w:instrText xml:space="preserve"> PAGEREF _Toc237935964 \h </w:instrText>
+              <w:instrText xml:space="preserve"> PAGEREF _Toc238023240 \h </w:instrText>
             </w:r>
             <w:r>
               <w:rPr>
@@ -1966,7 +1967,7 @@
       <w:pPr>
         <w:pStyle w:val="Titulosgenerales"/>
       </w:pPr>
-      <w:bookmarkStart w:id="0" w:name="_Toc237935948"/>
+      <w:bookmarkStart w:id="0" w:name="_Toc238023224"/>
       <w:r>
         <w:lastRenderedPageBreak/>
         <w:t>Introducción</w:t>
@@ -2106,7 +2107,7 @@
           <w:noProof/>
         </w:rPr>
         <w:drawing>
-          <wp:inline distT="0" distB="0" distL="0" distR="0" wp14:anchorId="2556C62E" wp14:editId="16209193">
+          <wp:inline distT="0" distB="0" distL="0" distR="0" wp14:anchorId="2556C62E" wp14:editId="33FB7AD8">
             <wp:extent cx="4680000" cy="2632387"/>
             <wp:effectExtent l="0" t="0" r="6350" b="0"/>
             <wp:docPr id="471733013" name="Imagen 22">
@@ -2167,6 +2168,21 @@
         </w:drawing>
       </w:r>
     </w:p>
+    <w:p>
+      <w:pPr>
+        <w:ind w:firstLine="0"/>
+        <w:jc w:val="center"/>
+      </w:pPr>
+      <w:hyperlink r:id="rId13" w:history="1">
+        <w:r>
+          <w:rPr>
+            <w:rStyle w:val="Hipervnculo"/>
+            <w:b/>
+          </w:rPr>
+          <w:t>Enlace de reproducción del video</w:t>
+        </w:r>
+      </w:hyperlink>
+    </w:p>
     <w:tbl>
       <w:tblPr>
         <w:tblStyle w:val="Tablaconcuadrcula"/>
@@ -2297,7 +2313,7 @@
       <w:pPr>
         <w:pStyle w:val="Ttulo1"/>
       </w:pPr>
-      <w:bookmarkStart w:id="1" w:name="_Toc237935949"/>
+      <w:bookmarkStart w:id="1" w:name="_Toc238023225"/>
       <w:r>
         <w:lastRenderedPageBreak/>
         <w:t>Proceso de ventas: conceptualización, etapas y herramientas</w:t>
@@ -2755,9 +2771,15 @@
       </w:pPr>
       <w:r>
         <w:rPr>
-          <w:rFonts w:cstheme="minorHAnsi"/>
-        </w:rPr>
-        <w:t>Scripts de ventas y guiones telefónicos.</w:t>
+          <w:rStyle w:val="Extranjerismo"/>
+        </w:rPr>
+        <w:t xml:space="preserve">Scripts </w:t>
+      </w:r>
+      <w:r>
+        <w:rPr>
+          <w:rFonts w:cstheme="minorHAnsi"/>
+        </w:rPr>
+        <w:t>de ventas y guiones telefónicos.</w:t>
       </w:r>
     </w:p>
     <w:p>
@@ -3123,7 +3145,7 @@
       <w:pPr>
         <w:pStyle w:val="Ttulo2"/>
       </w:pPr>
-      <w:bookmarkStart w:id="2" w:name="_Toc237935950"/>
+      <w:bookmarkStart w:id="2" w:name="_Toc238023226"/>
       <w:r>
         <w:t xml:space="preserve">1.1. </w:t>
       </w:r>
@@ -3725,10 +3747,10 @@
                     <pic:cNvPicPr/>
                   </pic:nvPicPr>
                   <pic:blipFill>
-                    <a:blip r:embed="rId13">
+                    <a:blip r:embed="rId14">
                       <a:extLst>
                         <a:ext uri="{96DAC541-7B7A-43D3-8B79-37D633B846F1}">
-                          <asvg:svgBlip xmlns:asvg="http://schemas.microsoft.com/office/drawing/2016/SVG/main" r:embed="rId14"/>
+                          <asvg:svgBlip xmlns:asvg="http://schemas.microsoft.com/office/drawing/2016/SVG/main" r:embed="rId15"/>
                         </a:ext>
                       </a:extLst>
                     </a:blip>
@@ -4212,7 +4234,7 @@
       <w:pPr>
         <w:pStyle w:val="Ttulo2"/>
       </w:pPr>
-      <w:bookmarkStart w:id="3" w:name="_Toc237935951"/>
+      <w:bookmarkStart w:id="3" w:name="_Toc238023227"/>
       <w:r>
         <w:lastRenderedPageBreak/>
         <w:t xml:space="preserve">1.2. </w:t>
@@ -4716,7 +4738,7 @@
       <w:pPr>
         <w:pStyle w:val="Ttulo2"/>
       </w:pPr>
-      <w:bookmarkStart w:id="4" w:name="_Toc237935952"/>
+      <w:bookmarkStart w:id="4" w:name="_Toc238023228"/>
       <w:r>
         <w:t xml:space="preserve">1.3. </w:t>
       </w:r>
@@ -4814,10 +4836,10 @@
                     <pic:cNvPicPr/>
                   </pic:nvPicPr>
                   <pic:blipFill>
-                    <a:blip r:embed="rId15">
+                    <a:blip r:embed="rId16">
                       <a:extLst>
                         <a:ext uri="{96DAC541-7B7A-43D3-8B79-37D633B846F1}">
-                          <asvg:svgBlip xmlns:asvg="http://schemas.microsoft.com/office/drawing/2016/SVG/main" r:embed="rId16"/>
+                          <asvg:svgBlip xmlns:asvg="http://schemas.microsoft.com/office/drawing/2016/SVG/main" r:embed="rId17"/>
                         </a:ext>
                       </a:extLst>
                     </a:blip>
@@ -4964,7 +4986,7 @@
       <w:pPr>
         <w:pStyle w:val="Ttulo1"/>
       </w:pPr>
-      <w:bookmarkStart w:id="5" w:name="_Toc237935953"/>
+      <w:bookmarkStart w:id="5" w:name="_Toc238023229"/>
       <w:r>
         <w:lastRenderedPageBreak/>
         <w:t>Transacciones comerciales</w:t>
@@ -6433,7 +6455,7 @@
         <w:pStyle w:val="Ttulo2"/>
         <w:ind w:left="0" w:firstLine="0"/>
       </w:pPr>
-      <w:bookmarkStart w:id="6" w:name="_Toc237935954"/>
+      <w:bookmarkStart w:id="6" w:name="_Toc238023230"/>
       <w:r>
         <w:lastRenderedPageBreak/>
         <w:t xml:space="preserve">2.1. </w:t>
@@ -6758,7 +6780,7 @@
       <w:pPr>
         <w:pStyle w:val="Ttulo1"/>
       </w:pPr>
-      <w:bookmarkStart w:id="7" w:name="_Toc237935955"/>
+      <w:bookmarkStart w:id="7" w:name="_Toc238023231"/>
       <w:r>
         <w:lastRenderedPageBreak/>
         <w:t>Concepto de comunicación</w:t>
@@ -6866,7 +6888,19 @@
         <w:rPr>
           <w:rFonts w:cstheme="minorHAnsi"/>
         </w:rPr>
-        <w:t>: Quien origina el mensaje (por ejemplo, el asesor comercial).</w:t>
+        <w:t xml:space="preserve">: </w:t>
+      </w:r>
+      <w:r>
+        <w:rPr>
+          <w:rFonts w:cstheme="minorHAnsi"/>
+        </w:rPr>
+        <w:t>q</w:t>
+      </w:r>
+      <w:r>
+        <w:rPr>
+          <w:rFonts w:cstheme="minorHAnsi"/>
+        </w:rPr>
+        <w:t>uien origina el mensaje (por ejemplo, el asesor comercial).</w:t>
       </w:r>
     </w:p>
     <w:p>
@@ -6893,7 +6927,19 @@
         <w:rPr>
           <w:rFonts w:cstheme="minorHAnsi"/>
         </w:rPr>
-        <w:t>: Quien recibe e interpreta el mensaje (el cliente, el compañero de trabajo, el jefe).</w:t>
+        <w:t xml:space="preserve">: </w:t>
+      </w:r>
+      <w:r>
+        <w:rPr>
+          <w:rFonts w:cstheme="minorHAnsi"/>
+        </w:rPr>
+        <w:t>q</w:t>
+      </w:r>
+      <w:r>
+        <w:rPr>
+          <w:rFonts w:cstheme="minorHAnsi"/>
+        </w:rPr>
+        <w:t>uien recibe e interpreta el mensaje (el cliente, el compañero de trabajo, el jefe).</w:t>
       </w:r>
     </w:p>
     <w:p>
@@ -6920,7 +6966,19 @@
         <w:rPr>
           <w:rFonts w:cstheme="minorHAnsi"/>
         </w:rPr>
-        <w:t>: La información que se quiere transmitir (una propuesta de ventas, una explicación de producto, una recomendación).</w:t>
+        <w:t xml:space="preserve">: </w:t>
+      </w:r>
+      <w:r>
+        <w:rPr>
+          <w:rFonts w:cstheme="minorHAnsi"/>
+        </w:rPr>
+        <w:t>l</w:t>
+      </w:r>
+      <w:r>
+        <w:rPr>
+          <w:rFonts w:cstheme="minorHAnsi"/>
+        </w:rPr>
+        <w:t>a información que se quiere transmitir (una propuesta de ventas, una explicación de producto, una recomendación).</w:t>
       </w:r>
     </w:p>
     <w:p>
@@ -7472,7 +7530,7 @@
       <w:pPr>
         <w:pStyle w:val="Ttulo2"/>
       </w:pPr>
-      <w:bookmarkStart w:id="8" w:name="_Toc237935956"/>
+      <w:bookmarkStart w:id="8" w:name="_Toc238023232"/>
       <w:r>
         <w:t>3.1. Medios de comunicación</w:t>
       </w:r>
@@ -7649,13 +7707,23 @@
         <w:rPr>
           <w:rFonts w:cstheme="minorHAnsi"/>
         </w:rPr>
-        <w:t>Material POP (</w:t>
-      </w:r>
-      <w:r>
-        <w:rPr>
-          <w:rFonts w:cstheme="minorHAnsi"/>
-          <w:i/>
-          <w:iCs/>
+        <w:t xml:space="preserve">Material </w:t>
+      </w:r>
+      <w:r>
+        <w:rPr>
+          <w:rStyle w:val="Extranjerismo"/>
+        </w:rPr>
+        <w:t>POP</w:t>
+      </w:r>
+      <w:r>
+        <w:rPr>
+          <w:rFonts w:cstheme="minorHAnsi"/>
+        </w:rPr>
+        <w:t xml:space="preserve"> (</w:t>
+      </w:r>
+      <w:r>
+        <w:rPr>
+          <w:rStyle w:val="Extranjerismo"/>
         </w:rPr>
         <w:t>Point of Purchase</w:t>
       </w:r>
@@ -7959,7 +8027,7 @@
           <w:rStyle w:val="Extranjerismo"/>
         </w:rPr>
       </w:pPr>
-      <w:bookmarkStart w:id="9" w:name="_Toc237935957"/>
+      <w:bookmarkStart w:id="9" w:name="_Toc238023233"/>
       <w:r>
         <w:rPr>
           <w:rStyle w:val="Extranjerismo"/>
@@ -8250,11 +8318,23 @@
         <w:rPr>
           <w:rFonts w:cstheme="minorHAnsi"/>
         </w:rPr>
-        <w:t xml:space="preserve">, entonces, se puede definir como una técnica del marketing aplicada y desarrollada a fabricantes y distribuidores dirigida a estimular el deseo y producir la compra. Ahora bien, desde la perspectiva de la comunicación visual, el </w:t>
+        <w:t xml:space="preserve">, entonces, se puede definir como una técnica del </w:t>
       </w:r>
       <w:r>
         <w:rPr>
           <w:rStyle w:val="Extranjerismo"/>
+        </w:rPr>
+        <w:t>marketing</w:t>
+      </w:r>
+      <w:r>
+        <w:rPr>
+          <w:rFonts w:cstheme="minorHAnsi"/>
+        </w:rPr>
+        <w:t xml:space="preserve"> aplicada y desarrollada a fabricantes y distribuidores dirigida a estimular el deseo y producir la compra. Ahora bien, desde la perspectiva de la comunicación visual, el </w:t>
+      </w:r>
+      <w:r>
+        <w:rPr>
+          <w:rStyle w:val="Extranjerismo"/>
           <w:rFonts w:cstheme="minorHAnsi"/>
         </w:rPr>
         <w:t>merchandising</w:t>
@@ -8282,7 +8362,6 @@
       <w:r>
         <w:rPr>
           <w:rStyle w:val="Extranjerismo"/>
-          <w:rFonts w:cstheme="minorHAnsi"/>
         </w:rPr>
         <w:t>marketing</w:t>
       </w:r>
@@ -9510,7 +9589,19 @@
         <w:rPr>
           <w:rFonts w:cstheme="minorHAnsi"/>
         </w:rPr>
-        <w:t xml:space="preserve">No hay clasificaciones absolutas en el mundo del marketing, teniendo en cuenta que algunos autores y expertos lo clasifican de diferentes maneras. De acuerdo con el ciclo de vida del producto, existen cuatro clases de </w:t>
+        <w:t xml:space="preserve">No hay clasificaciones absolutas en el mundo del </w:t>
+      </w:r>
+      <w:r>
+        <w:rPr>
+          <w:rStyle w:val="Extranjerismo"/>
+        </w:rPr>
+        <w:t>marketing</w:t>
+      </w:r>
+      <w:r>
+        <w:rPr>
+          <w:rFonts w:cstheme="minorHAnsi"/>
+        </w:rPr>
+        <w:t xml:space="preserve">, teniendo en cuenta que algunos autores y expertos lo clasifican de diferentes maneras. De acuerdo con el ciclo de vida del producto, existen cuatro clases de </w:t>
       </w:r>
       <w:r>
         <w:rPr>
@@ -9594,7 +9685,13 @@
         <w:t xml:space="preserve">Merchandising </w:t>
       </w:r>
       <w:r>
-        <w:t xml:space="preserve">visual vs. </w:t>
+        <w:rPr>
+          <w:rStyle w:val="Extranjerismo"/>
+        </w:rPr>
+        <w:t xml:space="preserve">visual </w:t>
+      </w:r>
+      <w:r>
+        <w:t xml:space="preserve">vs. </w:t>
       </w:r>
       <w:r>
         <w:rPr>
@@ -10384,23 +10481,23 @@
         </w:numPr>
         <w:spacing w:before="0" w:after="0"/>
         <w:rPr>
-          <w:rFonts w:cstheme="minorHAnsi"/>
-          <w:b/>
-          <w:bCs/>
-        </w:rPr>
-      </w:pPr>
-      <w:r>
-        <w:rPr>
           <w:rStyle w:val="Extranjerismo"/>
           <w:b/>
           <w:bCs/>
+        </w:rPr>
+      </w:pPr>
+      <w:r>
+        <w:rPr>
+          <w:rStyle w:val="Extranjerismo"/>
+          <w:b/>
+          <w:bCs/>
           <w:lang w:val="es-CO"/>
         </w:rPr>
         <w:t>Merchandising</w:t>
       </w:r>
       <w:r>
         <w:rPr>
-          <w:rFonts w:cstheme="minorHAnsi"/>
+          <w:rStyle w:val="Extranjerismo"/>
           <w:b/>
           <w:bCs/>
         </w:rPr>
@@ -10512,10 +10609,10 @@
                     <pic:cNvPicPr/>
                   </pic:nvPicPr>
                   <pic:blipFill>
-                    <a:blip r:embed="rId17">
+                    <a:blip r:embed="rId18">
                       <a:extLst>
                         <a:ext uri="{96DAC541-7B7A-43D3-8B79-37D633B846F1}">
-                          <asvg:svgBlip xmlns:asvg="http://schemas.microsoft.com/office/drawing/2016/SVG/main" r:embed="rId18"/>
+                          <asvg:svgBlip xmlns:asvg="http://schemas.microsoft.com/office/drawing/2016/SVG/main" r:embed="rId19"/>
                         </a:ext>
                       </a:extLst>
                     </a:blip>
@@ -11049,7 +11146,7 @@
       <w:pPr>
         <w:pStyle w:val="Ttulo1"/>
       </w:pPr>
-      <w:bookmarkStart w:id="10" w:name="_Toc237935958"/>
+      <w:bookmarkStart w:id="10" w:name="_Toc238023234"/>
       <w:r>
         <w:lastRenderedPageBreak/>
         <w:t>Exhibición</w:t>
@@ -12691,7 +12788,7 @@
       <w:pPr>
         <w:pStyle w:val="Ttulo1"/>
       </w:pPr>
-      <w:bookmarkStart w:id="11" w:name="_Toc237935959"/>
+      <w:bookmarkStart w:id="11" w:name="_Toc238023235"/>
       <w:r>
         <w:lastRenderedPageBreak/>
         <w:t>Presentaciones</w:t>
@@ -12939,7 +13036,7 @@
           <w:noProof/>
         </w:rPr>
         <w:drawing>
-          <wp:inline distT="0" distB="0" distL="0" distR="0" wp14:anchorId="6E949349" wp14:editId="46DC8D2B">
+          <wp:inline distT="0" distB="0" distL="0" distR="0" wp14:anchorId="6E949349" wp14:editId="160AB62C">
             <wp:extent cx="4680000" cy="2632383"/>
             <wp:effectExtent l="0" t="0" r="6350" b="0"/>
             <wp:docPr id="267469900" name="Imagen 13">
@@ -12968,7 +13065,7 @@
                     </pic:cNvPicPr>
                   </pic:nvPicPr>
                   <pic:blipFill>
-                    <a:blip r:embed="rId19" cstate="print">
+                    <a:blip r:embed="rId20" cstate="print">
                       <a:extLst>
                         <a:ext uri="{28A0092B-C50C-407E-A947-70E740481C1C}">
                           <a14:useLocalDpi xmlns:a14="http://schemas.microsoft.com/office/drawing/2010/main" val="0"/>
@@ -13009,7 +13106,7 @@
           <w:b/>
         </w:rPr>
       </w:pPr>
-      <w:hyperlink r:id="rId20" w:history="1">
+      <w:hyperlink r:id="rId21" w:history="1">
         <w:r>
           <w:rPr>
             <w:rStyle w:val="Hipervnculo"/>
@@ -13477,12 +13574,9 @@
       </w:r>
       <w:r>
         <w:rPr>
-          <w:rFonts w:cstheme="minorHAnsi"/>
-          <w:b/>
-          <w:bCs/>
-          <w:i/>
-          <w:iCs/>
-          <w:lang w:val="en-US"/>
+          <w:rStyle w:val="Extranjerismo"/>
+          <w:b/>
+          <w:bCs/>
         </w:rPr>
         <w:t>pitch</w:t>
       </w:r>
@@ -13892,7 +13986,7 @@
           <w:noProof/>
         </w:rPr>
         <w:drawing>
-          <wp:inline distT="0" distB="0" distL="0" distR="0" wp14:anchorId="09063400" wp14:editId="16F16C83">
+          <wp:inline distT="0" distB="0" distL="0" distR="0" wp14:anchorId="09063400" wp14:editId="71B05DC8">
             <wp:extent cx="4680000" cy="2632383"/>
             <wp:effectExtent l="0" t="0" r="6350" b="0"/>
             <wp:docPr id="1188031998" name="Imagen 14">
@@ -13921,7 +14015,7 @@
                     </pic:cNvPicPr>
                   </pic:nvPicPr>
                   <pic:blipFill>
-                    <a:blip r:embed="rId21" cstate="print">
+                    <a:blip r:embed="rId22" cstate="print">
                       <a:extLst>
                         <a:ext uri="{28A0092B-C50C-407E-A947-70E740481C1C}">
                           <a14:useLocalDpi xmlns:a14="http://schemas.microsoft.com/office/drawing/2010/main" val="0"/>
@@ -13961,7 +14055,7 @@
           <w:bCs/>
         </w:rPr>
       </w:pPr>
-      <w:hyperlink r:id="rId22" w:history="1">
+      <w:hyperlink r:id="rId23" w:history="1">
         <w:r>
           <w:rPr>
             <w:rStyle w:val="Hipervnculo"/>
@@ -14127,7 +14221,7 @@
       <w:pPr>
         <w:pStyle w:val="Ttulo2"/>
       </w:pPr>
-      <w:bookmarkStart w:id="12" w:name="_Toc237935960"/>
+      <w:bookmarkStart w:id="12" w:name="_Toc238023236"/>
       <w:r>
         <w:lastRenderedPageBreak/>
         <w:t>6.1. Lenguaje corporal</w:t>
@@ -14350,7 +14444,7 @@
           <w:noProof/>
         </w:rPr>
         <w:drawing>
-          <wp:inline distT="0" distB="0" distL="0" distR="0" wp14:anchorId="7E17CF4F" wp14:editId="6ED5B0ED">
+          <wp:inline distT="0" distB="0" distL="0" distR="0" wp14:anchorId="7E17CF4F" wp14:editId="0C63F4BB">
             <wp:extent cx="4680000" cy="2632383"/>
             <wp:effectExtent l="0" t="0" r="6350" b="0"/>
             <wp:docPr id="144226528" name="Imagen 15">
@@ -14379,7 +14473,7 @@
                     </pic:cNvPicPr>
                   </pic:nvPicPr>
                   <pic:blipFill>
-                    <a:blip r:embed="rId23" cstate="print">
+                    <a:blip r:embed="rId24" cstate="print">
                       <a:extLst>
                         <a:ext uri="{28A0092B-C50C-407E-A947-70E740481C1C}">
                           <a14:useLocalDpi xmlns:a14="http://schemas.microsoft.com/office/drawing/2010/main" val="0"/>
@@ -14422,7 +14516,7 @@
           <w:bCs/>
         </w:rPr>
       </w:pPr>
-      <w:hyperlink r:id="rId24" w:history="1">
+      <w:hyperlink r:id="rId25" w:history="1">
         <w:r>
           <w:rPr>
             <w:rStyle w:val="Hipervnculo"/>
@@ -14817,7 +14911,7 @@
           <w:u w:val="single"/>
         </w:rPr>
       </w:pPr>
-      <w:bookmarkStart w:id="13" w:name="_Toc237935961"/>
+      <w:bookmarkStart w:id="13" w:name="_Toc238023237"/>
       <w:r>
         <w:lastRenderedPageBreak/>
         <w:t>Síntesis</w:t>
@@ -14908,7 +15002,7 @@
                     <pic:cNvPicPr/>
                   </pic:nvPicPr>
                   <pic:blipFill>
-                    <a:blip r:embed="rId25">
+                    <a:blip r:embed="rId26">
                       <a:extLst>
                         <a:ext uri="{28A0092B-C50C-407E-A947-70E740481C1C}">
                           <a14:useLocalDpi xmlns:a14="http://schemas.microsoft.com/office/drawing/2010/main" val="0"/>
@@ -14949,7 +15043,7 @@
       <w:pPr>
         <w:pStyle w:val="Titulosgenerales"/>
       </w:pPr>
-      <w:bookmarkStart w:id="14" w:name="_Toc237935962"/>
+      <w:bookmarkStart w:id="14" w:name="_Toc238023238"/>
       <w:r>
         <w:lastRenderedPageBreak/>
         <w:t>Glosario</w:t>
@@ -15431,7 +15525,7 @@
       </w:pPr>
       <w:r>
         <w:rPr>
-          <w:rFonts w:cstheme="minorHAnsi"/>
+          <w:rStyle w:val="Extranjerismo"/>
           <w:b/>
           <w:bCs/>
         </w:rPr>
@@ -15457,7 +15551,21 @@
         <w:rPr>
           <w:rFonts w:cstheme="minorHAnsi"/>
         </w:rPr>
-        <w:t>parte esencial para cualquier establecimiento ya que ayuda a incrementar las ventas, mejorando la imagen y la marca ya sea por escaparates atractivos que inciten al público a contemplarlos más tiempo y hacer que entren al establecimiento.</w:t>
+        <w:t xml:space="preserve">parte esencial para cualquier establecimiento ya que ayuda </w:t>
+      </w:r>
+      <w:proofErr w:type="gramStart"/>
+      <w:r>
+        <w:rPr>
+          <w:rFonts w:cstheme="minorHAnsi"/>
+        </w:rPr>
+        <w:t>a</w:t>
+      </w:r>
+      <w:proofErr w:type="gramEnd"/>
+      <w:r>
+        <w:rPr>
+          <w:rFonts w:cstheme="minorHAnsi"/>
+        </w:rPr>
+        <w:t xml:space="preserve"> incrementar las ventas, mejorando la imagen y la marca ya sea por escaparates atractivos que inciten al público a contemplarlos más tiempo y hacer que entren al establecimiento.</w:t>
       </w:r>
     </w:p>
     <w:p>
@@ -15481,7 +15589,7 @@
       <w:pPr>
         <w:pStyle w:val="Titulosgenerales"/>
       </w:pPr>
-      <w:bookmarkStart w:id="15" w:name="_Toc237935963"/>
+      <w:bookmarkStart w:id="15" w:name="_Toc238023239"/>
       <w:r>
         <w:lastRenderedPageBreak/>
         <w:t>Referencias bibliográficas</w:t>
@@ -15516,26 +15624,44 @@
         <w:rPr>
           <w:rFonts w:cstheme="minorHAnsi"/>
         </w:rPr>
-        <w:t>Kotler, P., Bowen, J., y Makens, J. (2008). Marketing para el turismo. Pearson Prentice Hall.</w:t>
-      </w:r>
-    </w:p>
-    <w:p>
-      <w:pPr>
-        <w:spacing w:before="0" w:after="0"/>
-        <w:rPr>
-          <w:rFonts w:cstheme="minorHAnsi"/>
-        </w:rPr>
-      </w:pPr>
-      <w:r>
-        <w:rPr>
-          <w:rFonts w:cstheme="minorHAnsi"/>
-        </w:rPr>
-        <w:t xml:space="preserve">Mundo constructor. (2019). Visual </w:t>
+        <w:t xml:space="preserve">Kotler, P., Bowen, J., y Makens, J. (2008). </w:t>
       </w:r>
       <w:r>
         <w:rPr>
           <w:rStyle w:val="Extranjerismo"/>
         </w:rPr>
+        <w:t>Marketing</w:t>
+      </w:r>
+      <w:r>
+        <w:rPr>
+          <w:rFonts w:cstheme="minorHAnsi"/>
+        </w:rPr>
+        <w:t xml:space="preserve"> para el turismo. Pearson Prentice Hall.</w:t>
+      </w:r>
+    </w:p>
+    <w:p>
+      <w:pPr>
+        <w:spacing w:before="0" w:after="0"/>
+        <w:rPr>
+          <w:rFonts w:cstheme="minorHAnsi"/>
+        </w:rPr>
+      </w:pPr>
+      <w:r>
+        <w:rPr>
+          <w:rFonts w:cstheme="minorHAnsi"/>
+        </w:rPr>
+        <w:t xml:space="preserve">Mundo constructor. (2019). </w:t>
+      </w:r>
+      <w:r>
+        <w:rPr>
+          <w:rStyle w:val="Extranjerismo"/>
+        </w:rPr>
+        <w:t xml:space="preserve">Visual </w:t>
+      </w:r>
+      <w:r>
+        <w:rPr>
+          <w:rStyle w:val="Extranjerismo"/>
+        </w:rPr>
         <w:t>merchandising</w:t>
       </w:r>
       <w:r>
@@ -15693,7 +15819,7 @@
       <w:pPr>
         <w:pStyle w:val="Titulosgenerales"/>
       </w:pPr>
-      <w:bookmarkStart w:id="16" w:name="_Toc237935964"/>
+      <w:bookmarkStart w:id="16" w:name="_Toc238023240"/>
       <w:r>
         <w:lastRenderedPageBreak/>
         <w:t>Créditos</w:t>
@@ -16537,8 +16663,8 @@
       </w:pPr>
     </w:p>
     <w:sectPr>
-      <w:headerReference w:type="default" r:id="rId26"/>
-      <w:footerReference w:type="default" r:id="rId27"/>
+      <w:headerReference w:type="default" r:id="rId27"/>
+      <w:footerReference w:type="default" r:id="rId28"/>
       <w:pgSz w:w="12240" w:h="15840"/>
       <w:pgMar w:top="1701" w:right="1134" w:bottom="1134" w:left="1134" w:header="709" w:footer="737" w:gutter="0"/>
       <w:pgNumType w:start="1"/>
@@ -19198,7 +19324,6 @@
     <w:lvl w:ilvl="2">
       <w:start w:val="1"/>
       <w:numFmt w:val="none"/>
-      <w:pStyle w:val="Ttulo3"/>
       <w:lvlText w:val=""/>
       <w:lvlJc w:val="left"/>
       <w:pPr>
@@ -19211,7 +19336,6 @@
     <w:lvl w:ilvl="3">
       <w:start w:val="1"/>
       <w:numFmt w:val="none"/>
-      <w:pStyle w:val="Ttulo4"/>
       <w:lvlText w:val=""/>
       <w:lvlJc w:val="left"/>
       <w:pPr>
@@ -19224,7 +19348,6 @@
     <w:lvl w:ilvl="4">
       <w:start w:val="1"/>
       <w:numFmt w:val="none"/>
-      <w:pStyle w:val="Ttulo5"/>
       <w:lvlText w:val=""/>
       <w:lvlJc w:val="left"/>
       <w:pPr>
@@ -23405,17 +23528,6 @@
 </file>
 
 <file path=customXml/item1.xml><?xml version="1.0" encoding="utf-8"?>
-<p:properties xmlns:p="http://schemas.microsoft.com/office/2006/metadata/properties" xmlns:xsi="http://www.w3.org/2001/XMLSchema-instance" xmlns:pc="http://schemas.microsoft.com/office/infopath/2007/PartnerControls">
-  <documentManagement>
-    <TaxCatchAll xmlns="13c90a0b-73bc-4dc0-be5f-28d77b615beb" xsi:nil="true"/>
-    <lcf76f155ced4ddcb4097134ff3c332f xmlns="13c93bba-48ce-428c-bfe5-88b42c19b028">
-      <Terms xmlns="http://schemas.microsoft.com/office/infopath/2007/PartnerControls"/>
-    </lcf76f155ced4ddcb4097134ff3c332f>
-  </documentManagement>
-</p:properties>
-</file>
-
-<file path=customXml/item2.xml><?xml version="1.0" encoding="utf-8"?>
 <ct:contentTypeSchema xmlns:ct="http://schemas.microsoft.com/office/2006/metadata/contentType" xmlns:ma="http://schemas.microsoft.com/office/2006/metadata/properties/metaAttributes" ct:_="" ma:_="" ma:contentTypeName="Documento" ma:contentTypeID="0x0101006A81D6BD42E8DF4C91013959704817E1" ma:contentTypeVersion="15" ma:contentTypeDescription="Crear nuevo documento." ma:contentTypeScope="" ma:versionID="bf4f72ffd194f0963ff564daca6869f7">
   <xsd:schema xmlns:xsd="http://www.w3.org/2001/XMLSchema" xmlns:xs="http://www.w3.org/2001/XMLSchema" xmlns:p="http://schemas.microsoft.com/office/2006/metadata/properties" xmlns:ns2="13c90a0b-73bc-4dc0-be5f-28d77b615beb" xmlns:ns3="13c93bba-48ce-428c-bfe5-88b42c19b028" targetNamespace="http://schemas.microsoft.com/office/2006/metadata/properties" ma:root="true" ma:fieldsID="8718d6f4873a5b1392a45044efa78385" ns2:_="" ns3:_="">
     <xsd:import namespace="13c90a0b-73bc-4dc0-be5f-28d77b615beb"/>
@@ -23650,7 +23762,22 @@
 </ct:contentTypeSchema>
 </file>
 
+<file path=customXml/item2.xml><?xml version="1.0" encoding="utf-8"?>
+<p:properties xmlns:p="http://schemas.microsoft.com/office/2006/metadata/properties" xmlns:xsi="http://www.w3.org/2001/XMLSchema-instance" xmlns:pc="http://schemas.microsoft.com/office/infopath/2007/PartnerControls">
+  <documentManagement>
+    <TaxCatchAll xmlns="13c90a0b-73bc-4dc0-be5f-28d77b615beb" xsi:nil="true"/>
+    <lcf76f155ced4ddcb4097134ff3c332f xmlns="13c93bba-48ce-428c-bfe5-88b42c19b028">
+      <Terms xmlns="http://schemas.microsoft.com/office/infopath/2007/PartnerControls"/>
+    </lcf76f155ced4ddcb4097134ff3c332f>
+  </documentManagement>
+</p:properties>
+</file>
+
 <file path=customXml/item3.xml><?xml version="1.0" encoding="utf-8"?>
+<b:Sources xmlns:b="http://schemas.openxmlformats.org/officeDocument/2006/bibliography" xmlns="http://schemas.openxmlformats.org/officeDocument/2006/bibliography" SelectedStyle="\APASixthEditionOfficeOnline.xsl" StyleName="APA" Version="6"/>
+</file>
+
+<file path=customXml/item4.xml><?xml version="1.0" encoding="utf-8"?>
 <?mso-contentType ?>
 <FormTemplates xmlns="http://schemas.microsoft.com/sharepoint/v3/contenttype/forms">
   <Display>DocumentLibraryForm</Display>
@@ -23659,22 +23786,7 @@
 </FormTemplates>
 </file>
 
-<file path=customXml/item4.xml><?xml version="1.0" encoding="utf-8"?>
-<b:Sources xmlns:b="http://schemas.openxmlformats.org/officeDocument/2006/bibliography" xmlns="http://schemas.openxmlformats.org/officeDocument/2006/bibliography" SelectedStyle="\APASixthEditionOfficeOnline.xsl" StyleName="APA" Version="6"/>
-</file>
-
 <file path=customXml/itemProps1.xml><?xml version="1.0" encoding="utf-8"?>
-<ds:datastoreItem xmlns:ds="http://schemas.openxmlformats.org/officeDocument/2006/customXml" ds:itemID="{1279454D-02BE-4A9C-A117-DCD1573E2608}">
-  <ds:schemaRefs>
-    <ds:schemaRef ds:uri="http://schemas.microsoft.com/office/2006/metadata/properties"/>
-    <ds:schemaRef ds:uri="http://schemas.microsoft.com/office/infopath/2007/PartnerControls"/>
-    <ds:schemaRef ds:uri="13c90a0b-73bc-4dc0-be5f-28d77b615beb"/>
-    <ds:schemaRef ds:uri="13c93bba-48ce-428c-bfe5-88b42c19b028"/>
-  </ds:schemaRefs>
-</ds:datastoreItem>
-</file>
-
-<file path=customXml/itemProps2.xml><?xml version="1.0" encoding="utf-8"?>
 <ds:datastoreItem xmlns:ds="http://schemas.openxmlformats.org/officeDocument/2006/customXml" ds:itemID="{59065960-E0CA-4804-83B5-320CBCDCC160}">
   <ds:schemaRefs>
     <ds:schemaRef ds:uri="http://schemas.microsoft.com/office/2006/metadata/contentType"/>
@@ -23693,18 +23805,29 @@
 </ds:datastoreItem>
 </file>
 
+<file path=customXml/itemProps2.xml><?xml version="1.0" encoding="utf-8"?>
+<ds:datastoreItem xmlns:ds="http://schemas.openxmlformats.org/officeDocument/2006/customXml" ds:itemID="{1279454D-02BE-4A9C-A117-DCD1573E2608}">
+  <ds:schemaRefs>
+    <ds:schemaRef ds:uri="http://schemas.microsoft.com/office/2006/metadata/properties"/>
+    <ds:schemaRef ds:uri="http://schemas.microsoft.com/office/infopath/2007/PartnerControls"/>
+    <ds:schemaRef ds:uri="13c90a0b-73bc-4dc0-be5f-28d77b615beb"/>
+    <ds:schemaRef ds:uri="13c93bba-48ce-428c-bfe5-88b42c19b028"/>
+  </ds:schemaRefs>
+</ds:datastoreItem>
+</file>
+
 <file path=customXml/itemProps3.xml><?xml version="1.0" encoding="utf-8"?>
+<ds:datastoreItem xmlns:ds="http://schemas.openxmlformats.org/officeDocument/2006/customXml" ds:itemID="{2D2B5832-E448-44FA-9BA7-4210E2303E31}">
+  <ds:schemaRefs>
+    <ds:schemaRef ds:uri="http://schemas.openxmlformats.org/officeDocument/2006/bibliography"/>
+  </ds:schemaRefs>
+</ds:datastoreItem>
+</file>
+
+<file path=customXml/itemProps4.xml><?xml version="1.0" encoding="utf-8"?>
 <ds:datastoreItem xmlns:ds="http://schemas.openxmlformats.org/officeDocument/2006/customXml" ds:itemID="{10663269-2064-4804-8290-36D4A57F5557}">
   <ds:schemaRefs>
     <ds:schemaRef ds:uri="http://schemas.microsoft.com/sharepoint/v3/contenttype/forms"/>
   </ds:schemaRefs>
 </ds:datastoreItem>
-</file>
-
-<file path=customXml/itemProps4.xml><?xml version="1.0" encoding="utf-8"?>
-<ds:datastoreItem xmlns:ds="http://schemas.openxmlformats.org/officeDocument/2006/customXml" ds:itemID="{2D2B5832-E448-44FA-9BA7-4210E2303E31}">
-  <ds:schemaRefs>
-    <ds:schemaRef ds:uri="http://schemas.openxmlformats.org/officeDocument/2006/bibliography"/>
-  </ds:schemaRefs>
-</ds:datastoreItem>
 </file>
</xml_diff>

<commit_message>
UPD - CFA + Material + Videos
</commit_message>
<xml_diff>
--- a/fuentes/631101_CF5_DU.docx
+++ b/fuentes/631101_CF5_DU.docx
@@ -1,6 +1,6 @@
 
 <file path=word/document.xml><?xml version="1.0" encoding="utf-8"?>
-<w:document xmlns:wpc="http://schemas.microsoft.com/office/word/2010/wordprocessingCanvas" xmlns:cx="http://schemas.microsoft.com/office/drawing/2014/chartex" xmlns:cx1="http://schemas.microsoft.com/office/drawing/2015/9/8/chartex" xmlns:cx2="http://schemas.microsoft.com/office/drawing/2015/10/21/chartex" xmlns:cx3="http://schemas.microsoft.com/office/drawing/2016/5/9/chartex" xmlns:cx4="http://schemas.microsoft.com/office/drawing/2016/5/10/chartex" xmlns:cx5="http://schemas.microsoft.com/office/drawing/2016/5/11/chartex" xmlns:cx6="http://schemas.microsoft.com/office/drawing/2016/5/12/chartex" xmlns:cx7="http://schemas.microsoft.com/office/drawing/2016/5/13/chartex" xmlns:cx8="http://schemas.microsoft.com/office/drawing/2016/5/14/chartex" xmlns:mc="http://schemas.openxmlformats.org/markup-compatibility/2006" xmlns:aink="http://schemas.microsoft.com/office/drawing/2016/ink" xmlns:am3d="http://schemas.microsoft.com/office/drawing/2017/model3d" xmlns:o="urn:schemas-microsoft-com:office:office" xmlns:oel="http://schemas.microsoft.com/office/2019/extlst" xmlns:r="http://schemas.openxmlformats.org/officeDocument/2006/relationships" xmlns:m="http://schemas.openxmlformats.org/officeDocument/2006/math" xmlns:v="urn:schemas-microsoft-com:vml" xmlns:wp14="http://schemas.microsoft.com/office/word/2010/wordprocessingDrawing" xmlns:wp="http://schemas.openxmlformats.org/drawingml/2006/wordprocessingDrawing" xmlns:w10="urn:schemas-microsoft-com:office:word" xmlns:w="http://schemas.openxmlformats.org/wordprocessingml/2006/main" xmlns:w14="http://schemas.microsoft.com/office/word/2010/wordml" xmlns:w15="http://schemas.microsoft.com/office/word/2012/wordml" xmlns:w16cei="http://schemas.microsoft.com/office/word/2026/wordml/cei" xmlns:w16cex="http://schemas.microsoft.com/office/word/2018/wordml/cex" xmlns:w16cid="http://schemas.microsoft.com/office/word/2016/wordml/cid" xmlns:w16="http://schemas.microsoft.com/office/word/2018/wordml" xmlns:w16du="http://schemas.microsoft.com/office/word/2023/wordml/word16du" xmlns:w16sdtdh="http://schemas.microsoft.com/office/word/2020/wordml/sdtdatahash" xmlns:w16sdtfl="http://schemas.microsoft.com/office/word/2024/wordml/sdtformatlock" xmlns:w16se="http://schemas.microsoft.com/office/word/2015/wordml/symex" xmlns:wpg="http://schemas.microsoft.com/office/word/2010/wordprocessingGroup" xmlns:wpi="http://schemas.microsoft.com/office/word/2010/wordprocessingInk" xmlns:wne="http://schemas.microsoft.com/office/word/2006/wordml" xmlns:wps="http://schemas.microsoft.com/office/word/2010/wordprocessingShape" mc:Ignorable="w14 w15 w16se w16cid w16 w16cex w16sdtdh w16sdtfl w16du wp14">
+<w:document xmlns:wpc="http://schemas.microsoft.com/office/word/2010/wordprocessingCanvas" xmlns:cx="http://schemas.microsoft.com/office/drawing/2014/chartex" xmlns:cx1="http://schemas.microsoft.com/office/drawing/2015/9/8/chartex" xmlns:cx2="http://schemas.microsoft.com/office/drawing/2015/10/21/chartex" xmlns:cx3="http://schemas.microsoft.com/office/drawing/2016/5/9/chartex" xmlns:cx4="http://schemas.microsoft.com/office/drawing/2016/5/10/chartex" xmlns:cx5="http://schemas.microsoft.com/office/drawing/2016/5/11/chartex" xmlns:cx6="http://schemas.microsoft.com/office/drawing/2016/5/12/chartex" xmlns:cx7="http://schemas.microsoft.com/office/drawing/2016/5/13/chartex" xmlns:cx8="http://schemas.microsoft.com/office/drawing/2016/5/14/chartex" xmlns:mc="http://schemas.openxmlformats.org/markup-compatibility/2006" xmlns:aink="http://schemas.microsoft.com/office/drawing/2016/ink" xmlns:am3d="http://schemas.microsoft.com/office/drawing/2017/model3d" xmlns:o="urn:schemas-microsoft-com:office:office" xmlns:oel="http://schemas.microsoft.com/office/2019/extlst" xmlns:r="http://schemas.openxmlformats.org/officeDocument/2006/relationships" xmlns:m="http://schemas.openxmlformats.org/officeDocument/2006/math" xmlns:v="urn:schemas-microsoft-com:vml" xmlns:wp14="http://schemas.microsoft.com/office/word/2010/wordprocessingDrawing" xmlns:wp="http://schemas.openxmlformats.org/drawingml/2006/wordprocessingDrawing" xmlns:w10="urn:schemas-microsoft-com:office:word" xmlns:w="http://schemas.openxmlformats.org/wordprocessingml/2006/main" xmlns:w14="http://schemas.microsoft.com/office/word/2010/wordml" xmlns:w15="http://schemas.microsoft.com/office/word/2012/wordml" xmlns:w16cex="http://schemas.microsoft.com/office/word/2018/wordml/cex" xmlns:w16cid="http://schemas.microsoft.com/office/word/2016/wordml/cid" xmlns:w16="http://schemas.microsoft.com/office/word/2018/wordml" xmlns:w16du="http://schemas.microsoft.com/office/word/2023/wordml/word16du" xmlns:w16sdtdh="http://schemas.microsoft.com/office/word/2020/wordml/sdtdatahash" xmlns:w16sdtfl="http://schemas.microsoft.com/office/word/2024/wordml/sdtformatlock" xmlns:w16se="http://schemas.microsoft.com/office/word/2015/wordml/symex" xmlns:wpg="http://schemas.microsoft.com/office/word/2010/wordprocessingGroup" xmlns:wpi="http://schemas.microsoft.com/office/word/2010/wordprocessingInk" xmlns:wne="http://schemas.microsoft.com/office/word/2006/wordml" xmlns:wps="http://schemas.microsoft.com/office/word/2010/wordprocessingShape" mc:Ignorable="w14 w15 w16se w16cid w16 w16cex w16sdtdh w16sdtfl w16du wp14">
   <w:body>
     <w:p>
       <w:pPr>
@@ -211,7 +211,7 @@
               </wp:anchor>
             </w:drawing>
           </mc:Choice>
-          <mc:Fallback>
+          <mc:Fallback xmlns:w16cei="http://schemas.microsoft.com/office/word/2026/wordml/cei">
             <w:pict>
               <v:rect w14:anchorId="4C256C62" id="Rectángulo 3" o:spid="_x0000_s1026" alt="&quot;&quot;" style="position:absolute;margin-left:-55.95pt;margin-top:26.4pt;width:613.85pt;height:164.25pt;z-index:-251655168;visibility:visible;mso-wrap-style:square;mso-height-percent:0;mso-wrap-distance-left:9pt;mso-wrap-distance-top:0;mso-wrap-distance-right:9pt;mso-wrap-distance-bottom:0;mso-position-horizontal:absolute;mso-position-horizontal-relative:text;mso-position-vertical:absolute;mso-position-vertical-relative:text;mso-height-percent:0;mso-height-relative:margin;v-text-anchor:middle" o:gfxdata="UEsDBBQABgAIAAAAIQC2gziS/gAAAOEBAAATAAAAW0NvbnRlbnRfVHlwZXNdLnhtbJSRQU7DMBBF 90jcwfIWJU67QAgl6YK0S0CoHGBkTxKLZGx5TGhvj5O2G0SRWNoz/78nu9wcxkFMGNg6quQqL6RA 0s5Y6ir5vt9lD1JwBDIwOMJKHpHlpr69KfdHjyxSmriSfYz+USnWPY7AufNIadK6MEJMx9ApD/oD OlTrorhX2lFEilmcO2RdNtjC5xDF9pCuTyYBB5bi6bQ4syoJ3g9WQ0ymaiLzg5KdCXlKLjvcW893 SUOqXwnz5DrgnHtJTxOsQfEKIT7DmDSUCaxw7Rqn8787ZsmRM9e2VmPeBN4uqYvTtW7jvijg9N/y JsXecLq0q+WD6m8AAAD//wMAUEsDBBQABgAIAAAAIQA4/SH/1gAAAJQBAAALAAAAX3JlbHMvLnJl bHOkkMFqwzAMhu+DvYPRfXGawxijTi+j0GvpHsDYimMaW0Yy2fr2M4PBMnrbUb/Q94l/f/hMi1qR JVI2sOt6UJgd+ZiDgffL8ekFlFSbvV0oo4EbChzGx4f9GRdb25HMsYhqlCwG5lrLq9biZkxWOiqY 22YiTra2kYMu1l1tQD30/bPm3wwYN0x18gb45AdQl1tp5j/sFB2T0FQ7R0nTNEV3j6o9feQzro1i OWA14Fm+Q8a1a8+Bvu/d/dMb2JY5uiPbhG/ktn4cqGU/er3pcvwCAAD//wMAUEsDBBQABgAIAAAA IQDXSMK5gAIAAGAFAAAOAAAAZHJzL2Uyb0RvYy54bWysVE1v2zAMvQ/YfxB0X+1kydIEdYqgRYcB RVu0HXpWZCk2IIsapXzt14+SP9J1xQ7DclAk8fGRfCZ1cXloDNsp9DXYgo/Ocs6UlVDWdlPw7883 n84580HYUhiwquBH5fnl8uOHi71bqDFUYEqFjEisX+xdwasQ3CLLvKxUI/wZOGXJqAEbEeiIm6xE sSf2xmTjPP+S7QFLhyCV93R73Rr5MvFrrWS419qrwEzBKbeQVkzrOq7Z8kIsNihcVcsuDfEPWTSi thR0oLoWQbAt1n9QNbVE8KDDmYQmA61rqVINVM0of1PNUyWcSrWQON4NMvn/Ryvvdk/uAUmGvfML T9tYxUFjE/8pP3ZIYh0HsdQhMEmXs9l8ej6fcibJNs7Pp/PZNMqZndwd+vBVQcPipuBIXyOJJHa3 PrTQHhKjeTB1eVMbkw64WV8ZZDsRv1z+eTS57th/gxkbwRaiW8sYb7JTMWkXjkZFnLGPSrO6pPTH KZPUZ2qII6RUNoxaUyVK1Yaf5vTro8fOjB6p0kQYmTXFH7g7gh7ZkvTcbZYdPrqq1KaDc/63xFrn wSNFBhsG56a2gO8RGKqqi9zie5FaaaJKayiPD8gQ2iHxTt7U9N1uhQ8PAmkqaH5o0sM9LdrAvuDQ 7TirAH++dx/x1Kxk5WxPU1Zw/2MrUHFmvllq4/loMoljmQ6T6WxMB3xtWb+22G1zBdQOI3pTnEzb iA+m32qE5oUehFWMSiZhJcUuuAzYH65CO/30pEi1WiUYjaIT4dY+ORnJo6qxL58PLwJd17yB+v4O +okUizc93GKjp4XVNoCuU4OfdO30pjFOjdM9OfGdeH1OqNPDuPwFAAD//wMAUEsDBBQABgAIAAAA IQDARUG43wAAAAwBAAAPAAAAZHJzL2Rvd25yZXYueG1sTI/BTsMwDIbvSLxDZCRuW5pNQ6PUndBE xQ1pgwPHrPHaisbpkmxr357sBDdb/vT7+4vNaHtxIR86xwhqnoEgrp3puEH4+qxmaxAhaja6d0wI EwXYlPd3hc6Nu/KOLvvYiBTCIdcIbYxDLmWoW7I6zN1AnG5H562OafWNNF5fU7jt5SLLnqTVHacP rR5o21L9sz9bhO+3Lb3v6PQxeT+pEx9Ntasi4uPD+PoCItIY/2C46Sd1KJPTwZ3ZBNEjzJRSz4lF WC1Shxuh1CpNB4TlWi1BloX8X6L8BQAA//8DAFBLAQItABQABgAIAAAAIQC2gziS/gAAAOEBAAAT AAAAAAAAAAAAAAAAAAAAAABbQ29udGVudF9UeXBlc10ueG1sUEsBAi0AFAAGAAgAAAAhADj9If/W AAAAlAEAAAsAAAAAAAAAAAAAAAAALwEAAF9yZWxzLy5yZWxzUEsBAi0AFAAGAAgAAAAhANdIwrmA AgAAYAUAAA4AAAAAAAAAAAAAAAAALgIAAGRycy9lMm9Eb2MueG1sUEsBAi0AFAAGAAgAAAAhAMBF QbjfAAAADAEAAA8AAAAAAAAAAAAAAAAA2gQAAGRycy9kb3ducmV2LnhtbFBLBQYAAAAABAAEAPMA AADmBQAAAAA= " fillcolor="#00314d" stroked="f" strokeweight="1pt"/>
             </w:pict>
@@ -567,6 +567,7 @@
         <w:p>
           <w:pPr>
             <w:pStyle w:val="TtuloTDC"/>
+            <w:spacing w:before="0" w:line="360" w:lineRule="auto"/>
           </w:pPr>
           <w:r>
             <w:t>Tabla de contenido</w:t>
@@ -2107,7 +2108,7 @@
           <w:noProof/>
         </w:rPr>
         <w:drawing>
-          <wp:inline distT="0" distB="0" distL="0" distR="0" wp14:anchorId="2556C62E" wp14:editId="33FB7AD8">
+          <wp:inline distT="0" distB="0" distL="0" distR="0" wp14:anchorId="2556C62E" wp14:editId="7CDD70A0">
             <wp:extent cx="4680000" cy="2632387"/>
             <wp:effectExtent l="0" t="0" r="6350" b="0"/>
             <wp:docPr id="471733013" name="Imagen 22">
@@ -2248,7 +2249,43 @@
                 <w:rFonts w:cstheme="minorHAnsi"/>
               </w:rPr>
               <w:tab/>
-              <w:t>El componente ventas y comunicación da cuenta del acercamiento al concepto y elementos de la venta, así como la venta consultiva, clínicas de venta y el manejo de objeciones indispensables para llevar a cabo el cierre de la venta.</w:t>
+              <w:t>El componente ventas</w:t>
+            </w:r>
+            <w:r>
+              <w:rPr>
+                <w:rFonts w:cstheme="minorHAnsi"/>
+              </w:rPr>
+              <w:t xml:space="preserve"> </w:t>
+            </w:r>
+            <w:r>
+              <w:rPr>
+                <w:rFonts w:cstheme="minorHAnsi"/>
+              </w:rPr>
+              <w:t xml:space="preserve">comunicación y </w:t>
+            </w:r>
+            <w:r>
+              <w:rPr>
+                <w:rStyle w:val="Extranjerismo"/>
+              </w:rPr>
+              <w:t>merchandising</w:t>
+            </w:r>
+            <w:r>
+              <w:rPr>
+                <w:rFonts w:cstheme="minorHAnsi"/>
+              </w:rPr>
+              <w:t xml:space="preserve"> da cuenta del acercamiento al concepto y elementos de la venta, así como la venta consultiva, clínicas de venta y el manejo de objeciones</w:t>
+            </w:r>
+            <w:r>
+              <w:rPr>
+                <w:rFonts w:cstheme="minorHAnsi"/>
+              </w:rPr>
+              <w:t>,</w:t>
+            </w:r>
+            <w:r>
+              <w:rPr>
+                <w:rFonts w:cstheme="minorHAnsi"/>
+              </w:rPr>
+              <w:t xml:space="preserve"> indispensables para llevar a cabo el cierre de la venta.</w:t>
             </w:r>
           </w:p>
           <w:p>
@@ -2331,8 +2368,16 @@
         <w:rPr>
           <w:rFonts w:cstheme="minorHAnsi"/>
         </w:rPr>
-        <w:t>La contabilidad es la herramienta que transforma las operaciones diarias en información ordenada, verificable y comparable. Bajo la regulación colombiana, su función trasciende el simple registro, convirtiéndose en un sistema de trazabilidad y control que permite sustentar cada transacción con evidencia sólida (soportes y facturas), reduciendo errores y facilitando auditorías.</w:t>
-      </w:r>
+        <w:t>La venta es un proceso estratégico, comunicativo y relacional mediante el cual una persona o empresa ofrece un producto o servicio a un cliente con el propósito de satisfacer una necesidad o resolver un problema, a cambio de una contraprestación económica. Desde una perspectiva académica, la venta no se limita a la simple transacción, sino que constituye un acto de interacción social y económica, basado en la identificación de necesidades, la generación de confianza y la creación de valor.</w:t>
+      </w:r>
+    </w:p>
+    <w:p>
+      <w:pPr>
+        <w:spacing w:before="0" w:after="0"/>
+        <w:rPr>
+          <w:rFonts w:cstheme="minorHAnsi"/>
+        </w:rPr>
+      </w:pPr>
     </w:p>
     <w:p>
       <w:pPr>
@@ -2368,7 +2413,7 @@
         <w:rPr>
           <w:rFonts w:cstheme="minorHAnsi"/>
         </w:rPr>
-        <w:t>Aunque existen diferentes modelos, la mayoría coinciden en que el proceso de venta se desarrolla en varias etapas secuenciales e interdependientes:</w:t>
+        <w:t>Aunque existen diferentes modelos, la mayoría coincide en que el proceso de venta se desarrolla en varias etapas secuenciales e interdependientes:</w:t>
       </w:r>
     </w:p>
     <w:p>
@@ -2487,6 +2532,24 @@
     </w:p>
     <w:p>
       <w:pPr>
+        <w:spacing w:before="0" w:after="0"/>
+        <w:ind w:left="708" w:firstLine="361"/>
+        <w:rPr>
+          <w:rFonts w:cstheme="minorHAnsi"/>
+        </w:rPr>
+      </w:pPr>
+    </w:p>
+    <w:p>
+      <w:pPr>
+        <w:spacing w:before="0" w:after="0"/>
+        <w:ind w:left="708" w:firstLine="361"/>
+        <w:rPr>
+          <w:rFonts w:cstheme="minorHAnsi"/>
+        </w:rPr>
+      </w:pPr>
+    </w:p>
+    <w:p>
+      <w:pPr>
         <w:pStyle w:val="Prrafodelista"/>
         <w:numPr>
           <w:ilvl w:val="0"/>
@@ -2505,6 +2568,7 @@
           <w:b/>
           <w:bCs/>
         </w:rPr>
+        <w:lastRenderedPageBreak/>
         <w:t>Presentación y demostración</w:t>
       </w:r>
     </w:p>
@@ -2543,7 +2607,6 @@
           <w:b/>
           <w:bCs/>
         </w:rPr>
-        <w:lastRenderedPageBreak/>
         <w:t>Manejo de objeciones</w:t>
       </w:r>
     </w:p>
@@ -2785,6 +2848,16 @@
     <w:p>
       <w:pPr>
         <w:pStyle w:val="Prrafodelista"/>
+        <w:spacing w:before="0" w:after="0"/>
+        <w:ind w:left="1429" w:firstLine="0"/>
+        <w:rPr>
+          <w:rFonts w:cstheme="minorHAnsi"/>
+        </w:rPr>
+      </w:pPr>
+    </w:p>
+    <w:p>
+      <w:pPr>
+        <w:pStyle w:val="Prrafodelista"/>
         <w:numPr>
           <w:ilvl w:val="0"/>
           <w:numId w:val="11"/>
@@ -2802,6 +2875,7 @@
           <w:b/>
           <w:bCs/>
         </w:rPr>
+        <w:lastRenderedPageBreak/>
         <w:t>Digitales</w:t>
       </w:r>
     </w:p>
@@ -2924,7 +2998,6 @@
         <w:rPr>
           <w:rFonts w:cstheme="minorHAnsi"/>
         </w:rPr>
-        <w:lastRenderedPageBreak/>
         <w:t>Videollamadas y presentaciones virtuales.</w:t>
       </w:r>
     </w:p>
@@ -2969,6 +3042,7 @@
         </w:rPr>
         <w:t>Herramientas de inteligencia de negocios (</w:t>
       </w:r>
+      <w:proofErr w:type="gramStart"/>
       <w:r>
         <w:rPr>
           <w:rStyle w:val="Extranjerismo"/>
@@ -2976,6 +3050,7 @@
         </w:rPr>
         <w:t>business intelligence</w:t>
       </w:r>
+      <w:proofErr w:type="gramEnd"/>
       <w:r>
         <w:rPr>
           <w:rFonts w:cstheme="minorHAnsi"/>
@@ -3206,31 +3281,21 @@
         <w:rPr>
           <w:rFonts w:cstheme="minorHAnsi"/>
         </w:rPr>
+        <w:lastRenderedPageBreak/>
         <w:t>A su vez, la venta consultiva enfatiza la identificación de necesidades y la propuesta de soluciones personalizadas, mientras que las clínicas de venta constituyen espacios de práctica y entrenamiento para fortalecer habilidades de negociación y comunicación.</w:t>
       </w:r>
     </w:p>
     <w:p>
       <w:pPr>
-        <w:pStyle w:val="Prrafodelista"/>
-        <w:spacing w:before="0" w:after="0"/>
-        <w:ind w:left="1129" w:firstLine="0"/>
-        <w:rPr>
-          <w:rFonts w:cstheme="minorHAnsi"/>
-        </w:rPr>
-      </w:pPr>
-    </w:p>
-    <w:p>
-      <w:pPr>
-        <w:spacing w:before="0" w:after="0"/>
-        <w:rPr>
-          <w:rFonts w:cstheme="minorHAnsi"/>
-        </w:rPr>
-      </w:pPr>
-      <w:r>
-        <w:rPr>
-          <w:rFonts w:cstheme="minorHAnsi"/>
-        </w:rPr>
-        <w:lastRenderedPageBreak/>
+        <w:spacing w:before="0" w:after="0"/>
+        <w:rPr>
+          <w:rFonts w:cstheme="minorHAnsi"/>
+        </w:rPr>
+      </w:pPr>
+      <w:r>
+        <w:rPr>
+          <w:rFonts w:cstheme="minorHAnsi"/>
+        </w:rPr>
         <w:t>El manejo de objeciones resulta esencial para transformar dudas o resistencias en oportunidades que fortalezcan la confianza y faciliten el cierre exitoso de la venta.</w:t>
       </w:r>
     </w:p>
@@ -3284,15 +3349,6 @@
     </w:p>
     <w:p>
       <w:pPr>
-        <w:spacing w:before="0" w:after="0"/>
-        <w:ind w:left="708" w:firstLine="360"/>
-        <w:rPr>
-          <w:rFonts w:cstheme="minorHAnsi"/>
-        </w:rPr>
-      </w:pPr>
-    </w:p>
-    <w:p>
-      <w:pPr>
         <w:pStyle w:val="Prrafodelista"/>
         <w:numPr>
           <w:ilvl w:val="0"/>
@@ -3358,6 +3414,7 @@
           <w:b/>
           <w:bCs/>
         </w:rPr>
+        <w:lastRenderedPageBreak/>
         <w:t>Técnicas de la venta</w:t>
       </w:r>
     </w:p>
@@ -3386,14 +3443,7 @@
         <w:rPr>
           <w:rFonts w:cstheme="minorHAnsi"/>
         </w:rPr>
-        <w:t xml:space="preserve">, que emplea </w:t>
-      </w:r>
-      <w:r>
-        <w:rPr>
-          <w:rFonts w:cstheme="minorHAnsi"/>
-        </w:rPr>
-        <w:lastRenderedPageBreak/>
-        <w:t>preguntas estratégicas en cuatro fases. Estas técnicas permiten estructurar el diálogo de manera consultiva, aumentando las posibilidades de éxito en ventas complejas.</w:t>
+        <w:t>, que emplea preguntas estratégicas en cuatro fases. Estas técnicas permiten estructurar el diálogo de manera consultiva, aumentando las posibilidades de éxito en ventas complejas.</w:t>
       </w:r>
     </w:p>
     <w:p>
@@ -3498,22 +3548,23 @@
     <w:p>
       <w:pPr>
         <w:spacing w:before="0" w:after="0"/>
-        <w:rPr>
-          <w:rFonts w:cstheme="minorHAnsi"/>
-        </w:rPr>
-      </w:pPr>
-      <w:r>
-        <w:rPr>
-          <w:rFonts w:cstheme="minorHAnsi"/>
-        </w:rPr>
-        <w:t xml:space="preserve">Corresponde al conjunto de técnicas utilizadas para atender las dudas, inquietudes o resistencias que presentan los clientes durante el proceso de compra. Su adecuada gestión evita que estas barreras se conviertan en obstáculos definitivos, transformándolas en oportunidades para reforzar argumentos de valor, resolver malentendidos y afianzar la confianza del cliente. El éxito en el manejo de objeciones </w:t>
+        <w:ind w:left="708" w:firstLine="360"/>
+        <w:rPr>
+          <w:rFonts w:cstheme="minorHAnsi"/>
+        </w:rPr>
+      </w:pPr>
+      <w:r>
+        <w:rPr>
+          <w:rFonts w:cstheme="minorHAnsi"/>
+        </w:rPr>
+        <w:t xml:space="preserve">Corresponde al conjunto de técnicas utilizadas para atender las dudas, inquietudes o resistencias que presentan los clientes durante el proceso de compra. Su adecuada gestión evita que estas barreras se conviertan en </w:t>
       </w:r>
       <w:r>
         <w:rPr>
           <w:rFonts w:cstheme="minorHAnsi"/>
         </w:rPr>
         <w:lastRenderedPageBreak/>
-        <w:t>depende de la preparación, la escucha activa y la capacidad de responder con soluciones claras y convincentes.</w:t>
+        <w:t>obstáculos definitivos, transformándolas en oportunidades para reforzar argumentos de valor, resolver malentendidos y afianzar la confianza del cliente. El éxito en el manejo de objeciones depende de la preparación, la escucha activa y la capacidad de responder con soluciones claras y convincentes.</w:t>
       </w:r>
     </w:p>
     <w:p>
@@ -3662,7 +3713,31 @@
         <w:rPr>
           <w:rFonts w:cstheme="minorHAnsi"/>
         </w:rPr>
-        <w:t xml:space="preserve"> estas preguntas toman un problema del cliente y exploran sus efectos o consecuencias. Ayudan al cliente a comprender la seriedad o urgencia del problema, amplificando su importancia en su mente. Se debe evitar proyectar escenarios apocalípticos, ya que esto podría deprimir o asustar al cliente. En cuanto el cliente comprenda las implicaciones del problema, es importante pasar a la siguiente fase de preguntas evitando demoras.</w:t>
+        <w:t xml:space="preserve"> estas preguntas</w:t>
+      </w:r>
+      <w:r>
+        <w:rPr>
+          <w:rFonts w:cstheme="minorHAnsi"/>
+        </w:rPr>
+        <w:t>,</w:t>
+      </w:r>
+      <w:r>
+        <w:rPr>
+          <w:rFonts w:cstheme="minorHAnsi"/>
+        </w:rPr>
+        <w:t xml:space="preserve"> toman un problema del cliente y exploran sus efectos o consecuencias. Ayudan al cliente a comprender la seriedad o urgencia del problema, amplificando su importancia en su mente. Se debe evitar proyectar escenarios apocalípticos, ya que esto podría deprimir o asustar al cliente. En cuanto el cliente comprenda las implicaciones del problema, es importante pasar a la siguiente fase de preguntas</w:t>
+      </w:r>
+      <w:r>
+        <w:rPr>
+          <w:rFonts w:cstheme="minorHAnsi"/>
+        </w:rPr>
+        <w:t>,</w:t>
+      </w:r>
+      <w:r>
+        <w:rPr>
+          <w:rFonts w:cstheme="minorHAnsi"/>
+        </w:rPr>
+        <w:t xml:space="preserve"> evitando demoras.</w:t>
       </w:r>
     </w:p>
     <w:p>
@@ -3683,20 +3758,14 @@
           <w:b/>
           <w:bCs/>
         </w:rPr>
+        <w:lastRenderedPageBreak/>
         <w:t xml:space="preserve">Necesidad / Beneficio: </w:t>
       </w:r>
       <w:r>
         <w:rPr>
           <w:rFonts w:cstheme="minorHAnsi"/>
         </w:rPr>
-        <w:t xml:space="preserve">estas preguntas muestran el valor de la solución ante los ojos del cliente. Se centran en los aspectos positivos de la solución que </w:t>
-      </w:r>
-      <w:r>
-        <w:rPr>
-          <w:rFonts w:cstheme="minorHAnsi"/>
-        </w:rPr>
-        <w:lastRenderedPageBreak/>
-        <w:t>combaten los efectos negativos del problema, ayudando a reenfocar la atención del cliente en la solución más que en el problema. Además, permiten que sea el propio cliente quien mencione las ventajas de la solución en lugar de que lo haga el vendedor. Este tipo de preguntas también reducen las objeciones.</w:t>
+        <w:t>estas preguntas muestran el valor de la solución ante los ojos del cliente. Se centran en los aspectos positivos de la solución que combaten los efectos negativos del problema, ayudando a reenfocar la atención del cliente en la solución más que en el problema. Además, permiten que sea el propio cliente quien mencione las ventajas de la solución en lugar de que lo haga el vendedor. Este tipo de preguntas también reduce las objeciones.</w:t>
       </w:r>
     </w:p>
     <w:p>
@@ -3868,6 +3937,7 @@
           <w:b/>
           <w:bCs/>
         </w:rPr>
+        <w:lastRenderedPageBreak/>
         <w:t>Personal de entregas</w:t>
       </w:r>
     </w:p>
@@ -3906,7 +3976,6 @@
           <w:b/>
           <w:bCs/>
         </w:rPr>
-        <w:lastRenderedPageBreak/>
         <w:t>Tomadores de órdenes externos</w:t>
       </w:r>
     </w:p>
@@ -3922,7 +3991,19 @@
         <w:rPr>
           <w:rFonts w:cstheme="minorHAnsi"/>
         </w:rPr>
-        <w:t>Aquellos vendedores que solo toman el pedido revisan los inventarios y sugieren la venta.</w:t>
+        <w:t>Aquellos vendedores que solo toman el pedido</w:t>
+      </w:r>
+      <w:r>
+        <w:rPr>
+          <w:rFonts w:cstheme="minorHAnsi"/>
+        </w:rPr>
+        <w:t>,</w:t>
+      </w:r>
+      <w:r>
+        <w:rPr>
+          <w:rFonts w:cstheme="minorHAnsi"/>
+        </w:rPr>
+        <w:t xml:space="preserve"> revisan los inventarios y sugieren la venta.</w:t>
       </w:r>
     </w:p>
     <w:p>
@@ -3947,14 +4028,6 @@
         </w:rPr>
         <w:t>Ahora, los vendedores creadores de órdenes son, por lo general, quienes laboran en laboratorios farmacéuticos solo realizan visitas y persuaden para que se solicite a los pacientes la marca sugerida al cuerpo médico.</w:t>
       </w:r>
-    </w:p>
-    <w:p>
-      <w:pPr>
-        <w:spacing w:before="0" w:after="0"/>
-        <w:rPr>
-          <w:rFonts w:cstheme="minorHAnsi"/>
-        </w:rPr>
-      </w:pPr>
     </w:p>
     <w:p>
       <w:pPr>
@@ -4091,7 +4164,19 @@
         <w:rPr>
           <w:rFonts w:cstheme="minorHAnsi"/>
         </w:rPr>
-        <w:t>Entrenado en ventas.</w:t>
+        <w:t>Entrenado</w:t>
+      </w:r>
+      <w:r>
+        <w:rPr>
+          <w:rFonts w:cstheme="minorHAnsi"/>
+        </w:rPr>
+        <w:t>r</w:t>
+      </w:r>
+      <w:r>
+        <w:rPr>
+          <w:rFonts w:cstheme="minorHAnsi"/>
+        </w:rPr>
+        <w:t xml:space="preserve"> en ventas.</w:t>
       </w:r>
     </w:p>
     <w:p>
@@ -4222,16 +4307,6 @@
     </w:p>
     <w:p>
       <w:pPr>
-        <w:pStyle w:val="Prrafodelista"/>
-        <w:spacing w:before="0" w:after="0"/>
-        <w:ind w:left="1429" w:firstLine="0"/>
-        <w:rPr>
-          <w:rFonts w:cstheme="minorHAnsi"/>
-        </w:rPr>
-      </w:pPr>
-    </w:p>
-    <w:p>
-      <w:pPr>
         <w:pStyle w:val="Ttulo2"/>
       </w:pPr>
       <w:bookmarkStart w:id="3" w:name="_Toc238023227"/>
@@ -4401,7 +4476,23 @@
           <w:b/>
           <w:bCs/>
         </w:rPr>
-        <w:t>Ventas en feria y salones</w:t>
+        <w:t>Ventas en feria</w:t>
+      </w:r>
+      <w:r>
+        <w:rPr>
+          <w:rFonts w:cstheme="minorHAnsi"/>
+          <w:b/>
+          <w:bCs/>
+        </w:rPr>
+        <w:t>s</w:t>
+      </w:r>
+      <w:r>
+        <w:rPr>
+          <w:rFonts w:cstheme="minorHAnsi"/>
+          <w:b/>
+          <w:bCs/>
+        </w:rPr>
+        <w:t xml:space="preserve"> y salones</w:t>
       </w:r>
     </w:p>
     <w:p>
@@ -4490,7 +4581,19 @@
         <w:rPr>
           <w:rFonts w:cstheme="minorHAnsi"/>
         </w:rPr>
-        <w:t>Son conocidos como mayorista, que les venden a otros pequeños negocios.</w:t>
+        <w:t>Son conocidos como mayorista</w:t>
+      </w:r>
+      <w:r>
+        <w:rPr>
+          <w:rFonts w:cstheme="minorHAnsi"/>
+        </w:rPr>
+        <w:t>s</w:t>
+      </w:r>
+      <w:r>
+        <w:rPr>
+          <w:rFonts w:cstheme="minorHAnsi"/>
+        </w:rPr>
+        <w:t>, que venden a otros pequeños negocios.</w:t>
       </w:r>
     </w:p>
     <w:p>
@@ -4601,7 +4704,31 @@
         <w:rPr>
           <w:rFonts w:cstheme="minorHAnsi"/>
         </w:rPr>
-        <w:t>Es una venta que se realiza temporalmente en algunos puntos seleccionados para vender productos agrícolas o de la canasta familiar, también son puestos móviles algo permanentes. Generalmente no cuentan con permisos locales.</w:t>
+        <w:t>Es una venta que se realiza temporalmente en algunos puntos seleccionados para vender productos agrícolas o de la canasta familiar</w:t>
+      </w:r>
+      <w:r>
+        <w:rPr>
+          <w:rFonts w:cstheme="minorHAnsi"/>
+        </w:rPr>
+        <w:t xml:space="preserve">; </w:t>
+      </w:r>
+      <w:r>
+        <w:rPr>
+          <w:rFonts w:cstheme="minorHAnsi"/>
+        </w:rPr>
+        <w:t>también son puestos móviles algo permanentes. Generalmente</w:t>
+      </w:r>
+      <w:r>
+        <w:rPr>
+          <w:rFonts w:cstheme="minorHAnsi"/>
+        </w:rPr>
+        <w:t>,</w:t>
+      </w:r>
+      <w:r>
+        <w:rPr>
+          <w:rFonts w:cstheme="minorHAnsi"/>
+        </w:rPr>
+        <w:t xml:space="preserve"> no cuentan con permisos locales.</w:t>
       </w:r>
     </w:p>
     <w:p>
@@ -4722,7 +4849,19 @@
         <w:rPr>
           <w:rFonts w:cstheme="minorHAnsi"/>
         </w:rPr>
-        <w:t>, hace uso del Internet y la web para realizar transacciones de solicitud y pago de negocios (Mejía, 2017, p. 24). Este tipo de venta permite a los negocios ofrecer sus productos y servicios a una audiencia global, facilitando la solicitud y el pago de manera rápida y segura. El comercio electrónico ha revolucionado la forma en que las empresas y los consumidores interactúan, proporcionando comodidad, eficiencia y una amplia variedad de opciones a un solo clic de distancia.</w:t>
+        <w:t>, hace uso de</w:t>
+      </w:r>
+      <w:r>
+        <w:rPr>
+          <w:rFonts w:cstheme="minorHAnsi"/>
+        </w:rPr>
+        <w:t xml:space="preserve"> i</w:t>
+      </w:r>
+      <w:r>
+        <w:rPr>
+          <w:rFonts w:cstheme="minorHAnsi"/>
+        </w:rPr>
+        <w:t>nternet y la web para realizar transacciones de solicitud y pago de negocios (Mejía, 2017, p. 24). Este tipo de venta permite a los negocios ofrecer sus productos y servicios a una audiencia global, facilitando la solicitud y el pago de manera rápida y segura. El comercio electrónico ha revolucionado la forma en que las empresas y los consumidores interactúan, proporcionando comodidad, eficiencia y una amplia variedad de opciones a un solo clic de distancia.</w:t>
       </w:r>
     </w:p>
     <w:p>
@@ -4786,7 +4925,19 @@
         <w:rPr>
           <w:rFonts w:cstheme="minorHAnsi"/>
         </w:rPr>
-        <w:t>De este modo, el proceso de venta se convierte en una disciplina que asegura la satisfacción del cliente y la sostenibilidad del negocio. Como complemento se expone la figura 2.</w:t>
+        <w:t>De este modo, el proceso de venta se convierte en una disciplina que asegura la satisfacción del cliente y la sostenibilidad del negocio. Como complemento</w:t>
+      </w:r>
+      <w:r>
+        <w:rPr>
+          <w:rFonts w:cstheme="minorHAnsi"/>
+        </w:rPr>
+        <w:t>,</w:t>
+      </w:r>
+      <w:r>
+        <w:rPr>
+          <w:rFonts w:cstheme="minorHAnsi"/>
+        </w:rPr>
+        <w:t xml:space="preserve"> se expone la figura 2.</w:t>
       </w:r>
     </w:p>
     <w:p>
@@ -4821,10 +4972,10 @@
           <w:noProof/>
         </w:rPr>
         <w:drawing>
-          <wp:inline distT="0" distB="0" distL="0" distR="0" wp14:anchorId="52A9A1A5" wp14:editId="37737A89">
+          <wp:inline distT="0" distB="0" distL="0" distR="0" wp14:anchorId="7016F71D" wp14:editId="21FF492F">
             <wp:extent cx="4680000" cy="2746895"/>
             <wp:effectExtent l="0" t="0" r="6350" b="0"/>
-            <wp:docPr id="597602712" name="Gráfico 24" descr="El esquema representa el ciclo de la venta como un proceso continuo que inicia con la prospección de clientes potenciales y avanza hacia el acercamiento, la entrevista y la presentación o demostración del producto o servicio. Posteriormente, se desarrolla la etapa de negociación, seguida del cierre de la venta. Finalmente, se incluyen las acciones de posventa y relaciones de largo plazo (ALP), que permiten mantener la fidelización del cliente y generar referidos, lo cual retroalimenta nuevamente el ciclo."/>
+            <wp:docPr id="1546587918" name="Gráfico 4" descr="El esquema representa el ciclo de la venta como un proceso continuo que inicia con la prospección de clientes potenciales y avanza hacia el acercamiento, las entrevistas y la presentación o demostración del producto o servicio. Posteriormente, se desarrolla la etapa de negociación, seguida del cierre de la venta. Finalmente, se incluyen las acciones de posventa y relaciones de largo plazo (ALP), que permiten mantener la fidelización del cliente y generar referidos, lo cual retroalimenta nuevamente el ciclo."/>
             <wp:cNvGraphicFramePr>
               <a:graphicFrameLocks xmlns:a="http://schemas.openxmlformats.org/drawingml/2006/main" noChangeAspect="1"/>
             </wp:cNvGraphicFramePr>
@@ -4832,7 +4983,7 @@
               <a:graphicData uri="http://schemas.openxmlformats.org/drawingml/2006/picture">
                 <pic:pic xmlns:pic="http://schemas.openxmlformats.org/drawingml/2006/picture">
                   <pic:nvPicPr>
-                    <pic:cNvPr id="597602712" name="Gráfico 24" descr="El esquema representa el ciclo de la venta como un proceso continuo que inicia con la prospección de clientes potenciales y avanza hacia el acercamiento, la entrevista y la presentación o demostración del producto o servicio. Posteriormente, se desarrolla la etapa de negociación, seguida del cierre de la venta. Finalmente, se incluyen las acciones de posventa y relaciones de largo plazo (ALP), que permiten mantener la fidelización del cliente y generar referidos, lo cual retroalimenta nuevamente el ciclo."/>
+                    <pic:cNvPr id="1546587918" name="Gráfico 4" descr="El esquema representa el ciclo de la venta como un proceso continuo que inicia con la prospección de clientes potenciales y avanza hacia el acercamiento, las entrevistas y la presentación o demostración del producto o servicio. Posteriormente, se desarrolla la etapa de negociación, seguida del cierre de la venta. Finalmente, se incluyen las acciones de posventa y relaciones de largo plazo (ALP), que permiten mantener la fidelización del cliente y generar referidos, lo cual retroalimenta nuevamente el ciclo."/>
                     <pic:cNvPicPr/>
                   </pic:nvPicPr>
                   <pic:blipFill>
@@ -4882,7 +5033,19 @@
         <w:rPr>
           <w:rFonts w:cstheme="minorHAnsi"/>
         </w:rPr>
-        <w:t>Nota. Adaptada de Hair et al.(2010).</w:t>
+        <w:t>Nota. Adaptada de Hair et al.</w:t>
+      </w:r>
+      <w:r>
+        <w:rPr>
+          <w:rFonts w:cstheme="minorHAnsi"/>
+        </w:rPr>
+        <w:t xml:space="preserve"> </w:t>
+      </w:r>
+      <w:r>
+        <w:rPr>
+          <w:rFonts w:cstheme="minorHAnsi"/>
+        </w:rPr>
+        <w:t>(2010).</w:t>
       </w:r>
     </w:p>
     <w:p>
@@ -6077,7 +6240,7 @@
                 <w:sz w:val="28"/>
                 <w:szCs w:val="28"/>
               </w:rPr>
-              <w:t>El vendedor envía la mercancía</w:t>
+              <w:t>El comprador paga la mercancía</w:t>
             </w:r>
           </w:p>
         </w:tc>
@@ -6427,10 +6590,121 @@
           </w:p>
         </w:tc>
       </w:tr>
+      <w:tr>
+        <w:tc>
+          <w:tcPr>
+            <w:tcW w:w="2405" w:type="dxa"/>
+          </w:tcPr>
+          <w:p>
+            <w:pPr>
+              <w:pStyle w:val="Tablas"/>
+              <w:rPr>
+                <w:rFonts w:asciiTheme="minorHAnsi" w:hAnsiTheme="minorHAnsi" w:cstheme="minorHAnsi"/>
+                <w:bCs w:val="0"/>
+                <w:color w:val="000000" w:themeColor="text1"/>
+                <w:sz w:val="28"/>
+                <w:szCs w:val="28"/>
+              </w:rPr>
+            </w:pPr>
+            <w:r>
+              <w:rPr>
+                <w:rFonts w:asciiTheme="minorHAnsi" w:hAnsiTheme="minorHAnsi" w:cstheme="minorHAnsi"/>
+                <w:bCs w:val="0"/>
+                <w:color w:val="000000" w:themeColor="text1"/>
+                <w:sz w:val="28"/>
+                <w:szCs w:val="28"/>
+              </w:rPr>
+              <w:t>El vendedor liquida el IVA</w:t>
+            </w:r>
+          </w:p>
+        </w:tc>
+        <w:tc>
+          <w:tcPr>
+            <w:tcW w:w="2830" w:type="dxa"/>
+          </w:tcPr>
+          <w:p>
+            <w:pPr>
+              <w:pStyle w:val="Tablas"/>
+              <w:rPr>
+                <w:rFonts w:asciiTheme="minorHAnsi" w:hAnsiTheme="minorHAnsi" w:cstheme="minorHAnsi"/>
+                <w:bCs w:val="0"/>
+                <w:color w:val="000000" w:themeColor="text1"/>
+                <w:sz w:val="28"/>
+                <w:szCs w:val="28"/>
+              </w:rPr>
+            </w:pPr>
+            <w:r>
+              <w:rPr>
+                <w:rFonts w:asciiTheme="minorHAnsi" w:hAnsiTheme="minorHAnsi" w:cstheme="minorHAnsi"/>
+                <w:bCs w:val="0"/>
+                <w:color w:val="000000" w:themeColor="text1"/>
+                <w:sz w:val="28"/>
+                <w:szCs w:val="28"/>
+              </w:rPr>
+              <w:t>Liquidaciones de IVA</w:t>
+            </w:r>
+          </w:p>
+        </w:tc>
+        <w:tc>
+          <w:tcPr>
+            <w:tcW w:w="1729" w:type="dxa"/>
+          </w:tcPr>
+          <w:p>
+            <w:pPr>
+              <w:pStyle w:val="Tablas"/>
+              <w:rPr>
+                <w:rFonts w:asciiTheme="minorHAnsi" w:hAnsiTheme="minorHAnsi" w:cstheme="minorHAnsi"/>
+                <w:bCs w:val="0"/>
+                <w:color w:val="000000" w:themeColor="text1"/>
+                <w:sz w:val="28"/>
+                <w:szCs w:val="28"/>
+              </w:rPr>
+            </w:pPr>
+            <w:r>
+              <w:rPr>
+                <w:rFonts w:asciiTheme="minorHAnsi" w:hAnsiTheme="minorHAnsi" w:cstheme="minorHAnsi"/>
+                <w:bCs w:val="0"/>
+                <w:color w:val="000000" w:themeColor="text1"/>
+                <w:sz w:val="28"/>
+                <w:szCs w:val="28"/>
+              </w:rPr>
+              <w:t>Vendedor</w:t>
+            </w:r>
+          </w:p>
+        </w:tc>
+        <w:tc>
+          <w:tcPr>
+            <w:tcW w:w="2998" w:type="dxa"/>
+          </w:tcPr>
+          <w:p>
+            <w:pPr>
+              <w:pStyle w:val="Tablas"/>
+              <w:rPr>
+                <w:rFonts w:asciiTheme="minorHAnsi" w:hAnsiTheme="minorHAnsi" w:cstheme="minorHAnsi"/>
+                <w:bCs w:val="0"/>
+                <w:color w:val="000000" w:themeColor="text1"/>
+                <w:sz w:val="28"/>
+                <w:szCs w:val="28"/>
+              </w:rPr>
+            </w:pPr>
+            <w:r>
+              <w:rPr>
+                <w:rFonts w:asciiTheme="minorHAnsi" w:hAnsiTheme="minorHAnsi" w:cstheme="minorHAnsi"/>
+                <w:bCs w:val="0"/>
+                <w:color w:val="000000" w:themeColor="text1"/>
+                <w:sz w:val="28"/>
+                <w:szCs w:val="28"/>
+              </w:rPr>
+              <w:t>Hacienda pública</w:t>
+            </w:r>
+          </w:p>
+        </w:tc>
+      </w:tr>
     </w:tbl>
     <w:p>
       <w:pPr>
         <w:spacing w:before="0" w:after="0"/>
+        <w:ind w:firstLine="0"/>
         <w:rPr>
           <w:rFonts w:cstheme="minorHAnsi"/>
         </w:rPr>
@@ -6441,14 +6715,12 @@
         </w:rPr>
         <w:t>Nota. Tomada de Lobato et al. (2010)</w:t>
       </w:r>
-    </w:p>
-    <w:p>
-      <w:pPr>
-        <w:spacing w:before="0" w:after="0"/>
-        <w:rPr>
-          <w:rFonts w:cstheme="minorHAnsi"/>
-        </w:rPr>
-      </w:pPr>
+      <w:r>
+        <w:rPr>
+          <w:rFonts w:cstheme="minorHAnsi"/>
+        </w:rPr>
+        <w:t>.</w:t>
+      </w:r>
     </w:p>
     <w:p>
       <w:pPr>
@@ -6484,13 +6756,17 @@
         <w:spacing w:before="0" w:after="0"/>
         <w:rPr>
           <w:rFonts w:cstheme="minorHAnsi"/>
-        </w:rPr>
-      </w:pPr>
-      <w:r>
-        <w:rPr>
-          <w:rFonts w:cstheme="minorHAnsi"/>
-        </w:rPr>
-        <w:t>De contado:</w:t>
+          <w:b/>
+          <w:bCs/>
+        </w:rPr>
+      </w:pPr>
+      <w:r>
+        <w:rPr>
+          <w:rFonts w:cstheme="minorHAnsi"/>
+          <w:b/>
+          <w:bCs/>
+        </w:rPr>
+        <w:t>Su importancia radica en que:</w:t>
       </w:r>
     </w:p>
     <w:p>
@@ -6846,7 +7122,23 @@
           <w:b/>
           <w:bCs/>
         </w:rPr>
-        <w:t>Elemento de la comunicación</w:t>
+        <w:t>Elemento</w:t>
+      </w:r>
+      <w:r>
+        <w:rPr>
+          <w:rFonts w:cstheme="minorHAnsi"/>
+          <w:b/>
+          <w:bCs/>
+        </w:rPr>
+        <w:t>s</w:t>
+      </w:r>
+      <w:r>
+        <w:rPr>
+          <w:rFonts w:cstheme="minorHAnsi"/>
+          <w:b/>
+          <w:bCs/>
+        </w:rPr>
+        <w:t xml:space="preserve"> de la comunicación</w:t>
       </w:r>
     </w:p>
     <w:p>
@@ -7255,7 +7547,33 @@
         <w:rPr>
           <w:rFonts w:cstheme="minorHAnsi"/>
         </w:rPr>
-        <w:t xml:space="preserve"> presentaciones, videos promocionales, podcasts, infografías.</w:t>
+        <w:t xml:space="preserve"> presentaciones, videos promocionales, </w:t>
+      </w:r>
+      <w:proofErr w:type="spellStart"/>
+      <w:r>
+        <w:rPr>
+          <w:rFonts w:cstheme="minorHAnsi"/>
+        </w:rPr>
+        <w:t>p</w:t>
+      </w:r>
+      <w:r>
+        <w:rPr>
+          <w:rFonts w:cstheme="minorHAnsi"/>
+        </w:rPr>
+        <w:t>ó</w:t>
+      </w:r>
+      <w:r>
+        <w:rPr>
+          <w:rFonts w:cstheme="minorHAnsi"/>
+        </w:rPr>
+        <w:t>dcasts</w:t>
+      </w:r>
+      <w:proofErr w:type="spellEnd"/>
+      <w:r>
+        <w:rPr>
+          <w:rFonts w:cstheme="minorHAnsi"/>
+        </w:rPr>
+        <w:t>, infografías.</w:t>
       </w:r>
     </w:p>
     <w:p>
@@ -7548,7 +7866,37 @@
         <w:rPr>
           <w:rFonts w:cstheme="minorHAnsi"/>
         </w:rPr>
-        <w:t>Estos son instrumentos utilizados por la empresa o la organización para dar a conocer sus mensajes, información y su información publicitaria, entre otros. La empresa utiliza estos medios de manera masiva utilizando medios off-line u on-line.</w:t>
+        <w:t>Estos son instrumentos utilizados por la empresa o la organización para dar a conocer sus mensajes, información y su contenido publicitario, entre otros.</w:t>
+      </w:r>
+      <w:r>
+        <w:rPr>
+          <w:rFonts w:cstheme="minorHAnsi"/>
+        </w:rPr>
+        <w:t xml:space="preserve"> La empresa utiliza estos medios de manera masiva utilizando medios </w:t>
+      </w:r>
+      <w:r>
+        <w:rPr>
+          <w:rStyle w:val="Extranjerismo"/>
+        </w:rPr>
+        <w:t>off-line</w:t>
+      </w:r>
+      <w:r>
+        <w:rPr>
+          <w:rFonts w:cstheme="minorHAnsi"/>
+        </w:rPr>
+        <w:t xml:space="preserve"> u </w:t>
+      </w:r>
+      <w:r>
+        <w:rPr>
+          <w:rStyle w:val="Extranjerismo"/>
+        </w:rPr>
+        <w:t>on-line</w:t>
+      </w:r>
+      <w:r>
+        <w:rPr>
+          <w:rFonts w:cstheme="minorHAnsi"/>
+        </w:rPr>
+        <w:t>.</w:t>
       </w:r>
     </w:p>
     <w:p>
@@ -8205,12 +8553,11 @@
         <w:rPr>
           <w:rFonts w:cstheme="minorHAnsi"/>
         </w:rPr>
-        <w:t xml:space="preserve">“El </w:t>
+        <w:t>“El </w:t>
       </w:r>
       <w:r>
         <w:rPr>
           <w:rStyle w:val="Extranjerismo"/>
-          <w:rFonts w:cstheme="minorHAnsi"/>
         </w:rPr>
         <w:t>merchandising</w:t>
       </w:r>
@@ -8218,20 +8565,19 @@
         <w:rPr>
           <w:rFonts w:cstheme="minorHAnsi"/>
         </w:rPr>
-        <w:t xml:space="preserve"> es la implantación y el control necesario para la comercialización de bienes y servicios, en los lugares, en los momentos, en los precios en las cantidades susceptibles de facilitar la consecución de los objetivos de </w:t>
+        <w:t> es la implantación y el control necesario para la comercialización de bienes y servicios, en los lugares, en los momentos, en los precios y en las cantidades susceptibles de facilitar la consecución de los objetivos de </w:t>
       </w:r>
       <w:r>
         <w:rPr>
           <w:rStyle w:val="Extranjerismo"/>
-          <w:rFonts w:cstheme="minorHAnsi"/>
-        </w:rPr>
-        <w:t>marketing</w:t>
-      </w:r>
-      <w:r>
-        <w:rPr>
-          <w:rFonts w:cstheme="minorHAnsi"/>
-        </w:rPr>
-        <w:t xml:space="preserve"> de la empresa”. (Fernández y Pastor, 2007).</w:t>
+        </w:rPr>
+        <w:t>marketing </w:t>
+      </w:r>
+      <w:r>
+        <w:rPr>
+          <w:rFonts w:cstheme="minorHAnsi"/>
+        </w:rPr>
+        <w:t>de la empresa”. (Fernández y Pastor, 2007).</w:t>
       </w:r>
     </w:p>
     <w:p>
@@ -8330,7 +8676,19 @@
         <w:rPr>
           <w:rFonts w:cstheme="minorHAnsi"/>
         </w:rPr>
-        <w:t xml:space="preserve"> aplicada y desarrollada a fabricantes y distribuidores dirigida a estimular el deseo y producir la compra. Ahora bien, desde la perspectiva de la comunicación visual, el </w:t>
+        <w:t xml:space="preserve"> aplicada y desarrollada </w:t>
+      </w:r>
+      <w:r>
+        <w:rPr>
+          <w:rFonts w:cstheme="minorHAnsi"/>
+        </w:rPr>
+        <w:t>por</w:t>
+      </w:r>
+      <w:r>
+        <w:rPr>
+          <w:rFonts w:cstheme="minorHAnsi"/>
+        </w:rPr>
+        <w:t xml:space="preserve"> fabricantes y distribuidores dirigida a estimular el deseo y producir la compra. Ahora bien, desde la perspectiva de la comunicación visual, el </w:t>
       </w:r>
       <w:r>
         <w:rPr>
@@ -8379,19 +8737,11 @@
           <w:rFonts w:cstheme="minorHAnsi"/>
         </w:rPr>
       </w:pPr>
-    </w:p>
-    <w:p>
-      <w:pPr>
-        <w:spacing w:before="0" w:after="0"/>
-        <w:rPr>
-          <w:rFonts w:cstheme="minorHAnsi"/>
-        </w:rPr>
-      </w:pPr>
-      <w:r>
-        <w:rPr>
-          <w:rFonts w:cstheme="minorHAnsi"/>
-        </w:rPr>
-        <w:t>No obstante, esta técnica comercial comenzó con el surgimiento de los puntos de ventas modernos, en los que se aplicaban diversas acciones de visualización de los productos para potenciar la mercadería, así como la rápida rotación de inventarios. De esta manera, se destacan los siguientes hitos:</w:t>
+      <w:r>
+        <w:rPr>
+          <w:rFonts w:cstheme="minorHAnsi"/>
+        </w:rPr>
+        <w:t>No obstante, esta técnica comercial comenzó con el surgimiento de los puntos de venta modernos, en los que se aplicaban diversas acciones de visualización de los productos para potenciar la mercadería, así como la rápida rotación de inventarios. De esta manera, se destacan los siguientes hitos:</w:t>
       </w:r>
     </w:p>
     <w:p>
@@ -8507,28 +8857,16 @@
         <w:rPr>
           <w:rFonts w:cstheme="minorHAnsi"/>
         </w:rPr>
-        <w:t>Origen de los almacenes populares en los EE.UU.</w:t>
-      </w:r>
-    </w:p>
-    <w:p>
-      <w:pPr>
-        <w:pStyle w:val="Prrafodelista"/>
-        <w:spacing w:before="0" w:after="0"/>
-        <w:ind w:left="1429" w:firstLine="0"/>
-        <w:rPr>
-          <w:rFonts w:cstheme="minorHAnsi"/>
-        </w:rPr>
-      </w:pPr>
-    </w:p>
-    <w:p>
-      <w:pPr>
-        <w:pStyle w:val="Prrafodelista"/>
-        <w:spacing w:before="0" w:after="0"/>
-        <w:ind w:left="1429" w:firstLine="0"/>
-        <w:rPr>
-          <w:rFonts w:cstheme="minorHAnsi"/>
-        </w:rPr>
-      </w:pPr>
+        <w:t xml:space="preserve">Origen de los almacenes populares en los </w:t>
+      </w:r>
+      <w:proofErr w:type="gramStart"/>
+      <w:r>
+        <w:rPr>
+          <w:rFonts w:cstheme="minorHAnsi"/>
+        </w:rPr>
+        <w:t>EE.UU.</w:t>
+      </w:r>
+      <w:proofErr w:type="gramEnd"/>
     </w:p>
     <w:p>
       <w:pPr>
@@ -8550,7 +8888,6 @@
           <w:b/>
           <w:bCs/>
         </w:rPr>
-        <w:lastRenderedPageBreak/>
         <w:t>1920</w:t>
       </w:r>
     </w:p>
@@ -8590,6 +8927,7 @@
           <w:b/>
           <w:bCs/>
         </w:rPr>
+        <w:lastRenderedPageBreak/>
         <w:t>1930</w:t>
       </w:r>
     </w:p>
@@ -8606,8 +8944,16 @@
         <w:rPr>
           <w:rFonts w:cstheme="minorHAnsi"/>
         </w:rPr>
-        <w:t>Nacimiento de los supermercados en los EE.UU.</w:t>
-      </w:r>
+        <w:t xml:space="preserve">Nacimiento de los supermercados en los </w:t>
+      </w:r>
+      <w:proofErr w:type="gramStart"/>
+      <w:r>
+        <w:rPr>
+          <w:rFonts w:cstheme="minorHAnsi"/>
+        </w:rPr>
+        <w:t>EE.UU.</w:t>
+      </w:r>
+      <w:proofErr w:type="gramEnd"/>
     </w:p>
     <w:p>
       <w:pPr>
@@ -8813,7 +9159,19 @@
         <w:rPr>
           <w:rFonts w:cstheme="minorHAnsi"/>
         </w:rPr>
-        <w:t>Hoy día, se puede decir que el escaparate o exhibidor es el principal vendedor del producto en el punto de venta, porque logra que el cliente se detenga y le motive diferentes percepciones, haciendo que más personas ingresen al punto de venta.</w:t>
+        <w:t xml:space="preserve">Hoy </w:t>
+      </w:r>
+      <w:r>
+        <w:rPr>
+          <w:rFonts w:cstheme="minorHAnsi"/>
+        </w:rPr>
+        <w:t xml:space="preserve">en </w:t>
+      </w:r>
+      <w:r>
+        <w:rPr>
+          <w:rFonts w:cstheme="minorHAnsi"/>
+        </w:rPr>
+        <w:t>día, se puede decir que el escaparate o exhibidor es el principal vendedor del producto en el punto de venta, porque logra que el cliente se detenga y le motive diferentes percepciones, haciendo que más personas ingresen al punto de venta.</w:t>
       </w:r>
     </w:p>
     <w:p>
@@ -8849,7 +9207,46 @@
         <w:rPr>
           <w:rFonts w:cstheme="minorHAnsi"/>
         </w:rPr>
-        <w:t>, como parte del proceso de comunicación, presenta la interacción entre dos elementos básicos, el punto de venta, la marca o el comerciante, con el cliente o comprador. Se ha convertido en una parte fundamental activa y dinámica de la estrategia de la empresa, en el que se tienen los siguientes alcances:</w:t>
+        <w:t xml:space="preserve">, como parte del proceso de comunicación, presenta la interacción entre dos elementos básicos, el punto de venta, la marca o el comerciante, con el cliente o comprador. Se ha convertido en una parte fundamental activa y dinámica de la estrategia de la empresa, en </w:t>
+      </w:r>
+      <w:r>
+        <w:rPr>
+          <w:rFonts w:cstheme="minorHAnsi"/>
+        </w:rPr>
+        <w:t>la</w:t>
+      </w:r>
+      <w:r>
+        <w:rPr>
+          <w:rFonts w:cstheme="minorHAnsi"/>
+        </w:rPr>
+        <w:t xml:space="preserve"> que se tienen los siguientes alcances:</w:t>
+      </w:r>
+    </w:p>
+    <w:p>
+      <w:pPr>
+        <w:spacing w:before="0" w:after="0"/>
+        <w:rPr>
+          <w:rFonts w:cstheme="minorHAnsi"/>
+        </w:rPr>
+      </w:pPr>
+      <w:r>
+        <w:rPr>
+          <w:rFonts w:cstheme="minorHAnsi"/>
+        </w:rPr>
+        <w:t xml:space="preserve">El </w:t>
+      </w:r>
+      <w:r>
+        <w:rPr>
+          <w:rStyle w:val="Extranjerismo"/>
+          <w:rFonts w:cstheme="minorHAnsi"/>
+        </w:rPr>
+        <w:t>merchandising</w:t>
+      </w:r>
+      <w:r>
+        <w:rPr>
+          <w:rFonts w:cstheme="minorHAnsi"/>
+        </w:rPr>
+        <w:t xml:space="preserve"> busca atraer, informar y persuadir al consumidor en el lugar de compra, convirtiendo la exhibición en una herramienta estratégica para fortalecer la relación entre producto, marca y cliente.</w:t>
       </w:r>
     </w:p>
     <w:p>
@@ -8864,33 +9261,6 @@
           <w:rFonts w:cstheme="minorHAnsi"/>
         </w:rPr>
         <w:lastRenderedPageBreak/>
-        <w:t xml:space="preserve">El </w:t>
-      </w:r>
-      <w:r>
-        <w:rPr>
-          <w:rStyle w:val="Extranjerismo"/>
-          <w:rFonts w:cstheme="minorHAnsi"/>
-        </w:rPr>
-        <w:t>merchandising</w:t>
-      </w:r>
-      <w:r>
-        <w:rPr>
-          <w:rFonts w:cstheme="minorHAnsi"/>
-        </w:rPr>
-        <w:t xml:space="preserve"> busca atraer, informar y persuadir al consumidor en el lugar de compra, convirtiendo la exhibición en una herramienta estratégica para fortalecer la relación entre producto, marca y cliente.</w:t>
-      </w:r>
-    </w:p>
-    <w:p>
-      <w:pPr>
-        <w:spacing w:before="0" w:after="0"/>
-        <w:rPr>
-          <w:rFonts w:cstheme="minorHAnsi"/>
-        </w:rPr>
-      </w:pPr>
-      <w:r>
-        <w:rPr>
-          <w:rFonts w:cstheme="minorHAnsi"/>
-        </w:rPr>
         <w:t xml:space="preserve">Los objetivos del </w:t>
       </w:r>
       <w:r>
@@ -9268,7 +9638,6 @@
           <w:b/>
           <w:bCs/>
         </w:rPr>
-        <w:lastRenderedPageBreak/>
         <w:t>Incrementar la rentabilidad del espacio</w:t>
       </w:r>
     </w:p>
@@ -9326,17 +9695,6 @@
     </w:p>
     <w:p>
       <w:pPr>
-        <w:spacing w:before="0" w:after="0"/>
-        <w:ind w:firstLine="0"/>
-        <w:rPr>
-          <w:rFonts w:cstheme="minorHAnsi"/>
-          <w:b/>
-          <w:bCs/>
-        </w:rPr>
-      </w:pPr>
-    </w:p>
-    <w:p>
-      <w:pPr>
         <w:pStyle w:val="Prrafodelista"/>
         <w:numPr>
           <w:ilvl w:val="0"/>
@@ -9355,6 +9713,7 @@
           <w:b/>
           <w:bCs/>
         </w:rPr>
+        <w:lastRenderedPageBreak/>
         <w:t xml:space="preserve">Funciones del </w:t>
       </w:r>
       <w:r>
@@ -9437,11 +9796,19 @@
           <w:rFonts w:cstheme="minorHAnsi"/>
         </w:rPr>
       </w:pPr>
-      <w:r>
-        <w:rPr>
-          <w:rFonts w:cstheme="minorHAnsi"/>
-        </w:rPr>
-        <w:t>Destacar el producto frente a la competencia en la vitrina o estantería.</w:t>
+      <w:proofErr w:type="gramStart"/>
+      <w:r>
+        <w:rPr>
+          <w:rFonts w:cstheme="minorHAnsi"/>
+        </w:rPr>
+        <w:t>Destacar</w:t>
+      </w:r>
+      <w:proofErr w:type="gramEnd"/>
+      <w:r>
+        <w:rPr>
+          <w:rFonts w:cstheme="minorHAnsi"/>
+        </w:rPr>
+        <w:t xml:space="preserve"> el producto frente a la competencia en la vitrina o estantería.</w:t>
       </w:r>
     </w:p>
     <w:p>
@@ -9574,7 +9941,16 @@
           <w:bCs/>
           <w:lang w:val="es-CO"/>
         </w:rPr>
-        <w:t>Merchandising</w:t>
+        <w:t>m</w:t>
+      </w:r>
+      <w:r>
+        <w:rPr>
+          <w:rStyle w:val="Extranjerismo"/>
+          <w:b/>
+          <w:bCs/>
+          <w:lang w:val="es-CO"/>
+        </w:rPr>
+        <w:t>erchandising</w:t>
       </w:r>
     </w:p>
     <w:p>
@@ -9613,58 +9989,64 @@
         <w:rPr>
           <w:rFonts w:cstheme="minorHAnsi"/>
         </w:rPr>
-        <w:t xml:space="preserve">: de </w:t>
-      </w:r>
-      <w:r>
-        <w:rPr>
-          <w:rFonts w:cstheme="minorHAnsi"/>
+        <w:t>: de nacimiento, de ataque, de mantenimiento y de defensa; cada uno conlleva unas actividades relacionadas con el producto, así:</w:t>
+      </w:r>
+    </w:p>
+    <w:p>
+      <w:pPr>
+        <w:spacing w:before="0" w:after="0"/>
+        <w:ind w:left="359" w:firstLine="350"/>
+        <w:rPr>
+          <w:rFonts w:cstheme="minorHAnsi"/>
+        </w:rPr>
+      </w:pPr>
+      <w:r>
+        <w:rPr>
+          <w:rFonts w:cstheme="minorHAnsi"/>
+        </w:rPr>
+        <w:t xml:space="preserve">El </w:t>
+      </w:r>
+      <w:r>
+        <w:rPr>
+          <w:rStyle w:val="Extranjerismo"/>
+        </w:rPr>
+        <w:t>merchandising</w:t>
+      </w:r>
+      <w:r>
+        <w:rPr>
+          <w:rFonts w:cstheme="minorHAnsi"/>
+        </w:rPr>
+        <w:t xml:space="preserve"> como herramienta estratégica dentro del ámbito comercial, se compone de dos enfoques principales: </w:t>
+      </w:r>
+      <w:r>
+        <w:rPr>
+          <w:rStyle w:val="Extranjerismo"/>
+        </w:rPr>
+        <w:t>merchandising</w:t>
+      </w:r>
+      <w:r>
+        <w:rPr>
+          <w:rFonts w:cstheme="minorHAnsi"/>
+        </w:rPr>
+        <w:t xml:space="preserve"> </w:t>
+      </w:r>
+      <w:r>
+        <w:rPr>
+          <w:rStyle w:val="Extranjerismo"/>
+        </w:rPr>
+        <w:t>visual</w:t>
+      </w:r>
+      <w:r>
+        <w:rPr>
+          <w:rFonts w:cstheme="minorHAnsi"/>
+        </w:rPr>
+        <w:t xml:space="preserve"> y </w:t>
+      </w:r>
+      <w:r>
+        <w:rPr>
+          <w:rStyle w:val="Extranjerismo"/>
         </w:rPr>
         <w:lastRenderedPageBreak/>
-        <w:t>nacimiento, de ataque, de mantenimiento y de defensa; cada uno conlleva unas actividades relacionadas con el producto, así:</w:t>
-      </w:r>
-    </w:p>
-    <w:p>
-      <w:pPr>
-        <w:spacing w:before="0" w:after="0"/>
-        <w:ind w:left="359" w:firstLine="350"/>
-        <w:rPr>
-          <w:rFonts w:cstheme="minorHAnsi"/>
-        </w:rPr>
-      </w:pPr>
-      <w:r>
-        <w:rPr>
-          <w:rFonts w:cstheme="minorHAnsi"/>
-        </w:rPr>
-        <w:t xml:space="preserve">El </w:t>
-      </w:r>
-      <w:r>
-        <w:rPr>
-          <w:rStyle w:val="Extranjerismo"/>
-        </w:rPr>
-        <w:t>merchandising</w:t>
-      </w:r>
-      <w:r>
-        <w:rPr>
-          <w:rFonts w:cstheme="minorHAnsi"/>
-        </w:rPr>
-        <w:t xml:space="preserve"> como herramienta estratégica dentro del ámbito comercial, se compone de dos enfoques principales: </w:t>
-      </w:r>
-      <w:r>
-        <w:rPr>
-          <w:rStyle w:val="Extranjerismo"/>
-        </w:rPr>
-        <w:t>merchandising</w:t>
-      </w:r>
-      <w:r>
-        <w:rPr>
-          <w:rFonts w:cstheme="minorHAnsi"/>
-        </w:rPr>
-        <w:t xml:space="preserve"> visual y </w:t>
-      </w:r>
-      <w:r>
-        <w:rPr>
-          <w:rStyle w:val="Extranjerismo"/>
-        </w:rPr>
         <w:t>merchandising</w:t>
       </w:r>
       <w:r>
@@ -9773,8 +10155,8 @@
             </w:r>
             <w:r>
               <w:rPr>
-                <w:rFonts w:asciiTheme="minorHAnsi" w:hAnsiTheme="minorHAnsi" w:cstheme="minorHAnsi"/>
-                <w:color w:val="auto"/>
+                <w:rStyle w:val="Extranjerismo"/>
+                <w:rFonts w:ascii="Calibri" w:hAnsi="Calibri" w:cs="Calibri"/>
                 <w:sz w:val="28"/>
                 <w:szCs w:val="28"/>
               </w:rPr>
@@ -10150,7 +10532,6 @@
                 <w:sz w:val="28"/>
                 <w:szCs w:val="28"/>
               </w:rPr>
-              <w:lastRenderedPageBreak/>
               <w:t>Factores clave</w:t>
             </w:r>
           </w:p>
@@ -10236,6 +10617,7 @@
                 <w:sz w:val="28"/>
                 <w:szCs w:val="28"/>
               </w:rPr>
+              <w:lastRenderedPageBreak/>
               <w:t>Procesos implicados</w:t>
             </w:r>
           </w:p>
@@ -10501,7 +10883,15 @@
           <w:b/>
           <w:bCs/>
         </w:rPr>
-        <w:t> visual</w:t>
+        <w:t> </w:t>
+      </w:r>
+      <w:r>
+        <w:rPr>
+          <w:rStyle w:val="Extranjerismo"/>
+          <w:b/>
+          <w:bCs/>
+        </w:rPr>
+        <w:t>visual</w:t>
       </w:r>
     </w:p>
     <w:p>
@@ -10520,17 +10910,55 @@
       <w:r>
         <w:rPr>
           <w:rStyle w:val="Extranjerismo"/>
-          <w:rFonts w:cstheme="minorHAnsi"/>
-          <w:lang w:val="es-CO"/>
-        </w:rPr>
-        <w:t>merchandising</w:t>
-      </w:r>
-      <w:r>
-        <w:rPr>
-          <w:rFonts w:cstheme="minorHAnsi"/>
-        </w:rPr>
-        <w:t> visual aprovecha la ubicación, el recorrido y la distribución del producto en el punto de venta para motivar la venta, sea irracional (impulsiva) o racional (reflexiva). Un buen diseño del espacio permite exhibir el producto estratégicamente para que siempre esté al alcance del cliente para que cumpla un propósito en la decisión de compra.</w:t>
-      </w:r>
+        </w:rPr>
+        <w:t>merchandising </w:t>
+      </w:r>
+      <w:r>
+        <w:rPr>
+          <w:rFonts w:cstheme="minorHAnsi"/>
+        </w:rPr>
+        <w:t>visual aprovecha la ubicación, el recorrido y la distribución del producto en el punto de venta para motivar la venta, sea irracional (impulsiva) o racional (reflexiva). Un buen diseño del espacio permite exhibir el producto estratégicamente para que siempre esté al alcance del cliente y cumpla un propósito en la decisión de compra.</w:t>
+      </w:r>
+    </w:p>
+    <w:p>
+      <w:pPr>
+        <w:spacing w:before="0" w:after="0"/>
+        <w:rPr>
+          <w:rFonts w:cstheme="minorHAnsi"/>
+        </w:rPr>
+      </w:pPr>
+    </w:p>
+    <w:p>
+      <w:pPr>
+        <w:spacing w:before="0" w:after="0"/>
+        <w:rPr>
+          <w:rFonts w:cstheme="minorHAnsi"/>
+        </w:rPr>
+      </w:pPr>
+    </w:p>
+    <w:p>
+      <w:pPr>
+        <w:spacing w:before="0" w:after="0"/>
+        <w:rPr>
+          <w:rFonts w:cstheme="minorHAnsi"/>
+        </w:rPr>
+      </w:pPr>
+    </w:p>
+    <w:p>
+      <w:pPr>
+        <w:spacing w:before="0" w:after="0"/>
+        <w:rPr>
+          <w:rFonts w:cstheme="minorHAnsi"/>
+        </w:rPr>
+      </w:pPr>
+    </w:p>
+    <w:p>
+      <w:pPr>
+        <w:spacing w:before="0" w:after="0"/>
+        <w:rPr>
+          <w:rFonts w:cstheme="minorHAnsi"/>
+        </w:rPr>
+      </w:pPr>
     </w:p>
     <w:p>
       <w:pPr>
@@ -10576,7 +11004,13 @@
         <w:rPr>
           <w:lang w:val="en-US"/>
         </w:rPr>
-        <w:t> visual</w:t>
+        <w:t> </w:t>
+      </w:r>
+      <w:r>
+        <w:rPr>
+          <w:rStyle w:val="Extranjerismo"/>
+        </w:rPr>
+        <w:t>visual</w:t>
       </w:r>
     </w:p>
     <w:p>
@@ -10594,10 +11028,10 @@
           <w:noProof/>
         </w:rPr>
         <w:drawing>
-          <wp:inline distT="0" distB="0" distL="0" distR="0" wp14:anchorId="3580D38C" wp14:editId="5269670E">
+          <wp:inline distT="0" distB="0" distL="0" distR="0" wp14:anchorId="6A422575" wp14:editId="09F9A304">
             <wp:extent cx="4680000" cy="2608448"/>
             <wp:effectExtent l="0" t="0" r="6350" b="1905"/>
-            <wp:docPr id="134790368" name="Gráfico 25" descr="La imagen presenta una estantería y sus diferentes zonas, en relación con el merchandising visual y su importancia en la ubicación de los productos para motivar la venta. Se identifican 3 zonas en diferentes colores, así: - Color violeta: zona caliente - ojos. Los productos que más se quieren vender. - Color amarillo: zona media - centro. Los productos nuevos. - Color azul: zona fría - suelo. Los productos de buena rotación, que el cliente tiene referenciados y no se necesitan mostrar."/>
+            <wp:docPr id="1579452008" name="Gráfico 5" descr="La imagen presenta una estantería y sus diferentes zonas, en relación con el merchandising visual y su importancia en la ubicación de los productos para motivar la venta. Se identifican 3 zonas en diferentes colores, así: - Color verde: zona caliente - ojos. Los productos que más se quieren vender.- Color amarillo: zona media - centro. Los productos nuevos. - Color azul: zona fría - suelo. Los productos de buena rotación, que el cliente tiene referenciados y no se necesitan mostrar."/>
             <wp:cNvGraphicFramePr>
               <a:graphicFrameLocks xmlns:a="http://schemas.openxmlformats.org/drawingml/2006/main" noChangeAspect="1"/>
             </wp:cNvGraphicFramePr>
@@ -10605,7 +11039,7 @@
               <a:graphicData uri="http://schemas.openxmlformats.org/drawingml/2006/picture">
                 <pic:pic xmlns:pic="http://schemas.openxmlformats.org/drawingml/2006/picture">
                   <pic:nvPicPr>
-                    <pic:cNvPr id="134790368" name="Gráfico 25" descr="La imagen presenta una estantería y sus diferentes zonas, en relación con el merchandising visual y su importancia en la ubicación de los productos para motivar la venta. Se identifican 3 zonas en diferentes colores, así: - Color violeta: zona caliente - ojos. Los productos que más se quieren vender. - Color amarillo: zona media - centro. Los productos nuevos. - Color azul: zona fría - suelo. Los productos de buena rotación, que el cliente tiene referenciados y no se necesitan mostrar."/>
+                    <pic:cNvPr id="1579452008" name="Gráfico 5" descr="La imagen presenta una estantería y sus diferentes zonas, en relación con el merchandising visual y su importancia en la ubicación de los productos para motivar la venta. Se identifican 3 zonas en diferentes colores, así: - Color verde: zona caliente - ojos. Los productos que más se quieren vender.- Color amarillo: zona media - centro. Los productos nuevos. - Color azul: zona fría - suelo. Los productos de buena rotación, que el cliente tiene referenciados y no se necesitan mostrar."/>
                     <pic:cNvPicPr/>
                   </pic:nvPicPr>
                   <pic:blipFill>
@@ -10684,7 +11118,19 @@
         <w:rPr>
           <w:rFonts w:cstheme="minorHAnsi"/>
         </w:rPr>
-        <w:t xml:space="preserve"> visual también se tienen en cuenta factores como la decoración del establecimiento, las áreas de exposición, tamaño, iluminación, entre otros.</w:t>
+        <w:t xml:space="preserve"> </w:t>
+      </w:r>
+      <w:r>
+        <w:rPr>
+          <w:rStyle w:val="Extranjerismo"/>
+        </w:rPr>
+        <w:t>visual</w:t>
+      </w:r>
+      <w:r>
+        <w:rPr>
+          <w:rFonts w:cstheme="minorHAnsi"/>
+        </w:rPr>
+        <w:t xml:space="preserve"> también se tienen en cuenta factores como la decoración del establecimiento, las áreas de exposición, tamaño, iluminación, entre otros.</w:t>
       </w:r>
     </w:p>
     <w:p>
@@ -10741,7 +11187,19 @@
         <w:rPr>
           <w:rFonts w:cstheme="minorHAnsi"/>
         </w:rPr>
-        <w:t> de gestión porque soporta las decisiones basado en cuatro áreas fundamentales: estudio del mercado, gestión del espacio, gestión del surtido y la comunicación en el punto de venta. Este tipo de </w:t>
+        <w:t> de gestión porque soporta las decisiones basad</w:t>
+      </w:r>
+      <w:r>
+        <w:rPr>
+          <w:rFonts w:cstheme="minorHAnsi"/>
+        </w:rPr>
+        <w:t>as</w:t>
+      </w:r>
+      <w:r>
+        <w:rPr>
+          <w:rFonts w:cstheme="minorHAnsi"/>
+        </w:rPr>
+        <w:t xml:space="preserve"> en cuatro áreas fundamentales: estudio del mercado, gestión del espacio, gestión del surtido y la comunicación en el punto de venta. Este tipo de </w:t>
       </w:r>
       <w:r>
         <w:rPr>
@@ -11646,7 +12104,21 @@
         <w:rPr>
           <w:rFonts w:cstheme="minorHAnsi"/>
         </w:rPr>
-        <w:t>Su misión consiste en dar a conocer nuevos o desconocidos productos o servicios que supongan un cambio o un avance en la concepción de los mismos.</w:t>
+        <w:t xml:space="preserve">Su misión consiste en dar a conocer nuevos o desconocidos productos o servicios que supongan un cambio o un avance en la concepción de </w:t>
+      </w:r>
+      <w:proofErr w:type="gramStart"/>
+      <w:r>
+        <w:rPr>
+          <w:rFonts w:cstheme="minorHAnsi"/>
+        </w:rPr>
+        <w:t>los mismos</w:t>
+      </w:r>
+      <w:proofErr w:type="gramEnd"/>
+      <w:r>
+        <w:rPr>
+          <w:rFonts w:cstheme="minorHAnsi"/>
+        </w:rPr>
+        <w:t>.</w:t>
       </w:r>
     </w:p>
     <w:p>
@@ -11832,7 +12304,19 @@
         <w:rPr>
           <w:rFonts w:cstheme="minorHAnsi"/>
         </w:rPr>
-        <w:t> piezas utilizadas en fechas específicas, como Navidad, Día de la madre o regreso a clases.</w:t>
+        <w:t xml:space="preserve"> piezas utilizadas en fechas específicas, como Navidad, Día de la </w:t>
+      </w:r>
+      <w:r>
+        <w:rPr>
+          <w:rFonts w:cstheme="minorHAnsi"/>
+        </w:rPr>
+        <w:t>M</w:t>
+      </w:r>
+      <w:r>
+        <w:rPr>
+          <w:rFonts w:cstheme="minorHAnsi"/>
+        </w:rPr>
+        <w:t>adre o regreso a clases.</w:t>
       </w:r>
     </w:p>
     <w:p>
@@ -12158,7 +12642,21 @@
         <w:rPr>
           <w:rFonts w:cstheme="minorHAnsi"/>
         </w:rPr>
-        <w:t>La publicidad en el punto de venta requiere de estrategias claras que permitan captar la atención del consumidor y generar confianza en la compra. Por tal razón se presentan los aspectos esenciales a tener en cuenta, desde el análisis de la competencia hasta el diseño y la comunicación del producto, con el fin de lograr un impacto positivo sin saturar el espacio comercial.</w:t>
+        <w:t xml:space="preserve">La publicidad en el punto de venta requiere estrategias claras que permitan captar la atención del consumidor y generar confianza en la compra. Por tal razón se presentan los aspectos esenciales </w:t>
+      </w:r>
+      <w:proofErr w:type="gramStart"/>
+      <w:r>
+        <w:rPr>
+          <w:rFonts w:cstheme="minorHAnsi"/>
+        </w:rPr>
+        <w:t>a</w:t>
+      </w:r>
+      <w:proofErr w:type="gramEnd"/>
+      <w:r>
+        <w:rPr>
+          <w:rFonts w:cstheme="minorHAnsi"/>
+        </w:rPr>
+        <w:t xml:space="preserve"> tener en cuenta, desde el análisis de la competencia hasta el diseño y la comunicación del producto, con el fin de lograr un impacto positivo sin saturar el espacio comercial.</w:t>
       </w:r>
     </w:p>
     <w:p>
@@ -12366,7 +12864,19 @@
         <w:rPr>
           <w:rFonts w:cstheme="minorHAnsi"/>
         </w:rPr>
-        <w:t>Los mensajes en la publicidad en el punto de venta, deben enviar un mensaje al consumidor con los beneficios del producto, modo de uso, fecha de vencimiento, etc, para brindar una mayor confianza en la compra.</w:t>
+        <w:t>Los mensajes en la publicidad en el punto de venta, deben enviar un mensaje al consumidor con los beneficios del producto, modo de uso, fecha de vencimiento, etc</w:t>
+      </w:r>
+      <w:r>
+        <w:rPr>
+          <w:rFonts w:cstheme="minorHAnsi"/>
+        </w:rPr>
+        <w:t>.</w:t>
+      </w:r>
+      <w:r>
+        <w:rPr>
+          <w:rFonts w:cstheme="minorHAnsi"/>
+        </w:rPr>
+        <w:t>, para brindar una mayor confianza en la compra.</w:t>
       </w:r>
     </w:p>
     <w:p>
@@ -12922,7 +13432,7 @@
               </wp:inline>
             </w:drawing>
           </mc:Choice>
-          <mc:Fallback>
+          <mc:Fallback xmlns:w16cei="http://schemas.microsoft.com/office/word/2026/wordml/cei">
             <w:pict>
               <v:rect w14:anchorId="5FB3AA4A" id="Rectangle 35" o:spid="_x0000_s1026" style="width:24pt;height:24pt;visibility:visible;mso-wrap-style:square;mso-left-percent:-10001;mso-top-percent:-10001;mso-position-horizontal:absolute;mso-position-horizontal-relative:char;mso-position-vertical:absolute;mso-position-vertical-relative:line;mso-left-percent:-10001;mso-top-percent:-10001;v-text-anchor:top" o:gfxdata="UEsDBBQABgAIAAAAIQC2gziS/gAAAOEBAAATAAAAW0NvbnRlbnRfVHlwZXNdLnhtbJSRQU7DMBBF 90jcwfIWJU67QAgl6YK0S0CoHGBkTxKLZGx5TGhvj5O2G0SRWNoz/78nu9wcxkFMGNg6quQqL6RA 0s5Y6ir5vt9lD1JwBDIwOMJKHpHlpr69KfdHjyxSmriSfYz+USnWPY7AufNIadK6MEJMx9ApD/oD OlTrorhX2lFEilmcO2RdNtjC5xDF9pCuTyYBB5bi6bQ4syoJ3g9WQ0ymaiLzg5KdCXlKLjvcW893 SUOqXwnz5DrgnHtJTxOsQfEKIT7DmDSUCaxw7Rqn8787ZsmRM9e2VmPeBN4uqYvTtW7jvijg9N/y JsXecLq0q+WD6m8AAAD//wMAUEsDBBQABgAIAAAAIQA4/SH/1gAAAJQBAAALAAAAX3JlbHMvLnJl bHOkkMFqwzAMhu+DvYPRfXGawxijTi+j0GvpHsDYimMaW0Yy2fr2M4PBMnrbUb/Q94l/f/hMi1qR JVI2sOt6UJgd+ZiDgffL8ekFlFSbvV0oo4EbChzGx4f9GRdb25HMsYhqlCwG5lrLq9biZkxWOiqY 22YiTra2kYMu1l1tQD30/bPm3wwYN0x18gb45AdQl1tp5j/sFB2T0FQ7R0nTNEV3j6o9feQzro1i OWA14Fm+Q8a1a8+Bvu/d/dMb2JY5uiPbhG/ktn4cqGU/er3pcvwCAAD//wMAUEsDBBQABgAIAAAA IQDuEevW0gEAAJ4DAAAOAAAAZHJzL2Uyb0RvYy54bWysU9uO0zAQfUfiHyy/06SlwBI1Xa12tQhp YZEWPsB17MQi8ZgZt2n5esZOty3whnix5uKcOXN8srreD73YGSQHvpbzWSmF8Roa59tafvt6/+pK CorKN6oHb2p5MCSv1y9frMZQmQV00DcGBYN4qsZQyy7GUBUF6c4MimYQjOemBRxU5BTbokE1MvrQ F4uyfFuMgE1A0IaIq3dTU64zvrVGx0dryUTR15K5xXxiPjfpLNYrVbWoQuf0kYb6BxaDcp6HnqDu VFRii+4vqMFpBAIbZxqGAqx12uQdeJt5+cc2T50KJu/C4lA4yUT/D1Z/3j2FL5ioU3gA/Z2Eh9tO +dbcUGD5+FHluYQIY2dUwwzmSbtiDFSdMFJCjCY24ydo+LXVNkKWZW9xSDN4YbHP6h9O6pt9FJqL r8vlVclvpLl1jNMEVT1/HJDiBwODSEEtkdllcLV7oDhdfb6SZnm4d32fH7j3vxUYM1Uy+cQ3uYWq DTQH5o4wmYRNzUEH+FOKkQ1SS/qxVWik6D963v/9fLlMjsrJ8s27BSd42dlcdpTXDFXLKMUU3sbJ hduAru2yzBPHG9bMurzPmdWRLJsgK3I0bHLZZZ5vnX+r9S8AAAD//wMAUEsDBBQABgAIAAAAIQBM oOks2AAAAAMBAAAPAAAAZHJzL2Rvd25yZXYueG1sTI9BS8NAEIXvgv9hGcGL2I0iUmI2RQpiEaGY as/T7JgEs7NpdpvEf9+pHvQyw+MNb76XLSbXqoH60Hg2cDNLQBGX3jZcGXjfPF3PQYWIbLH1TAa+ KcAiPz/LMLV+5DcailgpCeGQooE6xi7VOpQ1OQwz3xGL9+l7h1FkX2nb4yjhrtW3SXKvHTYsH2rs aFlT+VUcnIGxXA/bzeuzXl9tV573q/2y+Hgx5vJienwAFWmKf8dwwhd0yIVp5w9sg2oNSJH4M8W7 m4va/W6dZ/o/e34EAAD//wMAUEsBAi0AFAAGAAgAAAAhALaDOJL+AAAA4QEAABMAAAAAAAAAAAAA AAAAAAAAAFtDb250ZW50X1R5cGVzXS54bWxQSwECLQAUAAYACAAAACEAOP0h/9YAAACUAQAACwAA AAAAAAAAAAAAAAAvAQAAX3JlbHMvLnJlbHNQSwECLQAUAAYACAAAACEA7hHr1tIBAACeAwAADgAA AAAAAAAAAAAAAAAuAgAAZHJzL2Uyb0RvYy54bWxQSwECLQAUAAYACAAAACEATKDpLNgAAAADAQAA DwAAAAAAAAAAAAAAAAAsBAAAZHJzL2Rvd25yZXYueG1sUEsFBgAAAAAEAAQA8wAAADEFAAAAAA== " filled="f" stroked="f">
                 <o:lock v:ext="edit" aspectratio="t"/>
@@ -12968,16 +13478,23 @@
           <w:tab w:val="clear" w:pos="360"/>
         </w:tabs>
         <w:spacing w:before="0" w:after="0"/>
-        <w:rPr>
-          <w:rFonts w:cstheme="minorHAnsi"/>
-        </w:rPr>
-      </w:pPr>
+        <w:ind w:left="720"/>
+        <w:rPr>
+          <w:rFonts w:cstheme="minorHAnsi"/>
+        </w:rPr>
+      </w:pPr>
+      <w:r>
+        <w:rPr>
+          <w:rFonts w:cstheme="minorHAnsi"/>
+        </w:rPr>
+        <w:t xml:space="preserve">Como ejemplo, se tomará la presentación que Apple realizó del iPhone. Apple siempre ha logrado que sus presentaciones generen altas expectativas, </w:t>
+      </w:r>
       <w:r>
         <w:rPr>
           <w:rFonts w:cstheme="minorHAnsi"/>
         </w:rPr>
         <w:lastRenderedPageBreak/>
-        <w:t>Como ejemplo, se tomará la presentación que Apple realizó del iPhone. Apple siempre ha logrado que sus presentaciones generen altas expectativas, manteniendo una estética profesional, limpia y atractiva, que rara vez decepciona.</w:t>
+        <w:t>manteniendo una estética profesional, limpia y atractiva, que rara vez decepciona.</w:t>
       </w:r>
     </w:p>
     <w:p>
@@ -12990,6 +13507,7 @@
           <w:tab w:val="clear" w:pos="360"/>
         </w:tabs>
         <w:spacing w:before="0" w:after="0"/>
+        <w:ind w:left="720"/>
         <w:rPr>
           <w:rFonts w:cstheme="minorHAnsi"/>
         </w:rPr>
@@ -13036,7 +13554,7 @@
           <w:noProof/>
         </w:rPr>
         <w:drawing>
-          <wp:inline distT="0" distB="0" distL="0" distR="0" wp14:anchorId="6E949349" wp14:editId="160AB62C">
+          <wp:inline distT="0" distB="0" distL="0" distR="0" wp14:anchorId="6E949349" wp14:editId="38505519">
             <wp:extent cx="4680000" cy="2632383"/>
             <wp:effectExtent l="0" t="0" r="6350" b="0"/>
             <wp:docPr id="267469900" name="Imagen 13">
@@ -13212,14 +13730,14 @@
               <w:rPr>
                 <w:rFonts w:cstheme="minorHAnsi"/>
               </w:rPr>
-              <w:t xml:space="preserve"> avanzado y un sistema operativo robusto pueden </w:t>
+              <w:t xml:space="preserve"> avanzado y un sistema operativo robusto pueden redefinir el estándar de toda una industria, marcando un hito definitivo en el </w:t>
             </w:r>
             <w:r>
               <w:rPr>
                 <w:rFonts w:cstheme="minorHAnsi"/>
               </w:rPr>
               <w:lastRenderedPageBreak/>
-              <w:t>redefinir el estándar de toda una industria, marcando un hito definitivo en el desarrollo de dispositivos móviles. La propuesta de valor de este equipo se fundamentó en el concepto de convergencia tecnológica, unificando un reproductor multimedia de pantalla panorámica, un terminal móvil de telecomunicaciones y un comunicador de internet de alto rendimiento en una sola arquitectura física.</w:t>
+              <w:t>desarrollo de dispositivos móviles. La propuesta de valor de este equipo se fundamentó en el concepto de convergencia tecnológica, unificando un reproductor multimedia de pantalla panorámica, un terminal móvil de telecomunicaciones y un comunicador de internet de alto rendimiento en una sola arquitectura física.</w:t>
             </w:r>
           </w:p>
           <w:p>
@@ -13370,14 +13888,14 @@
               <w:rPr>
                 <w:rFonts w:cstheme="minorHAnsi"/>
               </w:rPr>
-              <w:t xml:space="preserve">, la inclusión de sensores embebidos y transductores marcó un estándar para el mantenimiento de </w:t>
+              <w:t xml:space="preserve">, la inclusión de sensores embebidos y transductores marcó un estándar para el mantenimiento de equipos. El dispositivo incorporó un sensor de proximidad diseñado para </w:t>
             </w:r>
             <w:r>
               <w:rPr>
                 <w:rFonts w:cstheme="minorHAnsi"/>
               </w:rPr>
               <w:lastRenderedPageBreak/>
-              <w:t>equipos. El dispositivo incorporó un sensor de proximidad diseñado para interrumpir la retroiluminación y el panel táctil al detectar cercanía física, evitando así pulsaciones erróneas y optimizando el consumo de batería. Adicionalmente, integró una fotocélula de luz ambiental para ajustar dinámicamente el voltaje de la pantalla según el entorno lumínico, y un acelerómetro de estado sólido capaz de detectar la orientación en los ejes espaciales para conmutar la visualización gráfica de forma automática.</w:t>
+              <w:t>interrumpir la retroiluminación y el panel táctil al detectar cercanía física, evitando así pulsaciones erróneas y optimizando el consumo de batería. Adicionalmente, integró una fotocélula de luz ambiental para ajustar dinámicamente el voltaje de la pantalla según el entorno lumínico, y un acelerómetro de estado sólido capaz de detectar la orientación en los ejes espaciales para conmutar la visualización gráfica de forma automática.</w:t>
             </w:r>
           </w:p>
           <w:p>
@@ -13473,8 +13991,26 @@
         <w:rPr>
           <w:rFonts w:cstheme="minorHAnsi"/>
         </w:rPr>
+        <w:t>Además, las presentaciones son consideradas recursos gráficos que apoyan en la promoción o venta de un producto, y que presentan una estructura donde se va</w:t>
+      </w:r>
+      <w:r>
+        <w:rPr>
+          <w:rFonts w:cstheme="minorHAnsi"/>
+        </w:rPr>
+        <w:t>n</w:t>
+      </w:r>
+      <w:r>
+        <w:rPr>
+          <w:rFonts w:cstheme="minorHAnsi"/>
+        </w:rPr>
+        <w:t xml:space="preserve"> </w:t>
+      </w:r>
+      <w:r>
+        <w:rPr>
+          <w:rFonts w:cstheme="minorHAnsi"/>
+        </w:rPr>
         <w:lastRenderedPageBreak/>
-        <w:t>Además, las presentaciones son consideradas recursos gráficos que apoyan en la promoción o venta de un producto, y que presentan una estructura donde se va dando a conocer diferentes áreas o aspectos de un discurso profesional, académico o publicitario; de ahí la importancia de acertar en el tipo de presentación que se perfila. En este contexto, las presentaciones se pueden clasificar de la siguiente manera:</w:t>
+        <w:t>dando a conocer diferentes áreas o aspectos de un discurso profesional, académico o publicitario; de ahí la importancia de acertar en el tipo de presentación que se perfila. En este contexto, las presentaciones se pueden clasificar de la siguiente manera:</w:t>
       </w:r>
     </w:p>
     <w:p>
@@ -13618,7 +14154,16 @@
           <w:bCs/>
           <w:lang w:val="en-US"/>
         </w:rPr>
-        <w:t>Línea</w:t>
+        <w:t>En l</w:t>
+      </w:r>
+      <w:r>
+        <w:rPr>
+          <w:rFonts w:cstheme="minorHAnsi"/>
+          <w:b/>
+          <w:bCs/>
+          <w:lang w:val="en-US"/>
+        </w:rPr>
+        <w:t>ínea</w:t>
       </w:r>
     </w:p>
     <w:p>
@@ -13753,14 +14298,7 @@
         <w:rPr>
           <w:rFonts w:cstheme="minorHAnsi"/>
         </w:rPr>
-        <w:t xml:space="preserve">Se deben resolver los puntos más importantes para aquellos que deben financiar el producto, servicio o iniciativa. En el caso de las rondas de </w:t>
-      </w:r>
-      <w:r>
-        <w:rPr>
-          <w:rFonts w:cstheme="minorHAnsi"/>
-        </w:rPr>
-        <w:lastRenderedPageBreak/>
-        <w:t>inversión, son fundamentales varias partes: quién pide el dinero, para qué y cómo se va a devolver.</w:t>
+        <w:t>Se deben resolver los puntos más importantes para aquellos que deben financiar el producto, servicio o iniciativa. En el caso de las rondas de inversión, son fundamentales varias partes: quién pide el dinero, para qué y cómo se va a devolver.</w:t>
       </w:r>
     </w:p>
     <w:p>
@@ -13785,6 +14323,7 @@
           <w:bCs/>
           <w:lang w:val="en-US"/>
         </w:rPr>
+        <w:lastRenderedPageBreak/>
         <w:t>Corporativa</w:t>
       </w:r>
     </w:p>
@@ -13920,7 +14459,21 @@
         <w:rPr>
           <w:rFonts w:cstheme="minorHAnsi"/>
         </w:rPr>
-        <w:t>Similar que en la presentación de plan de negocio, tienen una estructura definida.</w:t>
+        <w:t xml:space="preserve">Similar </w:t>
+      </w:r>
+      <w:proofErr w:type="gramStart"/>
+      <w:r>
+        <w:rPr>
+          <w:rFonts w:cstheme="minorHAnsi"/>
+        </w:rPr>
+        <w:t>que</w:t>
+      </w:r>
+      <w:proofErr w:type="gramEnd"/>
+      <w:r>
+        <w:rPr>
+          <w:rFonts w:cstheme="minorHAnsi"/>
+        </w:rPr>
+        <w:t xml:space="preserve"> en la presentación de plan de negocio, tienen una estructura definida.</w:t>
       </w:r>
     </w:p>
     <w:p>
@@ -13953,20 +14506,18 @@
           <w:rFonts w:cstheme="minorHAnsi"/>
         </w:rPr>
       </w:pPr>
-    </w:p>
-    <w:p>
-      <w:pPr>
-        <w:spacing w:before="0" w:after="0"/>
-        <w:rPr>
-          <w:rFonts w:cstheme="minorHAnsi"/>
-        </w:rPr>
-      </w:pPr>
+      <w:r>
+        <w:rPr>
+          <w:rFonts w:cstheme="minorHAnsi"/>
+        </w:rPr>
+        <w:t xml:space="preserve">Más que el contenido, lo importante en una presentación son aquellos elementos intangibles que juegan un papel importante durante el desarrollo. El lenguaje corporal, el tono de voz, la actitud, incluso, los movimientos, pueden ser determinantes para que el cliente pueda tomar la decisión de compra y cerrar el </w:t>
+      </w:r>
       <w:r>
         <w:rPr>
           <w:rFonts w:cstheme="minorHAnsi"/>
         </w:rPr>
         <w:lastRenderedPageBreak/>
-        <w:t>Más que el contenido, lo importante en una presentación son aquellos elementos intangibles que juegan un papel importante durante el desarrollo. El lenguaje corporal, el tono de voz, la actitud, incluso, los movimientos, pueden ser determinantes para que el cliente pueda tomar la decisión de compra y cerrar el negocio. Algunos aspectos importantes por considerar para un buen desarrollo de una presentación se presentan en el siguiente video.</w:t>
+        <w:t>negocio. Algunos aspectos importantes por considerar para un buen desarrollo de una presentación se presentan en el siguiente video.</w:t>
       </w:r>
     </w:p>
     <w:p>
@@ -13974,7 +14525,16 @@
         <w:pStyle w:val="Video"/>
       </w:pPr>
       <w:r>
-        <w:t>Algunos tips importantes para un buen desarrollo de una presentación</w:t>
+        <w:t xml:space="preserve">Algunos </w:t>
+      </w:r>
+      <w:r>
+        <w:rPr>
+          <w:rStyle w:val="Extranjerismo"/>
+        </w:rPr>
+        <w:t>tips</w:t>
+      </w:r>
+      <w:r>
+        <w:t xml:space="preserve"> importantes para un buen desarrollo de una presentación</w:t>
       </w:r>
     </w:p>
     <w:p>
@@ -13986,7 +14546,7 @@
           <w:noProof/>
         </w:rPr>
         <w:drawing>
-          <wp:inline distT="0" distB="0" distL="0" distR="0" wp14:anchorId="09063400" wp14:editId="71B05DC8">
+          <wp:inline distT="0" distB="0" distL="0" distR="0" wp14:anchorId="09063400" wp14:editId="6E89D229">
             <wp:extent cx="4680000" cy="2632383"/>
             <wp:effectExtent l="0" t="0" r="6350" b="0"/>
             <wp:docPr id="1188031998" name="Imagen 14">
@@ -14062,7 +14622,15 @@
             <w:b/>
             <w:bCs/>
           </w:rPr>
-          <w:t>Enlace de reproducción del video</w:t>
+          <w:t>Enlace de repro</w:t>
+        </w:r>
+        <w:r>
+          <w:rPr>
+            <w:rStyle w:val="Hipervnculo"/>
+            <w:b/>
+            <w:bCs/>
+          </w:rPr>
+          <w:t>ducción del video</w:t>
         </w:r>
       </w:hyperlink>
     </w:p>
@@ -14101,7 +14669,19 @@
               <w:rPr>
                 <w:rFonts w:cstheme="minorHAnsi"/>
               </w:rPr>
-              <w:t xml:space="preserve"> algunos tips importantes para un buen desarrollo de una presentación</w:t>
+              <w:t xml:space="preserve"> </w:t>
+            </w:r>
+            <w:r>
+              <w:rPr>
+                <w:rFonts w:cstheme="minorHAnsi"/>
+              </w:rPr>
+              <w:t>a</w:t>
+            </w:r>
+            <w:r>
+              <w:rPr>
+                <w:rFonts w:cstheme="minorHAnsi"/>
+              </w:rPr>
+              <w:t>lgunos tips importantes para un buen desarrollo de una presentación</w:t>
             </w:r>
           </w:p>
         </w:tc>
@@ -14124,6 +14704,17 @@
                 <w:rFonts w:cstheme="minorHAnsi"/>
               </w:rPr>
               <w:tab/>
+            </w:r>
+            <w:r>
+              <w:rPr>
+                <w:rFonts w:cstheme="minorHAnsi"/>
+              </w:rPr>
+              <w:t xml:space="preserve">Presentaciones, </w:t>
+            </w:r>
+            <w:r>
+              <w:rPr>
+                <w:rFonts w:cstheme="minorHAnsi"/>
+              </w:rPr>
               <w:t>¿Cómo generar interés en una presentación? Las presentaciones suelen tener una duración entre 30 y 60 minutos. Para que no se hagan largas, existen formas de mantener interesado a tu público, incluso si se tiene que hablar mucho. A continuación, te presentamos algunas recomendaciones.</w:t>
             </w:r>
           </w:p>
@@ -14141,18 +14732,32 @@
             </w:pPr>
             <w:r>
               <w:rPr>
+                <w:rStyle w:val="Extranjerismo"/>
+                <w:b/>
+                <w:bCs/>
+              </w:rPr>
+              <w:t>Tip</w:t>
+            </w:r>
+            <w:r>
+              <w:rPr>
                 <w:rFonts w:cstheme="minorHAnsi"/>
                 <w:b/>
                 <w:bCs/>
               </w:rPr>
+              <w:t xml:space="preserve"> número uno: aprovecha los momentos de más atención.</w:t>
+            </w:r>
+            <w:r>
+              <w:rPr>
+                <w:rFonts w:cstheme="minorHAnsi"/>
+              </w:rPr>
+              <w:t xml:space="preserve"> El inicio y la conclusión son las partes más importantes de toda presentación, pues generan un impacto y una recordación. En los primeros minutos, se realiza una presentación personal, luego se cuenta un poco de historia relacionada con el tema de la presentación; esto ayuda a que el público pueda centrar su atención </w:t>
+            </w:r>
+            <w:r>
+              <w:rPr>
+                <w:rFonts w:cstheme="minorHAnsi"/>
+              </w:rPr>
               <w:lastRenderedPageBreak/>
-              <w:t>Tip número uno: aprovecha los momentos de más atención.</w:t>
-            </w:r>
-            <w:r>
-              <w:rPr>
-                <w:rFonts w:cstheme="minorHAnsi"/>
-              </w:rPr>
-              <w:t xml:space="preserve"> El inicio y la conclusión son las partes más importantes de toda presentación, pues generan un impacto y una recordación. En los primeros minutos, se realiza una presentación personal, luego se cuenta un poco de historia relacionada con el tema de la presentación; esto ayuda a que el público pueda centrar su atención en el presentador. Este momento no puede ser muy extenso para que no haya pie a distracciones. Luego hay que hablar de las características del producto; son importantes, pero es información que los prospectos quizás ya conocen o pueden buscar por su cuenta. Por tanto, se puede hablar de esto en la mitad de la presentación, porque no todo el mundo lo recordará. En la conclusión, es importante regresar a la historia inicial y reforzar cómo tu producto soluciona un problema importante. Puedes cerrar con una frase como: “Estoy seguro de que este producto puede resolver su problema”.</w:t>
+              <w:t>en el presentador. Este momento no puede ser muy extenso para que no haya pie a distracciones. Luego hay que hablar de las características del producto; son importantes, pero es información que los prospectos quizás ya conocen o pueden buscar por su cuenta. Por tanto, se puede hablar de esto en la mitad de la presentación, porque no todo el mundo lo recordará. En la conclusión, es importante regresar a la historia inicial y reforzar cómo tu producto soluciona un problema importante. Puedes cerrar con una frase como: “Estoy seguro de que este producto puede resolver su problema”.</w:t>
             </w:r>
           </w:p>
           <w:p>
@@ -14169,11 +14774,19 @@
             </w:pPr>
             <w:r>
               <w:rPr>
+                <w:rStyle w:val="Extranjerismo"/>
+                <w:b/>
+                <w:bCs/>
+              </w:rPr>
+              <w:t>Tip</w:t>
+            </w:r>
+            <w:r>
+              <w:rPr>
                 <w:rFonts w:cstheme="minorHAnsi"/>
                 <w:b/>
                 <w:bCs/>
               </w:rPr>
-              <w:t>Tip número dos: sé simpático.</w:t>
+              <w:t xml:space="preserve"> número dos: sé simpático.</w:t>
             </w:r>
             <w:r>
               <w:rPr>
@@ -14196,11 +14809,19 @@
             </w:pPr>
             <w:r>
               <w:rPr>
+                <w:rStyle w:val="Extranjerismo"/>
+                <w:b/>
+                <w:bCs/>
+              </w:rPr>
+              <w:t>Tip</w:t>
+            </w:r>
+            <w:r>
+              <w:rPr>
                 <w:rFonts w:cstheme="minorHAnsi"/>
                 <w:b/>
                 <w:bCs/>
               </w:rPr>
-              <w:t>Tip número tres: llama la atención.</w:t>
+              <w:t xml:space="preserve"> número tres: llama la atención.</w:t>
             </w:r>
             <w:r>
               <w:rPr>
@@ -14223,23 +14844,29 @@
       </w:pPr>
       <w:bookmarkStart w:id="12" w:name="_Toc238023236"/>
       <w:r>
+        <w:t>6.1. Lenguaje corporal</w:t>
+      </w:r>
+      <w:bookmarkEnd w:id="12"/>
+    </w:p>
+    <w:p>
+      <w:pPr>
+        <w:spacing w:before="0" w:after="0"/>
+        <w:rPr>
+          <w:rFonts w:cstheme="minorHAnsi"/>
+        </w:rPr>
+      </w:pPr>
+      <w:r>
+        <w:rPr>
+          <w:rFonts w:cstheme="minorHAnsi"/>
+        </w:rPr>
+        <w:t xml:space="preserve">El lenguaje corporal es un recurso esencial en cualquier presentación, ya sea presencial o virtual. A través de los gestos, la postura, la mirada y la sonrisa, se transmite confianza, seguridad y cercanía con el público. Una adecuada expresión </w:t>
+      </w:r>
+      <w:r>
+        <w:rPr>
+          <w:rFonts w:cstheme="minorHAnsi"/>
+        </w:rPr>
         <w:lastRenderedPageBreak/>
-        <w:t>6.1. Lenguaje corporal</w:t>
-      </w:r>
-      <w:bookmarkEnd w:id="12"/>
-    </w:p>
-    <w:p>
-      <w:pPr>
-        <w:spacing w:before="0" w:after="0"/>
-        <w:rPr>
-          <w:rFonts w:cstheme="minorHAnsi"/>
-        </w:rPr>
-      </w:pPr>
-      <w:r>
-        <w:rPr>
-          <w:rFonts w:cstheme="minorHAnsi"/>
-        </w:rPr>
-        <w:t>El lenguaje corporal es un recurso esencial en cualquier presentación, ya sea presencial o virtual. A través de los gestos, la postura, la mirada y la sonrisa, se transmite confianza, seguridad y cercanía con el público. Una adecuada expresión corporal permite captar la atención, reforzar el mensaje y proyectar credibilidad, favoreciendo así una comunicación más efectiva y convincente.</w:t>
+        <w:t>corporal permite captar la atención, reforzar el mensaje y proyectar credibilidad, favoreciendo así una comunicación más efectiva y convincente.</w:t>
       </w:r>
     </w:p>
     <w:p>
@@ -14389,9 +15016,16 @@
         <w:rPr>
           <w:rFonts w:cstheme="minorHAnsi"/>
         </w:rPr>
-        <w:lastRenderedPageBreak/>
         <w:t>Para ampliar y profundizar en los contenidos abordados, se recomienda consultar el siguiente enlace.</w:t>
       </w:r>
+    </w:p>
+    <w:p>
+      <w:pPr>
+        <w:spacing w:before="0" w:after="0"/>
+        <w:rPr>
+          <w:rFonts w:cstheme="minorHAnsi"/>
+        </w:rPr>
+      </w:pPr>
     </w:p>
     <w:p>
       <w:pPr>
@@ -14431,6 +15065,7 @@
           <w:rFonts w:asciiTheme="minorHAnsi" w:hAnsiTheme="minorHAnsi" w:cstheme="minorHAnsi"/>
           <w:color w:val="auto"/>
         </w:rPr>
+        <w:lastRenderedPageBreak/>
         <w:t>Hablando con Julis | Daniela Galindo | TEDxUniversidadPiloto</w:t>
       </w:r>
     </w:p>
@@ -14444,7 +15079,7 @@
           <w:noProof/>
         </w:rPr>
         <w:drawing>
-          <wp:inline distT="0" distB="0" distL="0" distR="0" wp14:anchorId="7E17CF4F" wp14:editId="0C63F4BB">
+          <wp:inline distT="0" distB="0" distL="0" distR="0" wp14:anchorId="7E17CF4F" wp14:editId="41EE5042">
             <wp:extent cx="4680000" cy="2632383"/>
             <wp:effectExtent l="0" t="0" r="6350" b="0"/>
             <wp:docPr id="144226528" name="Imagen 15">
@@ -14599,14 +15234,14 @@
               <w:rPr>
                 <w:rFonts w:cstheme="minorHAnsi"/>
               </w:rPr>
-              <w:t xml:space="preserve">El proyecto tiene su génesis en un estudio de caso dentro del entorno familiar primario de la autora, donde la condición neurológica de su hermana visibilizó las profundas repercusiones socioemocionales derivadas del aislamiento comunicativo. </w:t>
+              <w:t xml:space="preserve">El proyecto tiene su génesis en un estudio de caso dentro del entorno familiar primario de la autora, donde la condición neurológica de su hermana visibilizó las profundas repercusiones socioemocionales derivadas del aislamiento comunicativo. Este escenario evidenció los sesgos inherentes al modelo médico rehabilitador y a las instituciones educativas tradicionales, entidades que emitieron pronósticos patologizantes y desestimaron el potencial cognitivo y de aprendizaje del sujeto. En contraposición a este paradigma limitante, se adoptó un enfoque centrado en el </w:t>
             </w:r>
             <w:r>
               <w:rPr>
                 <w:rFonts w:cstheme="minorHAnsi"/>
               </w:rPr>
               <w:lastRenderedPageBreak/>
-              <w:t>Este escenario evidenció los sesgos inherentes al modelo médico rehabilitador y a las instituciones educativas tradicionales, entidades que emitieron pronósticos patologizantes y desestimaron el potencial cognitivo y de aprendizaje del sujeto. En contraposición a este paradigma limitante, se adoptó un enfoque centrado en el desarrollo de capacidades, reconociendo la competencia comunicativa como el andamiaje fundamental para el aprendizaje integral y la interacción social.</w:t>
+              <w:t>desarrollo de capacidades, reconociendo la competencia comunicativa como el andamiaje fundamental para el aprendizaje integral y la interacción social.</w:t>
             </w:r>
           </w:p>
           <w:p>
@@ -14651,14 +15286,7 @@
                 <w:rFonts w:cstheme="minorHAnsi"/>
               </w:rPr>
               <w:tab/>
-              <w:t xml:space="preserve">La pertinencia y escalabilidad de este emprendimiento social han permitido su aplicación en un amplio espectro demográfico desde la primera infancia hasta la adultez mayor atendiendo requerimientos específicos asociados a diversas neurodivergencias y alteraciones neuromotoras. Este impacto transversal, avalado y reconocido por el MIT como un hito en la innovación social, culmina con una interpelación a la deconstrucción de los sesgos capacitistas. Se plantea así la necesidad imperativa de transformar las estructuras sociológicas y pedagógicas mediante la adopción de modelos basados en las potencialidades del individuo, </w:t>
-            </w:r>
-            <w:r>
-              <w:rPr>
-                <w:rFonts w:cstheme="minorHAnsi"/>
-              </w:rPr>
-              <w:lastRenderedPageBreak/>
-              <w:t xml:space="preserve">garantizando de este modo la consolidación de ecosistemas formativos y sociales genuinamente inclusivos. </w:t>
+              <w:t xml:space="preserve">La pertinencia y escalabilidad de este emprendimiento social han permitido su aplicación en un amplio espectro demográfico desde la primera infancia hasta la adultez mayor atendiendo requerimientos específicos asociados a diversas neurodivergencias y alteraciones neuromotoras. Este impacto transversal, avalado y reconocido por el MIT como un hito en la innovación social, culmina con una interpelación a la deconstrucción de los sesgos capacitistas. Se plantea así la necesidad imperativa de transformar las estructuras sociológicas y pedagógicas mediante la adopción de modelos basados en las potencialidades del individuo, garantizando de este modo la consolidación de ecosistemas formativos y sociales genuinamente inclusivos. </w:t>
             </w:r>
           </w:p>
         </w:tc>
@@ -14683,6 +15311,7 @@
         <w:rPr>
           <w:rFonts w:cstheme="minorHAnsi"/>
         </w:rPr>
+        <w:lastRenderedPageBreak/>
         <w:t>Finalmente, existen diferentes herramientas y plataformas digitales para el diseño de presentaciones y que se pueden usar como apoyo al momento de presentar el producto ante el cliente. Algunas de las herramientas son:</w:t>
       </w:r>
     </w:p>
@@ -14987,10 +15616,10 @@
           <w:lang w:eastAsia="es-CO"/>
         </w:rPr>
         <w:drawing>
-          <wp:inline distT="0" distB="0" distL="0" distR="0" wp14:anchorId="12BE1839" wp14:editId="151594D7">
+          <wp:inline distT="0" distB="0" distL="0" distR="0" wp14:anchorId="453E4D7E" wp14:editId="38BE2D5C">
             <wp:extent cx="6332220" cy="3140710"/>
             <wp:effectExtent l="0" t="0" r="0" b="2540"/>
-            <wp:docPr id="142519577" name="Imagen 16" descr="La venta, la comunicación y el merchandising constituyen tres pilares esenciales en la gestión comercial: la venta como un proceso estructurado de interacción con el cliente, la comunicación como el medio clave para persuadir y transmitir mensajes claros, y el merchandising como estrategia que influye en la decisión de compra en el punto de venta. La integración de estos elementos permite generar experiencias positivas para el consumidor y mejores resultados para la empresa."/>
+            <wp:docPr id="582297653" name="Gráfico 6" descr="La venta, la comunicación y el merchandising constituyen tres pilares esenciales en la gestión comercial: la venta como un proceso estructurado de interacción con el cliente, la comunicación como el medio clave para persuadir y transmitir mensajes claros, y el merchandising como estrategia que influye en la decisión de compra en el punto de venta. La integración de estos elementos permite generar experiencias positivas para el consumidor y mejores resultados para la empresa."/>
             <wp:cNvGraphicFramePr>
               <a:graphicFrameLocks xmlns:a="http://schemas.openxmlformats.org/drawingml/2006/main" noChangeAspect="1"/>
             </wp:cNvGraphicFramePr>
@@ -14998,14 +15627,14 @@
               <a:graphicData uri="http://schemas.openxmlformats.org/drawingml/2006/picture">
                 <pic:pic xmlns:pic="http://schemas.openxmlformats.org/drawingml/2006/picture">
                   <pic:nvPicPr>
-                    <pic:cNvPr id="142519577" name="Imagen 16" descr="La venta, la comunicación y el merchandising constituyen tres pilares esenciales en la gestión comercial: la venta como un proceso estructurado de interacción con el cliente, la comunicación como el medio clave para persuadir y transmitir mensajes claros, y el merchandising como estrategia que influye en la decisión de compra en el punto de venta. La integración de estos elementos permite generar experiencias positivas para el consumidor y mejores resultados para la empresa."/>
+                    <pic:cNvPr id="582297653" name="Gráfico 6" descr="La venta, la comunicación y el merchandising constituyen tres pilares esenciales en la gestión comercial: la venta como un proceso estructurado de interacción con el cliente, la comunicación como el medio clave para persuadir y transmitir mensajes claros, y el merchandising como estrategia que influye en la decisión de compra en el punto de venta. La integración de estos elementos permite generar experiencias positivas para el consumidor y mejores resultados para la empresa."/>
                     <pic:cNvPicPr/>
                   </pic:nvPicPr>
                   <pic:blipFill>
                     <a:blip r:embed="rId26">
                       <a:extLst>
-                        <a:ext uri="{28A0092B-C50C-407E-A947-70E740481C1C}">
-                          <a14:useLocalDpi xmlns:a14="http://schemas.microsoft.com/office/drawing/2010/main" val="0"/>
+                        <a:ext uri="{96DAC541-7B7A-43D3-8B79-37D633B846F1}">
+                          <asvg:svgBlip xmlns:asvg="http://schemas.microsoft.com/office/drawing/2016/SVG/main" r:embed="rId27"/>
                         </a:ext>
                       </a:extLst>
                     </a:blip>
@@ -15071,15 +15700,21 @@
         <w:rPr>
           <w:rFonts w:cstheme="minorHAnsi"/>
         </w:rPr>
-        <w:t>extremo de una góndola o una estantería donde se colocan artículos de manera promocional (visual</w:t>
-      </w:r>
+        <w:t>extremo de una góndola o una estantería donde se colocan artículos de manera promocional (</w:t>
+      </w:r>
+      <w:proofErr w:type="spellStart"/>
       <w:r>
         <w:rPr>
           <w:rStyle w:val="Extranjerismo"/>
         </w:rPr>
+        <w:t>visual</w:t>
+      </w:r>
+      <w:r>
+        <w:rPr>
+          <w:rStyle w:val="Extranjerismo"/>
+        </w:rPr>
         <w:t>merchandising</w:t>
       </w:r>
-      <w:proofErr w:type="spellStart"/>
       <w:r>
         <w:rPr>
           <w:rFonts w:cstheme="minorHAnsi"/>
@@ -15402,7 +16037,31 @@
         <w:rPr>
           <w:rFonts w:cstheme="minorHAnsi"/>
         </w:rPr>
-        <w:t>son situados en las cajas, el cruce de pasillos, un claro ejemplo las zonas por donde tienen que pasar para pagar donde se logra exponer gran cantidad de artículos para generar venta por impulso.</w:t>
+        <w:t>son situados en las cajas, el cruce de pasillos</w:t>
+      </w:r>
+      <w:r>
+        <w:rPr>
+          <w:rFonts w:cstheme="minorHAnsi"/>
+        </w:rPr>
+        <w:t>;</w:t>
+      </w:r>
+      <w:r>
+        <w:rPr>
+          <w:rFonts w:cstheme="minorHAnsi"/>
+        </w:rPr>
+        <w:t xml:space="preserve"> un claro ejemplo</w:t>
+      </w:r>
+      <w:r>
+        <w:rPr>
+          <w:rFonts w:cstheme="minorHAnsi"/>
+        </w:rPr>
+        <w:t xml:space="preserve"> son</w:t>
+      </w:r>
+      <w:r>
+        <w:rPr>
+          <w:rFonts w:cstheme="minorHAnsi"/>
+        </w:rPr>
+        <w:t xml:space="preserve"> las zonas por donde tienen que pasar para pagar donde se logra exponer gran cantidad de artículos para generar venta por impulso.</w:t>
       </w:r>
     </w:p>
     <w:p>
@@ -15529,7 +16188,15 @@
           <w:b/>
           <w:bCs/>
         </w:rPr>
-        <w:t xml:space="preserve">Visual </w:t>
+        <w:t>Visual</w:t>
+      </w:r>
+      <w:r>
+        <w:rPr>
+          <w:rStyle w:val="Extranjerismo"/>
+          <w:b/>
+          <w:bCs/>
+        </w:rPr>
+        <w:t xml:space="preserve"> </w:t>
       </w:r>
       <w:r>
         <w:rPr>
@@ -15854,8 +16521,6 @@
               <w:ind w:firstLine="0"/>
               <w:rPr>
                 <w:rFonts w:asciiTheme="minorHAnsi" w:hAnsiTheme="minorHAnsi" w:cstheme="minorHAnsi"/>
-                <w:b w:val="0"/>
-                <w:bCs/>
                 <w:szCs w:val="28"/>
                 <w:lang w:eastAsia="es-CO"/>
               </w:rPr>
@@ -15863,8 +16528,6 @@
             <w:r>
               <w:rPr>
                 <w:rFonts w:asciiTheme="minorHAnsi" w:hAnsiTheme="minorHAnsi" w:cstheme="minorHAnsi"/>
-                <w:b w:val="0"/>
-                <w:bCs/>
                 <w:szCs w:val="28"/>
                 <w:lang w:eastAsia="es-CO"/>
               </w:rPr>
@@ -16663,8 +17326,8 @@
       </w:pPr>
     </w:p>
     <w:sectPr>
-      <w:headerReference w:type="default" r:id="rId27"/>
-      <w:footerReference w:type="default" r:id="rId28"/>
+      <w:headerReference w:type="default" r:id="rId28"/>
+      <w:footerReference w:type="default" r:id="rId29"/>
       <w:pgSz w:w="12240" w:h="15840"/>
       <w:pgMar w:top="1701" w:right="1134" w:bottom="1134" w:left="1134" w:header="709" w:footer="737" w:gutter="0"/>
       <w:pgNumType w:start="1"/>
@@ -16677,7 +17340,7 @@
 </file>
 
 <file path=word/endnotes.xml><?xml version="1.0" encoding="utf-8"?>
-<w:endnotes xmlns:wpc="http://schemas.microsoft.com/office/word/2010/wordprocessingCanvas" xmlns:cx="http://schemas.microsoft.com/office/drawing/2014/chartex" xmlns:cx1="http://schemas.microsoft.com/office/drawing/2015/9/8/chartex" xmlns:cx2="http://schemas.microsoft.com/office/drawing/2015/10/21/chartex" xmlns:cx3="http://schemas.microsoft.com/office/drawing/2016/5/9/chartex" xmlns:cx4="http://schemas.microsoft.com/office/drawing/2016/5/10/chartex" xmlns:cx5="http://schemas.microsoft.com/office/drawing/2016/5/11/chartex" xmlns:cx6="http://schemas.microsoft.com/office/drawing/2016/5/12/chartex" xmlns:cx7="http://schemas.microsoft.com/office/drawing/2016/5/13/chartex" xmlns:cx8="http://schemas.microsoft.com/office/drawing/2016/5/14/chartex" xmlns:mc="http://schemas.openxmlformats.org/markup-compatibility/2006" xmlns:aink="http://schemas.microsoft.com/office/drawing/2016/ink" xmlns:am3d="http://schemas.microsoft.com/office/drawing/2017/model3d" xmlns:o="urn:schemas-microsoft-com:office:office" xmlns:oel="http://schemas.microsoft.com/office/2019/extlst" xmlns:r="http://schemas.openxmlformats.org/officeDocument/2006/relationships" xmlns:m="http://schemas.openxmlformats.org/officeDocument/2006/math" xmlns:v="urn:schemas-microsoft-com:vml" xmlns:wp14="http://schemas.microsoft.com/office/word/2010/wordprocessingDrawing" xmlns:wp="http://schemas.openxmlformats.org/drawingml/2006/wordprocessingDrawing" xmlns:w10="urn:schemas-microsoft-com:office:word" xmlns:w="http://schemas.openxmlformats.org/wordprocessingml/2006/main" xmlns:w14="http://schemas.microsoft.com/office/word/2010/wordml" xmlns:w15="http://schemas.microsoft.com/office/word/2012/wordml" xmlns:w16cei="http://schemas.microsoft.com/office/word/2026/wordml/cei" xmlns:w16cex="http://schemas.microsoft.com/office/word/2018/wordml/cex" xmlns:w16cid="http://schemas.microsoft.com/office/word/2016/wordml/cid" xmlns:w16="http://schemas.microsoft.com/office/word/2018/wordml" xmlns:w16du="http://schemas.microsoft.com/office/word/2023/wordml/word16du" xmlns:w16sdtdh="http://schemas.microsoft.com/office/word/2020/wordml/sdtdatahash" xmlns:w16sdtfl="http://schemas.microsoft.com/office/word/2024/wordml/sdtformatlock" xmlns:w16se="http://schemas.microsoft.com/office/word/2015/wordml/symex" xmlns:wpg="http://schemas.microsoft.com/office/word/2010/wordprocessingGroup" xmlns:wpi="http://schemas.microsoft.com/office/word/2010/wordprocessingInk" xmlns:wne="http://schemas.microsoft.com/office/word/2006/wordml" xmlns:wps="http://schemas.microsoft.com/office/word/2010/wordprocessingShape" mc:Ignorable="w14 w15 w16se w16cid w16 w16cex w16sdtdh w16sdtfl w16du wp14">
+<w:endnotes xmlns:wpc="http://schemas.microsoft.com/office/word/2010/wordprocessingCanvas" xmlns:cx="http://schemas.microsoft.com/office/drawing/2014/chartex" xmlns:cx1="http://schemas.microsoft.com/office/drawing/2015/9/8/chartex" xmlns:cx2="http://schemas.microsoft.com/office/drawing/2015/10/21/chartex" xmlns:cx3="http://schemas.microsoft.com/office/drawing/2016/5/9/chartex" xmlns:cx4="http://schemas.microsoft.com/office/drawing/2016/5/10/chartex" xmlns:cx5="http://schemas.microsoft.com/office/drawing/2016/5/11/chartex" xmlns:cx6="http://schemas.microsoft.com/office/drawing/2016/5/12/chartex" xmlns:cx7="http://schemas.microsoft.com/office/drawing/2016/5/13/chartex" xmlns:cx8="http://schemas.microsoft.com/office/drawing/2016/5/14/chartex" xmlns:mc="http://schemas.openxmlformats.org/markup-compatibility/2006" xmlns:aink="http://schemas.microsoft.com/office/drawing/2016/ink" xmlns:am3d="http://schemas.microsoft.com/office/drawing/2017/model3d" xmlns:o="urn:schemas-microsoft-com:office:office" xmlns:oel="http://schemas.microsoft.com/office/2019/extlst" xmlns:r="http://schemas.openxmlformats.org/officeDocument/2006/relationships" xmlns:m="http://schemas.openxmlformats.org/officeDocument/2006/math" xmlns:v="urn:schemas-microsoft-com:vml" xmlns:wp14="http://schemas.microsoft.com/office/word/2010/wordprocessingDrawing" xmlns:wp="http://schemas.openxmlformats.org/drawingml/2006/wordprocessingDrawing" xmlns:w10="urn:schemas-microsoft-com:office:word" xmlns:w="http://schemas.openxmlformats.org/wordprocessingml/2006/main" xmlns:w14="http://schemas.microsoft.com/office/word/2010/wordml" xmlns:w15="http://schemas.microsoft.com/office/word/2012/wordml" xmlns:w16cex="http://schemas.microsoft.com/office/word/2018/wordml/cex" xmlns:w16cid="http://schemas.microsoft.com/office/word/2016/wordml/cid" xmlns:w16="http://schemas.microsoft.com/office/word/2018/wordml" xmlns:w16du="http://schemas.microsoft.com/office/word/2023/wordml/word16du" xmlns:w16sdtdh="http://schemas.microsoft.com/office/word/2020/wordml/sdtdatahash" xmlns:w16sdtfl="http://schemas.microsoft.com/office/word/2024/wordml/sdtformatlock" xmlns:w16se="http://schemas.microsoft.com/office/word/2015/wordml/symex" xmlns:wpg="http://schemas.microsoft.com/office/word/2010/wordprocessingGroup" xmlns:wpi="http://schemas.microsoft.com/office/word/2010/wordprocessingInk" xmlns:wne="http://schemas.microsoft.com/office/word/2006/wordml" xmlns:wps="http://schemas.microsoft.com/office/word/2010/wordprocessingShape" mc:Ignorable="w14 w15 w16se w16cid w16 w16cex w16sdtdh w16sdtfl w16du wp14">
   <w:endnote w:type="separator" w:id="-1">
     <w:p>
       <w:pPr>
@@ -16702,7 +17365,7 @@
 </file>
 
 <file path=word/footer1.xml><?xml version="1.0" encoding="utf-8"?>
-<w:ftr xmlns:wpc="http://schemas.microsoft.com/office/word/2010/wordprocessingCanvas" xmlns:cx="http://schemas.microsoft.com/office/drawing/2014/chartex" xmlns:cx1="http://schemas.microsoft.com/office/drawing/2015/9/8/chartex" xmlns:cx2="http://schemas.microsoft.com/office/drawing/2015/10/21/chartex" xmlns:cx3="http://schemas.microsoft.com/office/drawing/2016/5/9/chartex" xmlns:cx4="http://schemas.microsoft.com/office/drawing/2016/5/10/chartex" xmlns:cx5="http://schemas.microsoft.com/office/drawing/2016/5/11/chartex" xmlns:cx6="http://schemas.microsoft.com/office/drawing/2016/5/12/chartex" xmlns:cx7="http://schemas.microsoft.com/office/drawing/2016/5/13/chartex" xmlns:cx8="http://schemas.microsoft.com/office/drawing/2016/5/14/chartex" xmlns:mc="http://schemas.openxmlformats.org/markup-compatibility/2006" xmlns:aink="http://schemas.microsoft.com/office/drawing/2016/ink" xmlns:am3d="http://schemas.microsoft.com/office/drawing/2017/model3d" xmlns:o="urn:schemas-microsoft-com:office:office" xmlns:oel="http://schemas.microsoft.com/office/2019/extlst" xmlns:r="http://schemas.openxmlformats.org/officeDocument/2006/relationships" xmlns:m="http://schemas.openxmlformats.org/officeDocument/2006/math" xmlns:v="urn:schemas-microsoft-com:vml" xmlns:wp14="http://schemas.microsoft.com/office/word/2010/wordprocessingDrawing" xmlns:wp="http://schemas.openxmlformats.org/drawingml/2006/wordprocessingDrawing" xmlns:w10="urn:schemas-microsoft-com:office:word" xmlns:w="http://schemas.openxmlformats.org/wordprocessingml/2006/main" xmlns:w14="http://schemas.microsoft.com/office/word/2010/wordml" xmlns:w15="http://schemas.microsoft.com/office/word/2012/wordml" xmlns:w16cei="http://schemas.microsoft.com/office/word/2026/wordml/cei" xmlns:w16cex="http://schemas.microsoft.com/office/word/2018/wordml/cex" xmlns:w16cid="http://schemas.microsoft.com/office/word/2016/wordml/cid" xmlns:w16="http://schemas.microsoft.com/office/word/2018/wordml" xmlns:w16du="http://schemas.microsoft.com/office/word/2023/wordml/word16du" xmlns:w16sdtdh="http://schemas.microsoft.com/office/word/2020/wordml/sdtdatahash" xmlns:w16sdtfl="http://schemas.microsoft.com/office/word/2024/wordml/sdtformatlock" xmlns:w16se="http://schemas.microsoft.com/office/word/2015/wordml/symex" xmlns:wpg="http://schemas.microsoft.com/office/word/2010/wordprocessingGroup" xmlns:wpi="http://schemas.microsoft.com/office/word/2010/wordprocessingInk" xmlns:wne="http://schemas.microsoft.com/office/word/2006/wordml" xmlns:wps="http://schemas.microsoft.com/office/word/2010/wordprocessingShape" mc:Ignorable="w14 w15 w16se w16cid w16 w16cex w16sdtdh w16sdtfl w16du wp14">
+<w:ftr xmlns:wpc="http://schemas.microsoft.com/office/word/2010/wordprocessingCanvas" xmlns:cx="http://schemas.microsoft.com/office/drawing/2014/chartex" xmlns:cx1="http://schemas.microsoft.com/office/drawing/2015/9/8/chartex" xmlns:cx2="http://schemas.microsoft.com/office/drawing/2015/10/21/chartex" xmlns:cx3="http://schemas.microsoft.com/office/drawing/2016/5/9/chartex" xmlns:cx4="http://schemas.microsoft.com/office/drawing/2016/5/10/chartex" xmlns:cx5="http://schemas.microsoft.com/office/drawing/2016/5/11/chartex" xmlns:cx6="http://schemas.microsoft.com/office/drawing/2016/5/12/chartex" xmlns:cx7="http://schemas.microsoft.com/office/drawing/2016/5/13/chartex" xmlns:cx8="http://schemas.microsoft.com/office/drawing/2016/5/14/chartex" xmlns:mc="http://schemas.openxmlformats.org/markup-compatibility/2006" xmlns:aink="http://schemas.microsoft.com/office/drawing/2016/ink" xmlns:am3d="http://schemas.microsoft.com/office/drawing/2017/model3d" xmlns:o="urn:schemas-microsoft-com:office:office" xmlns:oel="http://schemas.microsoft.com/office/2019/extlst" xmlns:r="http://schemas.openxmlformats.org/officeDocument/2006/relationships" xmlns:m="http://schemas.openxmlformats.org/officeDocument/2006/math" xmlns:v="urn:schemas-microsoft-com:vml" xmlns:wp14="http://schemas.microsoft.com/office/word/2010/wordprocessingDrawing" xmlns:wp="http://schemas.openxmlformats.org/drawingml/2006/wordprocessingDrawing" xmlns:w10="urn:schemas-microsoft-com:office:word" xmlns:w="http://schemas.openxmlformats.org/wordprocessingml/2006/main" xmlns:w14="http://schemas.microsoft.com/office/word/2010/wordml" xmlns:w15="http://schemas.microsoft.com/office/word/2012/wordml" xmlns:w16cex="http://schemas.microsoft.com/office/word/2018/wordml/cex" xmlns:w16cid="http://schemas.microsoft.com/office/word/2016/wordml/cid" xmlns:w16="http://schemas.microsoft.com/office/word/2018/wordml" xmlns:w16du="http://schemas.microsoft.com/office/word/2023/wordml/word16du" xmlns:w16sdtdh="http://schemas.microsoft.com/office/word/2020/wordml/sdtdatahash" xmlns:w16sdtfl="http://schemas.microsoft.com/office/word/2024/wordml/sdtformatlock" xmlns:w16se="http://schemas.microsoft.com/office/word/2015/wordml/symex" xmlns:wpg="http://schemas.microsoft.com/office/word/2010/wordprocessingGroup" xmlns:wpi="http://schemas.microsoft.com/office/word/2010/wordprocessingInk" xmlns:wne="http://schemas.microsoft.com/office/word/2006/wordml" xmlns:wps="http://schemas.microsoft.com/office/word/2010/wordprocessingShape" mc:Ignorable="w14 w15 w16se w16cid w16 w16cex w16sdtdh w16sdtfl w16du wp14">
   <w:sdt>
     <w:sdtPr>
       <w:id w:val="-1465197936"/>
@@ -16747,7 +17410,7 @@
 </file>
 
 <file path=word/footnotes.xml><?xml version="1.0" encoding="utf-8"?>
-<w:footnotes xmlns:wpc="http://schemas.microsoft.com/office/word/2010/wordprocessingCanvas" xmlns:cx="http://schemas.microsoft.com/office/drawing/2014/chartex" xmlns:cx1="http://schemas.microsoft.com/office/drawing/2015/9/8/chartex" xmlns:cx2="http://schemas.microsoft.com/office/drawing/2015/10/21/chartex" xmlns:cx3="http://schemas.microsoft.com/office/drawing/2016/5/9/chartex" xmlns:cx4="http://schemas.microsoft.com/office/drawing/2016/5/10/chartex" xmlns:cx5="http://schemas.microsoft.com/office/drawing/2016/5/11/chartex" xmlns:cx6="http://schemas.microsoft.com/office/drawing/2016/5/12/chartex" xmlns:cx7="http://schemas.microsoft.com/office/drawing/2016/5/13/chartex" xmlns:cx8="http://schemas.microsoft.com/office/drawing/2016/5/14/chartex" xmlns:mc="http://schemas.openxmlformats.org/markup-compatibility/2006" xmlns:aink="http://schemas.microsoft.com/office/drawing/2016/ink" xmlns:am3d="http://schemas.microsoft.com/office/drawing/2017/model3d" xmlns:o="urn:schemas-microsoft-com:office:office" xmlns:oel="http://schemas.microsoft.com/office/2019/extlst" xmlns:r="http://schemas.openxmlformats.org/officeDocument/2006/relationships" xmlns:m="http://schemas.openxmlformats.org/officeDocument/2006/math" xmlns:v="urn:schemas-microsoft-com:vml" xmlns:wp14="http://schemas.microsoft.com/office/word/2010/wordprocessingDrawing" xmlns:wp="http://schemas.openxmlformats.org/drawingml/2006/wordprocessingDrawing" xmlns:w10="urn:schemas-microsoft-com:office:word" xmlns:w="http://schemas.openxmlformats.org/wordprocessingml/2006/main" xmlns:w14="http://schemas.microsoft.com/office/word/2010/wordml" xmlns:w15="http://schemas.microsoft.com/office/word/2012/wordml" xmlns:w16cei="http://schemas.microsoft.com/office/word/2026/wordml/cei" xmlns:w16cex="http://schemas.microsoft.com/office/word/2018/wordml/cex" xmlns:w16cid="http://schemas.microsoft.com/office/word/2016/wordml/cid" xmlns:w16="http://schemas.microsoft.com/office/word/2018/wordml" xmlns:w16du="http://schemas.microsoft.com/office/word/2023/wordml/word16du" xmlns:w16sdtdh="http://schemas.microsoft.com/office/word/2020/wordml/sdtdatahash" xmlns:w16sdtfl="http://schemas.microsoft.com/office/word/2024/wordml/sdtformatlock" xmlns:w16se="http://schemas.microsoft.com/office/word/2015/wordml/symex" xmlns:wpg="http://schemas.microsoft.com/office/word/2010/wordprocessingGroup" xmlns:wpi="http://schemas.microsoft.com/office/word/2010/wordprocessingInk" xmlns:wne="http://schemas.microsoft.com/office/word/2006/wordml" xmlns:wps="http://schemas.microsoft.com/office/word/2010/wordprocessingShape" mc:Ignorable="w14 w15 w16se w16cid w16 w16cex w16sdtdh w16sdtfl w16du wp14">
+<w:footnotes xmlns:wpc="http://schemas.microsoft.com/office/word/2010/wordprocessingCanvas" xmlns:cx="http://schemas.microsoft.com/office/drawing/2014/chartex" xmlns:cx1="http://schemas.microsoft.com/office/drawing/2015/9/8/chartex" xmlns:cx2="http://schemas.microsoft.com/office/drawing/2015/10/21/chartex" xmlns:cx3="http://schemas.microsoft.com/office/drawing/2016/5/9/chartex" xmlns:cx4="http://schemas.microsoft.com/office/drawing/2016/5/10/chartex" xmlns:cx5="http://schemas.microsoft.com/office/drawing/2016/5/11/chartex" xmlns:cx6="http://schemas.microsoft.com/office/drawing/2016/5/12/chartex" xmlns:cx7="http://schemas.microsoft.com/office/drawing/2016/5/13/chartex" xmlns:cx8="http://schemas.microsoft.com/office/drawing/2016/5/14/chartex" xmlns:mc="http://schemas.openxmlformats.org/markup-compatibility/2006" xmlns:aink="http://schemas.microsoft.com/office/drawing/2016/ink" xmlns:am3d="http://schemas.microsoft.com/office/drawing/2017/model3d" xmlns:o="urn:schemas-microsoft-com:office:office" xmlns:oel="http://schemas.microsoft.com/office/2019/extlst" xmlns:r="http://schemas.openxmlformats.org/officeDocument/2006/relationships" xmlns:m="http://schemas.openxmlformats.org/officeDocument/2006/math" xmlns:v="urn:schemas-microsoft-com:vml" xmlns:wp14="http://schemas.microsoft.com/office/word/2010/wordprocessingDrawing" xmlns:wp="http://schemas.openxmlformats.org/drawingml/2006/wordprocessingDrawing" xmlns:w10="urn:schemas-microsoft-com:office:word" xmlns:w="http://schemas.openxmlformats.org/wordprocessingml/2006/main" xmlns:w14="http://schemas.microsoft.com/office/word/2010/wordml" xmlns:w15="http://schemas.microsoft.com/office/word/2012/wordml" xmlns:w16cex="http://schemas.microsoft.com/office/word/2018/wordml/cex" xmlns:w16cid="http://schemas.microsoft.com/office/word/2016/wordml/cid" xmlns:w16="http://schemas.microsoft.com/office/word/2018/wordml" xmlns:w16du="http://schemas.microsoft.com/office/word/2023/wordml/word16du" xmlns:w16sdtdh="http://schemas.microsoft.com/office/word/2020/wordml/sdtdatahash" xmlns:w16sdtfl="http://schemas.microsoft.com/office/word/2024/wordml/sdtformatlock" xmlns:w16se="http://schemas.microsoft.com/office/word/2015/wordml/symex" xmlns:wpg="http://schemas.microsoft.com/office/word/2010/wordprocessingGroup" xmlns:wpi="http://schemas.microsoft.com/office/word/2010/wordprocessingInk" xmlns:wne="http://schemas.microsoft.com/office/word/2006/wordml" xmlns:wps="http://schemas.microsoft.com/office/word/2010/wordprocessingShape" mc:Ignorable="w14 w15 w16se w16cid w16 w16cex w16sdtdh w16sdtfl w16du wp14">
   <w:footnote w:type="separator" w:id="-1">
     <w:p>
       <w:pPr>
@@ -16772,7 +17435,7 @@
 </file>
 
 <file path=word/header1.xml><?xml version="1.0" encoding="utf-8"?>
-<w:hdr xmlns:wpc="http://schemas.microsoft.com/office/word/2010/wordprocessingCanvas" xmlns:cx="http://schemas.microsoft.com/office/drawing/2014/chartex" xmlns:cx1="http://schemas.microsoft.com/office/drawing/2015/9/8/chartex" xmlns:cx2="http://schemas.microsoft.com/office/drawing/2015/10/21/chartex" xmlns:cx3="http://schemas.microsoft.com/office/drawing/2016/5/9/chartex" xmlns:cx4="http://schemas.microsoft.com/office/drawing/2016/5/10/chartex" xmlns:cx5="http://schemas.microsoft.com/office/drawing/2016/5/11/chartex" xmlns:cx6="http://schemas.microsoft.com/office/drawing/2016/5/12/chartex" xmlns:cx7="http://schemas.microsoft.com/office/drawing/2016/5/13/chartex" xmlns:cx8="http://schemas.microsoft.com/office/drawing/2016/5/14/chartex" xmlns:mc="http://schemas.openxmlformats.org/markup-compatibility/2006" xmlns:aink="http://schemas.microsoft.com/office/drawing/2016/ink" xmlns:am3d="http://schemas.microsoft.com/office/drawing/2017/model3d" xmlns:o="urn:schemas-microsoft-com:office:office" xmlns:oel="http://schemas.microsoft.com/office/2019/extlst" xmlns:r="http://schemas.openxmlformats.org/officeDocument/2006/relationships" xmlns:m="http://schemas.openxmlformats.org/officeDocument/2006/math" xmlns:v="urn:schemas-microsoft-com:vml" xmlns:wp14="http://schemas.microsoft.com/office/word/2010/wordprocessingDrawing" xmlns:wp="http://schemas.openxmlformats.org/drawingml/2006/wordprocessingDrawing" xmlns:w10="urn:schemas-microsoft-com:office:word" xmlns:w="http://schemas.openxmlformats.org/wordprocessingml/2006/main" xmlns:w14="http://schemas.microsoft.com/office/word/2010/wordml" xmlns:w15="http://schemas.microsoft.com/office/word/2012/wordml" xmlns:w16cei="http://schemas.microsoft.com/office/word/2026/wordml/cei" xmlns:w16cex="http://schemas.microsoft.com/office/word/2018/wordml/cex" xmlns:w16cid="http://schemas.microsoft.com/office/word/2016/wordml/cid" xmlns:w16="http://schemas.microsoft.com/office/word/2018/wordml" xmlns:w16du="http://schemas.microsoft.com/office/word/2023/wordml/word16du" xmlns:w16sdtdh="http://schemas.microsoft.com/office/word/2020/wordml/sdtdatahash" xmlns:w16sdtfl="http://schemas.microsoft.com/office/word/2024/wordml/sdtformatlock" xmlns:w16se="http://schemas.microsoft.com/office/word/2015/wordml/symex" xmlns:wpg="http://schemas.microsoft.com/office/word/2010/wordprocessingGroup" xmlns:wpi="http://schemas.microsoft.com/office/word/2010/wordprocessingInk" xmlns:wne="http://schemas.microsoft.com/office/word/2006/wordml" xmlns:wps="http://schemas.microsoft.com/office/word/2010/wordprocessingShape" mc:Ignorable="w14 w15 w16se w16cid w16 w16cex w16sdtdh w16sdtfl w16du wp14">
+<w:hdr xmlns:wpc="http://schemas.microsoft.com/office/word/2010/wordprocessingCanvas" xmlns:cx="http://schemas.microsoft.com/office/drawing/2014/chartex" xmlns:cx1="http://schemas.microsoft.com/office/drawing/2015/9/8/chartex" xmlns:cx2="http://schemas.microsoft.com/office/drawing/2015/10/21/chartex" xmlns:cx3="http://schemas.microsoft.com/office/drawing/2016/5/9/chartex" xmlns:cx4="http://schemas.microsoft.com/office/drawing/2016/5/10/chartex" xmlns:cx5="http://schemas.microsoft.com/office/drawing/2016/5/11/chartex" xmlns:cx6="http://schemas.microsoft.com/office/drawing/2016/5/12/chartex" xmlns:cx7="http://schemas.microsoft.com/office/drawing/2016/5/13/chartex" xmlns:cx8="http://schemas.microsoft.com/office/drawing/2016/5/14/chartex" xmlns:mc="http://schemas.openxmlformats.org/markup-compatibility/2006" xmlns:aink="http://schemas.microsoft.com/office/drawing/2016/ink" xmlns:am3d="http://schemas.microsoft.com/office/drawing/2017/model3d" xmlns:o="urn:schemas-microsoft-com:office:office" xmlns:oel="http://schemas.microsoft.com/office/2019/extlst" xmlns:r="http://schemas.openxmlformats.org/officeDocument/2006/relationships" xmlns:m="http://schemas.openxmlformats.org/officeDocument/2006/math" xmlns:v="urn:schemas-microsoft-com:vml" xmlns:wp14="http://schemas.microsoft.com/office/word/2010/wordprocessingDrawing" xmlns:wp="http://schemas.openxmlformats.org/drawingml/2006/wordprocessingDrawing" xmlns:w10="urn:schemas-microsoft-com:office:word" xmlns:w="http://schemas.openxmlformats.org/wordprocessingml/2006/main" xmlns:w14="http://schemas.microsoft.com/office/word/2010/wordml" xmlns:w15="http://schemas.microsoft.com/office/word/2012/wordml" xmlns:w16cex="http://schemas.microsoft.com/office/word/2018/wordml/cex" xmlns:w16cid="http://schemas.microsoft.com/office/word/2016/wordml/cid" xmlns:w16="http://schemas.microsoft.com/office/word/2018/wordml" xmlns:w16du="http://schemas.microsoft.com/office/word/2023/wordml/word16du" xmlns:w16sdtdh="http://schemas.microsoft.com/office/word/2020/wordml/sdtdatahash" xmlns:w16sdtfl="http://schemas.microsoft.com/office/word/2024/wordml/sdtformatlock" xmlns:w16se="http://schemas.microsoft.com/office/word/2015/wordml/symex" xmlns:wpg="http://schemas.microsoft.com/office/word/2010/wordprocessingGroup" xmlns:wpi="http://schemas.microsoft.com/office/word/2010/wordprocessingInk" xmlns:wne="http://schemas.microsoft.com/office/word/2006/wordml" xmlns:wps="http://schemas.microsoft.com/office/word/2010/wordprocessingShape" mc:Ignorable="w14 w15 w16se w16cid w16 w16cex w16sdtdh w16sdtfl w16du wp14">
   <w:p>
     <w:pPr>
       <w:pStyle w:val="Encabezado"/>
@@ -16858,7 +17521,7 @@
 </file>
 
 <file path=word/numbering.xml><?xml version="1.0" encoding="utf-8"?>
-<w:numbering xmlns:wpc="http://schemas.microsoft.com/office/word/2010/wordprocessingCanvas" xmlns:cx="http://schemas.microsoft.com/office/drawing/2014/chartex" xmlns:cx1="http://schemas.microsoft.com/office/drawing/2015/9/8/chartex" xmlns:cx2="http://schemas.microsoft.com/office/drawing/2015/10/21/chartex" xmlns:cx3="http://schemas.microsoft.com/office/drawing/2016/5/9/chartex" xmlns:cx4="http://schemas.microsoft.com/office/drawing/2016/5/10/chartex" xmlns:cx5="http://schemas.microsoft.com/office/drawing/2016/5/11/chartex" xmlns:cx6="http://schemas.microsoft.com/office/drawing/2016/5/12/chartex" xmlns:cx7="http://schemas.microsoft.com/office/drawing/2016/5/13/chartex" xmlns:cx8="http://schemas.microsoft.com/office/drawing/2016/5/14/chartex" xmlns:mc="http://schemas.openxmlformats.org/markup-compatibility/2006" xmlns:aink="http://schemas.microsoft.com/office/drawing/2016/ink" xmlns:am3d="http://schemas.microsoft.com/office/drawing/2017/model3d" xmlns:o="urn:schemas-microsoft-com:office:office" xmlns:oel="http://schemas.microsoft.com/office/2019/extlst" xmlns:r="http://schemas.openxmlformats.org/officeDocument/2006/relationships" xmlns:m="http://schemas.openxmlformats.org/officeDocument/2006/math" xmlns:v="urn:schemas-microsoft-com:vml" xmlns:wp14="http://schemas.microsoft.com/office/word/2010/wordprocessingDrawing" xmlns:wp="http://schemas.openxmlformats.org/drawingml/2006/wordprocessingDrawing" xmlns:w10="urn:schemas-microsoft-com:office:word" xmlns:w="http://schemas.openxmlformats.org/wordprocessingml/2006/main" xmlns:w14="http://schemas.microsoft.com/office/word/2010/wordml" xmlns:w15="http://schemas.microsoft.com/office/word/2012/wordml" xmlns:w16cei="http://schemas.microsoft.com/office/word/2026/wordml/cei" xmlns:w16cex="http://schemas.microsoft.com/office/word/2018/wordml/cex" xmlns:w16cid="http://schemas.microsoft.com/office/word/2016/wordml/cid" xmlns:w16="http://schemas.microsoft.com/office/word/2018/wordml" xmlns:w16du="http://schemas.microsoft.com/office/word/2023/wordml/word16du" xmlns:w16sdtdh="http://schemas.microsoft.com/office/word/2020/wordml/sdtdatahash" xmlns:w16sdtfl="http://schemas.microsoft.com/office/word/2024/wordml/sdtformatlock" xmlns:w16se="http://schemas.microsoft.com/office/word/2015/wordml/symex" xmlns:wpg="http://schemas.microsoft.com/office/word/2010/wordprocessingGroup" xmlns:wpi="http://schemas.microsoft.com/office/word/2010/wordprocessingInk" xmlns:wne="http://schemas.microsoft.com/office/word/2006/wordml" xmlns:wps="http://schemas.microsoft.com/office/word/2010/wordprocessingShape" mc:Ignorable="w14 w15 w16se w16cid w16 w16cex w16sdtdh w16sdtfl w16du wp14">
+<w:numbering xmlns:wpc="http://schemas.microsoft.com/office/word/2010/wordprocessingCanvas" xmlns:cx="http://schemas.microsoft.com/office/drawing/2014/chartex" xmlns:cx1="http://schemas.microsoft.com/office/drawing/2015/9/8/chartex" xmlns:cx2="http://schemas.microsoft.com/office/drawing/2015/10/21/chartex" xmlns:cx3="http://schemas.microsoft.com/office/drawing/2016/5/9/chartex" xmlns:cx4="http://schemas.microsoft.com/office/drawing/2016/5/10/chartex" xmlns:cx5="http://schemas.microsoft.com/office/drawing/2016/5/11/chartex" xmlns:cx6="http://schemas.microsoft.com/office/drawing/2016/5/12/chartex" xmlns:cx7="http://schemas.microsoft.com/office/drawing/2016/5/13/chartex" xmlns:cx8="http://schemas.microsoft.com/office/drawing/2016/5/14/chartex" xmlns:mc="http://schemas.openxmlformats.org/markup-compatibility/2006" xmlns:aink="http://schemas.microsoft.com/office/drawing/2016/ink" xmlns:am3d="http://schemas.microsoft.com/office/drawing/2017/model3d" xmlns:o="urn:schemas-microsoft-com:office:office" xmlns:oel="http://schemas.microsoft.com/office/2019/extlst" xmlns:r="http://schemas.openxmlformats.org/officeDocument/2006/relationships" xmlns:m="http://schemas.openxmlformats.org/officeDocument/2006/math" xmlns:v="urn:schemas-microsoft-com:vml" xmlns:wp14="http://schemas.microsoft.com/office/word/2010/wordprocessingDrawing" xmlns:wp="http://schemas.openxmlformats.org/drawingml/2006/wordprocessingDrawing" xmlns:w10="urn:schemas-microsoft-com:office:word" xmlns:w="http://schemas.openxmlformats.org/wordprocessingml/2006/main" xmlns:w14="http://schemas.microsoft.com/office/word/2010/wordml" xmlns:w15="http://schemas.microsoft.com/office/word/2012/wordml" xmlns:w16cex="http://schemas.microsoft.com/office/word/2018/wordml/cex" xmlns:w16cid="http://schemas.microsoft.com/office/word/2016/wordml/cid" xmlns:w16="http://schemas.microsoft.com/office/word/2018/wordml" xmlns:w16du="http://schemas.microsoft.com/office/word/2023/wordml/word16du" xmlns:w16sdtdh="http://schemas.microsoft.com/office/word/2020/wordml/sdtdatahash" xmlns:w16sdtfl="http://schemas.microsoft.com/office/word/2024/wordml/sdtformatlock" xmlns:w16se="http://schemas.microsoft.com/office/word/2015/wordml/symex" xmlns:wpg="http://schemas.microsoft.com/office/word/2010/wordprocessingGroup" xmlns:wpi="http://schemas.microsoft.com/office/word/2010/wordprocessingInk" xmlns:wne="http://schemas.microsoft.com/office/word/2006/wordml" xmlns:wps="http://schemas.microsoft.com/office/word/2010/wordprocessingShape" mc:Ignorable="w14 w15 w16se w16cid w16 w16cex w16sdtdh w16sdtfl w16du wp14">
   <w:abstractNum w:abstractNumId="0" w15:restartNumberingAfterBreak="0">
     <w:nsid w:val="FFFFFF89"/>
     <w:multiLevelType w:val="singleLevel"/>
@@ -23528,6 +24191,17 @@
 </file>
 
 <file path=customXml/item1.xml><?xml version="1.0" encoding="utf-8"?>
+<p:properties xmlns:p="http://schemas.microsoft.com/office/2006/metadata/properties" xmlns:xsi="http://www.w3.org/2001/XMLSchema-instance" xmlns:pc="http://schemas.microsoft.com/office/infopath/2007/PartnerControls">
+  <documentManagement>
+    <TaxCatchAll xmlns="13c90a0b-73bc-4dc0-be5f-28d77b615beb" xsi:nil="true"/>
+    <lcf76f155ced4ddcb4097134ff3c332f xmlns="13c93bba-48ce-428c-bfe5-88b42c19b028">
+      <Terms xmlns="http://schemas.microsoft.com/office/infopath/2007/PartnerControls"/>
+    </lcf76f155ced4ddcb4097134ff3c332f>
+  </documentManagement>
+</p:properties>
+</file>
+
+<file path=customXml/item2.xml><?xml version="1.0" encoding="utf-8"?>
 <ct:contentTypeSchema xmlns:ct="http://schemas.microsoft.com/office/2006/metadata/contentType" xmlns:ma="http://schemas.microsoft.com/office/2006/metadata/properties/metaAttributes" ct:_="" ma:_="" ma:contentTypeName="Documento" ma:contentTypeID="0x0101006A81D6BD42E8DF4C91013959704817E1" ma:contentTypeVersion="15" ma:contentTypeDescription="Crear nuevo documento." ma:contentTypeScope="" ma:versionID="bf4f72ffd194f0963ff564daca6869f7">
   <xsd:schema xmlns:xsd="http://www.w3.org/2001/XMLSchema" xmlns:xs="http://www.w3.org/2001/XMLSchema" xmlns:p="http://schemas.microsoft.com/office/2006/metadata/properties" xmlns:ns2="13c90a0b-73bc-4dc0-be5f-28d77b615beb" xmlns:ns3="13c93bba-48ce-428c-bfe5-88b42c19b028" targetNamespace="http://schemas.microsoft.com/office/2006/metadata/properties" ma:root="true" ma:fieldsID="8718d6f4873a5b1392a45044efa78385" ns2:_="" ns3:_="">
     <xsd:import namespace="13c90a0b-73bc-4dc0-be5f-28d77b615beb"/>
@@ -23762,22 +24436,7 @@
 </ct:contentTypeSchema>
 </file>
 
-<file path=customXml/item2.xml><?xml version="1.0" encoding="utf-8"?>
-<p:properties xmlns:p="http://schemas.microsoft.com/office/2006/metadata/properties" xmlns:xsi="http://www.w3.org/2001/XMLSchema-instance" xmlns:pc="http://schemas.microsoft.com/office/infopath/2007/PartnerControls">
-  <documentManagement>
-    <TaxCatchAll xmlns="13c90a0b-73bc-4dc0-be5f-28d77b615beb" xsi:nil="true"/>
-    <lcf76f155ced4ddcb4097134ff3c332f xmlns="13c93bba-48ce-428c-bfe5-88b42c19b028">
-      <Terms xmlns="http://schemas.microsoft.com/office/infopath/2007/PartnerControls"/>
-    </lcf76f155ced4ddcb4097134ff3c332f>
-  </documentManagement>
-</p:properties>
-</file>
-
 <file path=customXml/item3.xml><?xml version="1.0" encoding="utf-8"?>
-<b:Sources xmlns:b="http://schemas.openxmlformats.org/officeDocument/2006/bibliography" xmlns="http://schemas.openxmlformats.org/officeDocument/2006/bibliography" SelectedStyle="\APASixthEditionOfficeOnline.xsl" StyleName="APA" Version="6"/>
-</file>
-
-<file path=customXml/item4.xml><?xml version="1.0" encoding="utf-8"?>
 <?mso-contentType ?>
 <FormTemplates xmlns="http://schemas.microsoft.com/sharepoint/v3/contenttype/forms">
   <Display>DocumentLibraryForm</Display>
@@ -23786,7 +24445,22 @@
 </FormTemplates>
 </file>
 
+<file path=customXml/item4.xml><?xml version="1.0" encoding="utf-8"?>
+<b:Sources xmlns:b="http://schemas.openxmlformats.org/officeDocument/2006/bibliography" xmlns="http://schemas.openxmlformats.org/officeDocument/2006/bibliography" SelectedStyle="\APASixthEditionOfficeOnline.xsl" StyleName="APA" Version="6"/>
+</file>
+
 <file path=customXml/itemProps1.xml><?xml version="1.0" encoding="utf-8"?>
+<ds:datastoreItem xmlns:ds="http://schemas.openxmlformats.org/officeDocument/2006/customXml" ds:itemID="{1279454D-02BE-4A9C-A117-DCD1573E2608}">
+  <ds:schemaRefs>
+    <ds:schemaRef ds:uri="http://schemas.microsoft.com/office/2006/metadata/properties"/>
+    <ds:schemaRef ds:uri="http://schemas.microsoft.com/office/infopath/2007/PartnerControls"/>
+    <ds:schemaRef ds:uri="13c90a0b-73bc-4dc0-be5f-28d77b615beb"/>
+    <ds:schemaRef ds:uri="13c93bba-48ce-428c-bfe5-88b42c19b028"/>
+  </ds:schemaRefs>
+</ds:datastoreItem>
+</file>
+
+<file path=customXml/itemProps2.xml><?xml version="1.0" encoding="utf-8"?>
 <ds:datastoreItem xmlns:ds="http://schemas.openxmlformats.org/officeDocument/2006/customXml" ds:itemID="{59065960-E0CA-4804-83B5-320CBCDCC160}">
   <ds:schemaRefs>
     <ds:schemaRef ds:uri="http://schemas.microsoft.com/office/2006/metadata/contentType"/>
@@ -23805,29 +24479,18 @@
 </ds:datastoreItem>
 </file>
 
-<file path=customXml/itemProps2.xml><?xml version="1.0" encoding="utf-8"?>
-<ds:datastoreItem xmlns:ds="http://schemas.openxmlformats.org/officeDocument/2006/customXml" ds:itemID="{1279454D-02BE-4A9C-A117-DCD1573E2608}">
+<file path=customXml/itemProps3.xml><?xml version="1.0" encoding="utf-8"?>
+<ds:datastoreItem xmlns:ds="http://schemas.openxmlformats.org/officeDocument/2006/customXml" ds:itemID="{10663269-2064-4804-8290-36D4A57F5557}">
   <ds:schemaRefs>
-    <ds:schemaRef ds:uri="http://schemas.microsoft.com/office/2006/metadata/properties"/>
-    <ds:schemaRef ds:uri="http://schemas.microsoft.com/office/infopath/2007/PartnerControls"/>
-    <ds:schemaRef ds:uri="13c90a0b-73bc-4dc0-be5f-28d77b615beb"/>
-    <ds:schemaRef ds:uri="13c93bba-48ce-428c-bfe5-88b42c19b028"/>
+    <ds:schemaRef ds:uri="http://schemas.microsoft.com/sharepoint/v3/contenttype/forms"/>
   </ds:schemaRefs>
 </ds:datastoreItem>
 </file>
 
-<file path=customXml/itemProps3.xml><?xml version="1.0" encoding="utf-8"?>
+<file path=customXml/itemProps4.xml><?xml version="1.0" encoding="utf-8"?>
 <ds:datastoreItem xmlns:ds="http://schemas.openxmlformats.org/officeDocument/2006/customXml" ds:itemID="{2D2B5832-E448-44FA-9BA7-4210E2303E31}">
   <ds:schemaRefs>
     <ds:schemaRef ds:uri="http://schemas.openxmlformats.org/officeDocument/2006/bibliography"/>
   </ds:schemaRefs>
 </ds:datastoreItem>
-</file>
-
-<file path=customXml/itemProps4.xml><?xml version="1.0" encoding="utf-8"?>
-<ds:datastoreItem xmlns:ds="http://schemas.openxmlformats.org/officeDocument/2006/customXml" ds:itemID="{10663269-2064-4804-8290-36D4A57F5557}">
-  <ds:schemaRefs>
-    <ds:schemaRef ds:uri="http://schemas.microsoft.com/sharepoint/v3/contenttype/forms"/>
-  </ds:schemaRefs>
-</ds:datastoreItem>
 </file>
</xml_diff>